<commit_message>
fix: edit BPMN charts
</commit_message>
<xml_diff>
--- a/docs/РПС_КП_Анализ_предметной_области_ПРИ_123_Манайчева_Нямаа.docx
+++ b/docs/РПС_КП_Анализ_предметной_области_ПРИ_123_Манайчева_Нямаа.docx
@@ -204,7 +204,15 @@
         <w:t xml:space="preserve"> планирования </w:t>
       </w:r>
       <w:r>
-        <w:t>(календарь и канбан-доски)</w:t>
+        <w:t xml:space="preserve">(календарь и </w:t>
+      </w:r>
+      <w:proofErr w:type="spellStart"/>
+      <w:r>
+        <w:t>канбан</w:t>
+      </w:r>
+      <w:proofErr w:type="spellEnd"/>
+      <w:r>
+        <w:t>-доски)</w:t>
       </w:r>
       <w:r>
         <w:t>;</w:t>
@@ -419,7 +427,25 @@
           <w:sz w:val="28"/>
           <w:szCs w:val="28"/>
         </w:rPr>
-        <w:t xml:space="preserve">Пользователям, заинтересованным в планировании и трекинге задач, система предлагает соответствующие инструменты – канбан-доски и календарь. </w:t>
+        <w:t xml:space="preserve">Пользователям, заинтересованным в планировании и трекинге задач, система предлагает соответствующие инструменты – </w:t>
+      </w:r>
+      <w:proofErr w:type="spellStart"/>
+      <w:r>
+        <w:rPr>
+          <w:rFonts w:ascii="Times New Roman" w:hAnsi="Times New Roman" w:cs="Times New Roman"/>
+          <w:sz w:val="28"/>
+          <w:szCs w:val="28"/>
+        </w:rPr>
+        <w:t>канбан</w:t>
+      </w:r>
+      <w:proofErr w:type="spellEnd"/>
+      <w:r>
+        <w:rPr>
+          <w:rFonts w:ascii="Times New Roman" w:hAnsi="Times New Roman" w:cs="Times New Roman"/>
+          <w:sz w:val="28"/>
+          <w:szCs w:val="28"/>
+        </w:rPr>
+        <w:t xml:space="preserve">-доски и календарь. </w:t>
       </w:r>
       <w:r>
         <w:rPr>
@@ -771,7 +797,15 @@
         <w:t>аметка,</w:t>
       </w:r>
       <w:r>
-        <w:t xml:space="preserve"> календарь, канбан-доска,</w:t>
+        <w:t xml:space="preserve"> календарь, </w:t>
+      </w:r>
+      <w:proofErr w:type="spellStart"/>
+      <w:r>
+        <w:t>канбан</w:t>
+      </w:r>
+      <w:proofErr w:type="spellEnd"/>
+      <w:r>
+        <w:t>-доска,</w:t>
       </w:r>
       <w:r>
         <w:t xml:space="preserve"> директория, редактор заметок, файловая система, шаблон заметки, права доступа, пользовательский профиль настроек, модуль интерфейса</w:t>
@@ -1223,6 +1257,7 @@
                 <w:lang w:eastAsia="en-US"/>
               </w:rPr>
             </w:pPr>
+            <w:proofErr w:type="spellStart"/>
             <w:r>
               <w:rPr>
                 <w:rFonts w:eastAsiaTheme="minorHAnsi" w:cstheme="minorBidi"/>
@@ -1231,7 +1266,18 @@
                 <w:szCs w:val="20"/>
                 <w:lang w:eastAsia="en-US"/>
               </w:rPr>
-              <w:t>Канбан-доска</w:t>
+              <w:t>Канбан</w:t>
+            </w:r>
+            <w:proofErr w:type="spellEnd"/>
+            <w:r>
+              <w:rPr>
+                <w:rFonts w:eastAsiaTheme="minorHAnsi" w:cstheme="minorBidi"/>
+                <w:color w:val="auto"/>
+                <w:sz w:val="24"/>
+                <w:szCs w:val="20"/>
+                <w:lang w:eastAsia="en-US"/>
+              </w:rPr>
+              <w:t>-доска</w:t>
             </w:r>
           </w:p>
         </w:tc>
@@ -3090,11 +3136,16 @@
         <w:t>целевой аудитории</w:t>
       </w:r>
       <w:r>
-        <w:t xml:space="preserve"> было выделено несколько ролей польва</w:t>
+        <w:t xml:space="preserve"> было выделено несколько ролей </w:t>
+      </w:r>
+      <w:proofErr w:type="spellStart"/>
+      <w:r>
+        <w:t>польва</w:t>
       </w:r>
       <w:r>
         <w:t>телей</w:t>
       </w:r>
+      <w:proofErr w:type="spellEnd"/>
       <w:r>
         <w:t xml:space="preserve"> </w:t>
       </w:r>
@@ -3142,7 +3193,15 @@
         <w:t xml:space="preserve"> </w:t>
       </w:r>
       <w:r>
-        <w:t xml:space="preserve">авторизации открывается полный клиентский доступ к функционалу сервиса: управление заметками, управление директориями заметок, управление инструментами для планирования задач (канбан-доски и календари), </w:t>
+        <w:t>авторизации открывается полный клиентский доступ к функционалу сервиса: управление заметками, управление директориями заметок, управление инструментами для планирования задач (</w:t>
+      </w:r>
+      <w:proofErr w:type="spellStart"/>
+      <w:r>
+        <w:t>канбан</w:t>
+      </w:r>
+      <w:proofErr w:type="spellEnd"/>
+      <w:r>
+        <w:t xml:space="preserve">-доски и календари), </w:t>
       </w:r>
       <w:r>
         <w:t xml:space="preserve">управление правами доступа заметок для совместной работы, </w:t>
@@ -3233,9 +3292,19 @@
       <w:r>
         <w:t>– «</w:t>
       </w:r>
-      <w:r>
-        <w:t>Use Case Diagram</w:t>
-      </w:r>
+      <w:proofErr w:type="spellStart"/>
+      <w:r>
+        <w:t>Use</w:t>
+      </w:r>
+      <w:proofErr w:type="spellEnd"/>
+      <w:r>
+        <w:t xml:space="preserve"> Case </w:t>
+      </w:r>
+      <w:proofErr w:type="spellStart"/>
+      <w:r>
+        <w:t>Diagram</w:t>
+      </w:r>
+      <w:proofErr w:type="spellEnd"/>
       <w:r>
         <w:t>» (см. рис. 1)</w:t>
       </w:r>
@@ -3420,8 +3489,13 @@
         <w:t>– «</w:t>
       </w:r>
       <w:r>
-        <w:t>Class Diagram</w:t>
-      </w:r>
+        <w:t xml:space="preserve">Class </w:t>
+      </w:r>
+      <w:proofErr w:type="spellStart"/>
+      <w:r>
+        <w:t>Diagram</w:t>
+      </w:r>
+      <w:proofErr w:type="spellEnd"/>
       <w:r>
         <w:t>» (см. рис. 2)</w:t>
       </w:r>
@@ -3429,7 +3503,23 @@
         <w:t>. Данный тип диаграмм в рамках языка UML позволяет описать логическую архитектуру системы, представляя ее в виде классов, их атрибутов, методов и взаимосвязей. На основе анализа предметной области были выделены ключевые сущности и их атрибуты</w:t>
       </w:r>
       <w:r>
-        <w:t>: «Заметка», «Канбан-доска», «Календарь», «Директория», «Файловая система», «Права доступа», «Пользователь», «Администратор», «Клиент», «Неавторизированный пользователь», «Пользовательский профиль настроеек», «Модуль интерфейса».</w:t>
+        <w:t>: «Заметка», «</w:t>
+      </w:r>
+      <w:proofErr w:type="spellStart"/>
+      <w:r>
+        <w:t>Канбан</w:t>
+      </w:r>
+      <w:proofErr w:type="spellEnd"/>
+      <w:r>
+        <w:t xml:space="preserve">-доска», «Календарь», «Директория», «Файловая система», «Права доступа», «Пользователь», «Администратор», «Клиент», «Неавторизированный пользователь», «Пользовательский профиль </w:t>
+      </w:r>
+      <w:proofErr w:type="spellStart"/>
+      <w:r>
+        <w:t>настроеек</w:t>
+      </w:r>
+      <w:proofErr w:type="spellEnd"/>
+      <w:r>
+        <w:t>», «Модуль интерфейса».</w:t>
       </w:r>
     </w:p>
     <w:p>
@@ -3543,11 +3633,21 @@
       <w:r>
         <w:t xml:space="preserve"> разрабатываемой системы являются взаимосвязанные объекты «Заметка» и «Права доступа». Их жизненные циклы были представлены в виде диаграмм состояний – «</w:t>
       </w:r>
-      <w:r>
-        <w:t xml:space="preserve">Statechart </w:t>
-      </w:r>
-      <w:r>
-        <w:t>Diagram»</w:t>
+      <w:proofErr w:type="spellStart"/>
+      <w:r>
+        <w:t>Statechart</w:t>
+      </w:r>
+      <w:proofErr w:type="spellEnd"/>
+      <w:r>
+        <w:t xml:space="preserve"> </w:t>
+      </w:r>
+      <w:proofErr w:type="spellStart"/>
+      <w:r>
+        <w:t>Diagram</w:t>
+      </w:r>
+      <w:proofErr w:type="spellEnd"/>
+      <w:r>
+        <w:t>»</w:t>
       </w:r>
       <w:r>
         <w:t xml:space="preserve"> (</w:t>
@@ -3830,7 +3930,7 @@
           <w:sz w:val="26"/>
           <w:szCs w:val="26"/>
         </w:rPr>
-        <w:t xml:space="preserve">, 4 – </w:t>
+        <w:t xml:space="preserve"> – </w:t>
       </w:r>
       <w:r>
         <w:rPr>
@@ -3879,31 +3979,166 @@
       </w:pPr>
       <w:r>
         <w:lastRenderedPageBreak/>
-        <w:t>Для визуализации работы автоматизированного бизнес-процесса «Создание заметки и выдача прав доступа на нее» была сделана диаграмма в нотации BPMN</w:t>
-      </w:r>
-      <w:r>
-        <w:t xml:space="preserve"> (см. рис. 5)</w:t>
-      </w:r>
-      <w:r>
-        <w:t xml:space="preserve">, которая </w:t>
-      </w:r>
-      <w:r>
-        <w:t>показывает в какой последовательности совершаются рабочие действия и перемещаются потоки информации.</w:t>
+        <w:t>Для визуализации работы системы были разработаны диаграммы в нотации BPMN, отображающие последовательность выполнения операций, распределение ролей участников и движение информационных потоков</w:t>
+      </w:r>
+      <w:r>
+        <w:t>.</w:t>
+      </w:r>
+    </w:p>
+    <w:p>
+      <w:pPr>
+        <w:pStyle w:val="a6"/>
+        <w:ind w:firstLine="697"/>
+      </w:pPr>
+      <w:r>
+        <w:t xml:space="preserve">Первый </w:t>
+      </w:r>
+      <w:r>
+        <w:t xml:space="preserve">информационный </w:t>
+      </w:r>
+      <w:r>
+        <w:t xml:space="preserve">процесс «Создание заметки и назначение прав доступа» </w:t>
+      </w:r>
+      <w:r>
+        <w:t xml:space="preserve">(см. рис. 4) </w:t>
+      </w:r>
+      <w:r>
+        <w:t>описывает создани</w:t>
+      </w:r>
+      <w:r>
+        <w:t>е</w:t>
+      </w:r>
+      <w:r>
+        <w:t xml:space="preserve"> заметки пользователем. После инициализации система сохраняет экземпляр заметки в базу данных, присваивает ей статус «Новая» и устанавливает права доступа по умолчанию (приватный </w:t>
+      </w:r>
+      <w:r>
+        <w:t>доступ</w:t>
+      </w:r>
+      <w:r>
+        <w:t>). Владелец обладает возможностью предоставить доступ другим пользователям</w:t>
+      </w:r>
+      <w:r>
+        <w:t>, в</w:t>
+      </w:r>
+      <w:r>
+        <w:t xml:space="preserve"> этом случае процесс включает рассылку приглашений соавторам, обработку их </w:t>
+      </w:r>
+      <w:r>
+        <w:t>ответов</w:t>
+      </w:r>
+      <w:r>
+        <w:t>, настройку прав доступа и отправку соответствующих уведомлений.</w:t>
+      </w:r>
+    </w:p>
+    <w:p>
+      <w:pPr>
+        <w:pStyle w:val="a6"/>
+        <w:ind w:firstLine="697"/>
+      </w:pPr>
+      <w:r>
+        <w:t>Второй и</w:t>
+      </w:r>
+      <w:r>
+        <w:t xml:space="preserve">нформационный процесс «Создание задачи в </w:t>
+      </w:r>
+      <w:proofErr w:type="spellStart"/>
+      <w:r>
+        <w:t>канбан</w:t>
+      </w:r>
+      <w:proofErr w:type="spellEnd"/>
+      <w:r>
+        <w:t xml:space="preserve">-доске» </w:t>
+      </w:r>
+      <w:r>
+        <w:t xml:space="preserve">(см. рис. 5) </w:t>
+      </w:r>
+      <w:r>
+        <w:t>отображает</w:t>
+      </w:r>
+      <w:r>
+        <w:t xml:space="preserve"> </w:t>
+      </w:r>
+      <w:r>
+        <w:t>работу пользователя с задачей</w:t>
+      </w:r>
+      <w:r>
+        <w:t>.</w:t>
+      </w:r>
+      <w:r>
+        <w:t xml:space="preserve"> </w:t>
+      </w:r>
+      <w:r>
+        <w:t>П</w:t>
+      </w:r>
+      <w:r>
+        <w:t xml:space="preserve">осле создания </w:t>
+      </w:r>
+      <w:r>
+        <w:t xml:space="preserve">задачи </w:t>
+      </w:r>
+      <w:r>
+        <w:t xml:space="preserve">система фиксирует </w:t>
+      </w:r>
+      <w:r>
+        <w:t>ее</w:t>
+      </w:r>
+      <w:r>
+        <w:t xml:space="preserve"> в базе данных и </w:t>
+      </w:r>
+      <w:r>
+        <w:t>формирует</w:t>
+      </w:r>
+      <w:r>
+        <w:t xml:space="preserve"> уведомление. Далее автор назначает исполнителя (через отдельный подпроцесс), после чего задача </w:t>
+      </w:r>
+      <w:r>
+        <w:t>отдается на</w:t>
+      </w:r>
+      <w:r>
+        <w:t xml:space="preserve"> выполнени</w:t>
+      </w:r>
+      <w:r>
+        <w:t xml:space="preserve">е и </w:t>
+      </w:r>
+      <w:r>
+        <w:t>фикс</w:t>
+      </w:r>
+      <w:r>
+        <w:t>ируется</w:t>
+      </w:r>
+      <w:r>
+        <w:t xml:space="preserve"> результат. Подпроцесс «Назначить исполнителя» </w:t>
+      </w:r>
+      <w:r>
+        <w:t xml:space="preserve">(см. рис. 6) </w:t>
+      </w:r>
+      <w:r>
+        <w:t>включает</w:t>
+      </w:r>
+      <w:r>
+        <w:t xml:space="preserve"> в себя</w:t>
+      </w:r>
+      <w:r>
+        <w:t xml:space="preserve"> выбор исполнителя, ожидание подтверждения и окончательное закрепление ответственного</w:t>
+      </w:r>
+      <w:r>
+        <w:t xml:space="preserve"> лица</w:t>
+      </w:r>
+      <w:r>
+        <w:t>.</w:t>
       </w:r>
     </w:p>
     <w:p>
       <w:pPr>
         <w:pStyle w:val="ab"/>
-      </w:pPr>
-      <w:r>
-        <w:rPr>
-          <w:noProof/>
-        </w:rPr>
+        <w:jc w:val="both"/>
+      </w:pPr>
+      <w:r>
         <w:drawing>
-          <wp:inline distT="0" distB="0" distL="0" distR="0" wp14:anchorId="6DD3D273" wp14:editId="0B940077">
-            <wp:extent cx="5940425" cy="4807585"/>
-            <wp:effectExtent l="19050" t="19050" r="22225" b="12065"/>
-            <wp:docPr id="3" name="Рисунок 3"/>
+          <wp:inline distT="0" distB="0" distL="0" distR="0" wp14:anchorId="004310F8" wp14:editId="7E23260C">
+            <wp:extent cx="5940425" cy="2980055"/>
+            <wp:effectExtent l="0" t="0" r="3175" b="0"/>
+            <wp:docPr id="4" name="Рисунок 4"/>
             <wp:cNvGraphicFramePr>
               <a:graphicFrameLocks xmlns:a="http://schemas.openxmlformats.org/drawingml/2006/main" noChangeAspect="1"/>
             </wp:cNvGraphicFramePr>
@@ -3911,14 +4146,17 @@
               <a:graphicData uri="http://schemas.openxmlformats.org/drawingml/2006/picture">
                 <pic:pic xmlns:pic="http://schemas.openxmlformats.org/drawingml/2006/picture">
                   <pic:nvPicPr>
-                    <pic:cNvPr id="3" name="Рисунок 3"/>
+                    <pic:cNvPr id="1" name="Рисунок 1"/>
                     <pic:cNvPicPr/>
                   </pic:nvPicPr>
                   <pic:blipFill>
-                    <a:blip r:embed="rId10">
+                    <a:blip r:embed="rId10" cstate="print">
                       <a:extLst>
                         <a:ext uri="{28A0092B-C50C-407E-A947-70E740481C1C}">
                           <a14:useLocalDpi xmlns:a14="http://schemas.microsoft.com/office/drawing/2010/main" val="0"/>
+                        </a:ext>
+                        <a:ext uri="{96DAC541-7B7A-43D3-8B79-37D633B846F1}">
+                          <asvg:svgBlip xmlns:asvg="http://schemas.microsoft.com/office/drawing/2016/SVG/main" r:embed="rId11"/>
                         </a:ext>
                       </a:extLst>
                     </a:blip>
@@ -3929,18 +4167,11 @@
                   <pic:spPr>
                     <a:xfrm>
                       <a:off x="0" y="0"/>
-                      <a:ext cx="5940425" cy="4807585"/>
+                      <a:ext cx="5940425" cy="2980055"/>
                     </a:xfrm>
                     <a:prstGeom prst="rect">
                       <a:avLst/>
                     </a:prstGeom>
-                    <a:ln>
-                      <a:solidFill>
-                        <a:schemeClr val="bg2">
-                          <a:lumMod val="75000"/>
-                        </a:schemeClr>
-                      </a:solidFill>
-                    </a:ln>
                   </pic:spPr>
                 </pic:pic>
               </a:graphicData>
@@ -3954,7 +4185,169 @@
         <w:pStyle w:val="ab"/>
       </w:pPr>
       <w:r>
-        <w:t>Рисунок 5 – Диаграмма автоматизированного бизнес-процесса «Создание заметки и выдача прав доступа на нее».</w:t>
+        <w:t xml:space="preserve">Рисунок </w:t>
+      </w:r>
+      <w:r>
+        <w:t>4</w:t>
+      </w:r>
+      <w:r>
+        <w:t xml:space="preserve"> – Диаграмма автоматизированного бизнес-процесса «Создание </w:t>
+      </w:r>
+      <w:r>
+        <w:t xml:space="preserve">  </w:t>
+      </w:r>
+      <w:r>
+        <w:t>заметки и выдача прав доступа на нее».</w:t>
+      </w:r>
+    </w:p>
+    <w:p>
+      <w:pPr>
+        <w:pStyle w:val="ab"/>
+      </w:pPr>
+      <w:r>
+        <w:lastRenderedPageBreak/>
+        <w:drawing>
+          <wp:inline distT="0" distB="0" distL="0" distR="0" wp14:anchorId="0D288AEE" wp14:editId="67667A51">
+            <wp:extent cx="5176546" cy="2543175"/>
+            <wp:effectExtent l="0" t="0" r="5080" b="0"/>
+            <wp:docPr id="5" name="Рисунок 5"/>
+            <wp:cNvGraphicFramePr>
+              <a:graphicFrameLocks xmlns:a="http://schemas.openxmlformats.org/drawingml/2006/main" noChangeAspect="1"/>
+            </wp:cNvGraphicFramePr>
+            <a:graphic xmlns:a="http://schemas.openxmlformats.org/drawingml/2006/main">
+              <a:graphicData uri="http://schemas.openxmlformats.org/drawingml/2006/picture">
+                <pic:pic xmlns:pic="http://schemas.openxmlformats.org/drawingml/2006/picture">
+                  <pic:nvPicPr>
+                    <pic:cNvPr id="5" name="Рисунок 5"/>
+                    <pic:cNvPicPr/>
+                  </pic:nvPicPr>
+                  <pic:blipFill>
+                    <a:blip r:embed="rId12" cstate="print">
+                      <a:extLst>
+                        <a:ext uri="{28A0092B-C50C-407E-A947-70E740481C1C}">
+                          <a14:useLocalDpi xmlns:a14="http://schemas.microsoft.com/office/drawing/2010/main" val="0"/>
+                        </a:ext>
+                        <a:ext uri="{96DAC541-7B7A-43D3-8B79-37D633B846F1}">
+                          <asvg:svgBlip xmlns:asvg="http://schemas.microsoft.com/office/drawing/2016/SVG/main" r:embed="rId13"/>
+                        </a:ext>
+                      </a:extLst>
+                    </a:blip>
+                    <a:stretch>
+                      <a:fillRect/>
+                    </a:stretch>
+                  </pic:blipFill>
+                  <pic:spPr>
+                    <a:xfrm>
+                      <a:off x="0" y="0"/>
+                      <a:ext cx="5213015" cy="2561092"/>
+                    </a:xfrm>
+                    <a:prstGeom prst="rect">
+                      <a:avLst/>
+                    </a:prstGeom>
+                  </pic:spPr>
+                </pic:pic>
+              </a:graphicData>
+            </a:graphic>
+          </wp:inline>
+        </w:drawing>
+      </w:r>
+    </w:p>
+    <w:p>
+      <w:pPr>
+        <w:pStyle w:val="ab"/>
+      </w:pPr>
+      <w:r>
+        <w:t xml:space="preserve">Рисунок </w:t>
+      </w:r>
+      <w:r>
+        <w:t>5</w:t>
+      </w:r>
+      <w:r>
+        <w:t xml:space="preserve"> – Диаграмма для процесса «</w:t>
+      </w:r>
+      <w:r>
+        <w:t xml:space="preserve">Создание </w:t>
+      </w:r>
+      <w:r>
+        <w:t xml:space="preserve">задачи в </w:t>
+      </w:r>
+      <w:proofErr w:type="spellStart"/>
+      <w:r>
+        <w:t>канбан</w:t>
+      </w:r>
+      <w:proofErr w:type="spellEnd"/>
+      <w:r>
+        <w:t>-доске».</w:t>
+      </w:r>
+    </w:p>
+    <w:p>
+      <w:pPr>
+        <w:pStyle w:val="ab"/>
+      </w:pPr>
+    </w:p>
+    <w:p>
+      <w:pPr>
+        <w:pStyle w:val="ab"/>
+      </w:pPr>
+      <w:r>
+        <w:drawing>
+          <wp:inline distT="0" distB="0" distL="0" distR="0" wp14:anchorId="616F558F" wp14:editId="07322A84">
+            <wp:extent cx="5940425" cy="2004695"/>
+            <wp:effectExtent l="0" t="0" r="3175" b="0"/>
+            <wp:docPr id="6" name="Рисунок 6"/>
+            <wp:cNvGraphicFramePr>
+              <a:graphicFrameLocks xmlns:a="http://schemas.openxmlformats.org/drawingml/2006/main" noChangeAspect="1"/>
+            </wp:cNvGraphicFramePr>
+            <a:graphic xmlns:a="http://schemas.openxmlformats.org/drawingml/2006/main">
+              <a:graphicData uri="http://schemas.openxmlformats.org/drawingml/2006/picture">
+                <pic:pic xmlns:pic="http://schemas.openxmlformats.org/drawingml/2006/picture">
+                  <pic:nvPicPr>
+                    <pic:cNvPr id="4" name="Рисунок 4"/>
+                    <pic:cNvPicPr/>
+                  </pic:nvPicPr>
+                  <pic:blipFill>
+                    <a:blip r:embed="rId14">
+                      <a:extLst>
+                        <a:ext uri="{28A0092B-C50C-407E-A947-70E740481C1C}">
+                          <a14:useLocalDpi xmlns:a14="http://schemas.microsoft.com/office/drawing/2010/main" val="0"/>
+                        </a:ext>
+                        <a:ext uri="{96DAC541-7B7A-43D3-8B79-37D633B846F1}">
+                          <asvg:svgBlip xmlns:asvg="http://schemas.microsoft.com/office/drawing/2016/SVG/main" r:embed="rId15"/>
+                        </a:ext>
+                      </a:extLst>
+                    </a:blip>
+                    <a:stretch>
+                      <a:fillRect/>
+                    </a:stretch>
+                  </pic:blipFill>
+                  <pic:spPr>
+                    <a:xfrm>
+                      <a:off x="0" y="0"/>
+                      <a:ext cx="5940425" cy="2004695"/>
+                    </a:xfrm>
+                    <a:prstGeom prst="rect">
+                      <a:avLst/>
+                    </a:prstGeom>
+                  </pic:spPr>
+                </pic:pic>
+              </a:graphicData>
+            </a:graphic>
+          </wp:inline>
+        </w:drawing>
+      </w:r>
+    </w:p>
+    <w:p>
+      <w:pPr>
+        <w:pStyle w:val="ab"/>
+      </w:pPr>
+      <w:r>
+        <w:t xml:space="preserve">Рисунок </w:t>
+      </w:r>
+      <w:r>
+        <w:t>6</w:t>
+      </w:r>
+      <w:r>
+        <w:t xml:space="preserve"> – Диаграмма для подпроцесса «Назначить исполнителя».</w:t>
       </w:r>
     </w:p>
     <w:p>
@@ -4038,7 +4431,6 @@
         <w:ind w:left="0" w:firstLine="709"/>
       </w:pPr>
       <w:r>
-        <w:lastRenderedPageBreak/>
         <w:t xml:space="preserve">Система должна </w:t>
       </w:r>
       <w:r>
@@ -4070,6 +4462,7 @@
         <w:ind w:left="0" w:firstLine="709"/>
       </w:pPr>
       <w:r>
+        <w:lastRenderedPageBreak/>
         <w:t>Система долж</w:t>
       </w:r>
       <w:r>
@@ -4085,7 +4478,15 @@
         <w:t xml:space="preserve"> нескольким готовым шаблонам: </w:t>
       </w:r>
       <w:r>
-        <w:t>пустой, список задач, таблица, канбан-доска, календарь;</w:t>
+        <w:t xml:space="preserve">пустой, список задач, таблица, </w:t>
+      </w:r>
+      <w:proofErr w:type="spellStart"/>
+      <w:r>
+        <w:t>канбан</w:t>
+      </w:r>
+      <w:proofErr w:type="spellEnd"/>
+      <w:r>
+        <w:t>-доска, календарь;</w:t>
       </w:r>
     </w:p>
     <w:p>
@@ -4160,7 +4561,15 @@
         <w:ind w:left="0" w:firstLine="709"/>
       </w:pPr>
       <w:r>
-        <w:t>Система должна обеспечивать работу базового функционала канбан-доски: создать столбец, удалить столбец, редактировать столбец, добавить задачу в столбец, переместить задачу в другой столбец,</w:t>
+        <w:t xml:space="preserve">Система должна обеспечивать работу базового функционала </w:t>
+      </w:r>
+      <w:proofErr w:type="spellStart"/>
+      <w:r>
+        <w:t>канбан</w:t>
+      </w:r>
+      <w:proofErr w:type="spellEnd"/>
+      <w:r>
+        <w:t>-доски: создать столбец, удалить столбец, редактировать столбец, добавить задачу в столбец, переместить задачу в другой столбец,</w:t>
       </w:r>
       <w:r>
         <w:t xml:space="preserve"> изменить статус задачи, архивировать задачу;</w:t>
@@ -4268,7 +4677,6 @@
         </w:numPr>
       </w:pPr>
       <w:r>
-        <w:lastRenderedPageBreak/>
         <w:t>Нефункциональные требования к системе</w:t>
       </w:r>
     </w:p>
@@ -4286,6 +4694,7 @@
         <w:pStyle w:val="a6"/>
       </w:pPr>
       <w:r>
+        <w:lastRenderedPageBreak/>
         <w:t>Для</w:t>
       </w:r>
       <w:r>
@@ -4410,7 +4819,15 @@
         <w:t>Система должна корректно функционировать при одновременной работе до 15000 пользователей</w:t>
       </w:r>
       <w:r>
-        <w:t xml:space="preserve"> (за основу взята численность студентов ВлГУ)</w:t>
+        <w:t xml:space="preserve"> (за основу взята численность студентов </w:t>
+      </w:r>
+      <w:proofErr w:type="spellStart"/>
+      <w:r>
+        <w:t>ВлГУ</w:t>
+      </w:r>
+      <w:proofErr w:type="spellEnd"/>
+      <w:r>
+        <w:t>)</w:t>
       </w:r>
       <w:r>
         <w:t>.</w:t>
@@ -4543,7 +4960,6 @@
         <w:ind w:left="0" w:firstLine="709"/>
       </w:pPr>
       <w:r>
-        <w:lastRenderedPageBreak/>
         <w:t>Все интерактивные элементы (кнопки, поля ввода) должны иметь визуальный отклик при наведении курсора</w:t>
       </w:r>
       <w:r>
@@ -4579,6 +4995,7 @@
         <w:ind w:left="0" w:firstLine="709"/>
       </w:pPr>
       <w:r>
+        <w:lastRenderedPageBreak/>
         <w:t>Доступ к функционалу системы должен быть разрешен только после прохождения аутентификации;</w:t>
       </w:r>
     </w:p>
@@ -5977,6 +6394,95 @@
     </w:lvl>
   </w:abstractNum>
   <w:abstractNum w:abstractNumId="12" w15:restartNumberingAfterBreak="0">
+    <w:nsid w:val="584F123D"/>
+    <w:multiLevelType w:val="hybridMultilevel"/>
+    <w:tmpl w:val="3836E112"/>
+    <w:lvl w:ilvl="0" w:tplc="919699DC">
+      <w:start w:val="1"/>
+      <w:numFmt w:val="decimal"/>
+      <w:lvlText w:val="%1."/>
+      <w:lvlJc w:val="left"/>
+      <w:pPr>
+        <w:ind w:left="1057" w:hanging="360"/>
+      </w:pPr>
+      <w:rPr>
+        <w:rFonts w:hint="default"/>
+      </w:rPr>
+    </w:lvl>
+    <w:lvl w:ilvl="1" w:tplc="04190019" w:tentative="1">
+      <w:start w:val="1"/>
+      <w:numFmt w:val="lowerLetter"/>
+      <w:lvlText w:val="%2."/>
+      <w:lvlJc w:val="left"/>
+      <w:pPr>
+        <w:ind w:left="1777" w:hanging="360"/>
+      </w:pPr>
+    </w:lvl>
+    <w:lvl w:ilvl="2" w:tplc="0419001B" w:tentative="1">
+      <w:start w:val="1"/>
+      <w:numFmt w:val="lowerRoman"/>
+      <w:lvlText w:val="%3."/>
+      <w:lvlJc w:val="right"/>
+      <w:pPr>
+        <w:ind w:left="2497" w:hanging="180"/>
+      </w:pPr>
+    </w:lvl>
+    <w:lvl w:ilvl="3" w:tplc="0419000F" w:tentative="1">
+      <w:start w:val="1"/>
+      <w:numFmt w:val="decimal"/>
+      <w:lvlText w:val="%4."/>
+      <w:lvlJc w:val="left"/>
+      <w:pPr>
+        <w:ind w:left="3217" w:hanging="360"/>
+      </w:pPr>
+    </w:lvl>
+    <w:lvl w:ilvl="4" w:tplc="04190019" w:tentative="1">
+      <w:start w:val="1"/>
+      <w:numFmt w:val="lowerLetter"/>
+      <w:lvlText w:val="%5."/>
+      <w:lvlJc w:val="left"/>
+      <w:pPr>
+        <w:ind w:left="3937" w:hanging="360"/>
+      </w:pPr>
+    </w:lvl>
+    <w:lvl w:ilvl="5" w:tplc="0419001B" w:tentative="1">
+      <w:start w:val="1"/>
+      <w:numFmt w:val="lowerRoman"/>
+      <w:lvlText w:val="%6."/>
+      <w:lvlJc w:val="right"/>
+      <w:pPr>
+        <w:ind w:left="4657" w:hanging="180"/>
+      </w:pPr>
+    </w:lvl>
+    <w:lvl w:ilvl="6" w:tplc="0419000F" w:tentative="1">
+      <w:start w:val="1"/>
+      <w:numFmt w:val="decimal"/>
+      <w:lvlText w:val="%7."/>
+      <w:lvlJc w:val="left"/>
+      <w:pPr>
+        <w:ind w:left="5377" w:hanging="360"/>
+      </w:pPr>
+    </w:lvl>
+    <w:lvl w:ilvl="7" w:tplc="04190019" w:tentative="1">
+      <w:start w:val="1"/>
+      <w:numFmt w:val="lowerLetter"/>
+      <w:lvlText w:val="%8."/>
+      <w:lvlJc w:val="left"/>
+      <w:pPr>
+        <w:ind w:left="6097" w:hanging="360"/>
+      </w:pPr>
+    </w:lvl>
+    <w:lvl w:ilvl="8" w:tplc="0419001B" w:tentative="1">
+      <w:start w:val="1"/>
+      <w:numFmt w:val="lowerRoman"/>
+      <w:lvlText w:val="%9."/>
+      <w:lvlJc w:val="right"/>
+      <w:pPr>
+        <w:ind w:left="6817" w:hanging="180"/>
+      </w:pPr>
+    </w:lvl>
+  </w:abstractNum>
+  <w:abstractNum w:abstractNumId="13" w15:restartNumberingAfterBreak="0">
     <w:nsid w:val="61FC5C02"/>
     <w:multiLevelType w:val="hybridMultilevel"/>
     <w:tmpl w:val="187A4B5E"/>
@@ -6065,7 +6571,7 @@
       </w:pPr>
     </w:lvl>
   </w:abstractNum>
-  <w:abstractNum w:abstractNumId="13" w15:restartNumberingAfterBreak="0">
+  <w:abstractNum w:abstractNumId="14" w15:restartNumberingAfterBreak="0">
     <w:nsid w:val="6508418F"/>
     <w:multiLevelType w:val="multilevel"/>
     <w:tmpl w:val="B61E29BA"/>
@@ -6178,7 +6684,7 @@
       </w:rPr>
     </w:lvl>
   </w:abstractNum>
-  <w:abstractNum w:abstractNumId="14" w15:restartNumberingAfterBreak="0">
+  <w:abstractNum w:abstractNumId="15" w15:restartNumberingAfterBreak="0">
     <w:nsid w:val="6D397F55"/>
     <w:multiLevelType w:val="hybridMultilevel"/>
     <w:tmpl w:val="8DA680DC"/>
@@ -6291,7 +6797,7 @@
       </w:rPr>
     </w:lvl>
   </w:abstractNum>
-  <w:abstractNum w:abstractNumId="15" w15:restartNumberingAfterBreak="0">
+  <w:abstractNum w:abstractNumId="16" w15:restartNumberingAfterBreak="0">
     <w:nsid w:val="7FCF09EE"/>
     <w:multiLevelType w:val="hybridMultilevel"/>
     <w:tmpl w:val="51E07488"/>
@@ -6393,16 +6899,16 @@
     <w:abstractNumId w:val="9"/>
   </w:num>
   <w:num w:numId="5">
-    <w:abstractNumId w:val="15"/>
+    <w:abstractNumId w:val="16"/>
   </w:num>
   <w:num w:numId="6">
-    <w:abstractNumId w:val="12"/>
+    <w:abstractNumId w:val="13"/>
   </w:num>
   <w:num w:numId="7">
     <w:abstractNumId w:val="2"/>
   </w:num>
   <w:num w:numId="8">
-    <w:abstractNumId w:val="13"/>
+    <w:abstractNumId w:val="14"/>
   </w:num>
   <w:num w:numId="9">
     <w:abstractNumId w:val="11"/>
@@ -6414,7 +6920,7 @@
     <w:abstractNumId w:val="6"/>
   </w:num>
   <w:num w:numId="12">
-    <w:abstractNumId w:val="14"/>
+    <w:abstractNumId w:val="15"/>
   </w:num>
   <w:num w:numId="13">
     <w:abstractNumId w:val="3"/>
@@ -6427,6 +6933,9 @@
   </w:num>
   <w:num w:numId="16">
     <w:abstractNumId w:val="1"/>
+  </w:num>
+  <w:num w:numId="17">
+    <w:abstractNumId w:val="12"/>
   </w:num>
 </w:numbering>
 </file>

</xml_diff>

<commit_message>
fix: correct domain description + domain vocabulary + roles description
</commit_message>
<xml_diff>
--- a/docs/РПС_КП_Анализ_предметной_области_ПРИ_123_Манайчева_Нямаа.docx
+++ b/docs/РПС_КП_Анализ_предметной_области_ПРИ_123_Манайчева_Нямаа.docx
@@ -406,7 +406,135 @@
           <w:sz w:val="28"/>
           <w:szCs w:val="28"/>
         </w:rPr>
-        <w:t>После регистрации в веб-приложении пользователь получает доступ к редактору заметок: у него появляется возможность создавать заметки с использованием заранее подготовленных шаблонов и управлять ими. При необходимости можно сделать локальную копию своих записей и позже загрузить обновленные документы. Для эффективного ведения большого количества документов пользователь может использовать такие функции, как: объединение в директории, поиск и фильтрация, а также выделение наиболее важных файлов отметкой «Избранное».</w:t>
+        <w:t xml:space="preserve">После регистрации в веб-приложении пользователь получает доступ к редактору заметок: у него появляется возможность создавать заметки с использованием заранее подготовленных шаблонов </w:t>
+      </w:r>
+      <w:r>
+        <w:rPr>
+          <w:rFonts w:ascii="Times New Roman" w:hAnsi="Times New Roman" w:cs="Times New Roman"/>
+          <w:sz w:val="28"/>
+          <w:szCs w:val="28"/>
+        </w:rPr>
+        <w:t>(</w:t>
+      </w:r>
+      <w:r>
+        <w:rPr>
+          <w:rFonts w:ascii="Times New Roman" w:hAnsi="Times New Roman" w:cs="Times New Roman"/>
+          <w:sz w:val="28"/>
+          <w:szCs w:val="28"/>
+        </w:rPr>
+        <w:t>список, таблица</w:t>
+      </w:r>
+      <w:r>
+        <w:rPr>
+          <w:rFonts w:ascii="Times New Roman" w:hAnsi="Times New Roman" w:cs="Times New Roman"/>
+          <w:sz w:val="28"/>
+          <w:szCs w:val="28"/>
+        </w:rPr>
+        <w:t xml:space="preserve">) </w:t>
+      </w:r>
+      <w:r>
+        <w:rPr>
+          <w:rFonts w:ascii="Times New Roman" w:hAnsi="Times New Roman" w:cs="Times New Roman"/>
+          <w:sz w:val="28"/>
+          <w:szCs w:val="28"/>
+        </w:rPr>
+        <w:t xml:space="preserve">и управлять ими. При необходимости можно сделать локальную копию своих записей и позже загрузить обновленные </w:t>
+      </w:r>
+      <w:r>
+        <w:rPr>
+          <w:rFonts w:ascii="Times New Roman" w:hAnsi="Times New Roman" w:cs="Times New Roman"/>
+          <w:sz w:val="28"/>
+          <w:szCs w:val="28"/>
+        </w:rPr>
+        <w:t>файлы</w:t>
+      </w:r>
+      <w:r>
+        <w:rPr>
+          <w:rFonts w:ascii="Times New Roman" w:hAnsi="Times New Roman" w:cs="Times New Roman"/>
+          <w:sz w:val="28"/>
+          <w:szCs w:val="28"/>
+        </w:rPr>
+        <w:t>. Для эффективного ведения большого количества документов пользователь может использовать такие функции</w:t>
+      </w:r>
+      <w:r>
+        <w:rPr>
+          <w:rFonts w:ascii="Times New Roman" w:hAnsi="Times New Roman" w:cs="Times New Roman"/>
+          <w:sz w:val="28"/>
+          <w:szCs w:val="28"/>
+        </w:rPr>
+        <w:t xml:space="preserve"> системы</w:t>
+      </w:r>
+      <w:r>
+        <w:rPr>
+          <w:rFonts w:ascii="Times New Roman" w:hAnsi="Times New Roman" w:cs="Times New Roman"/>
+          <w:sz w:val="28"/>
+          <w:szCs w:val="28"/>
+        </w:rPr>
+        <w:t xml:space="preserve">, как: объединение </w:t>
+      </w:r>
+      <w:r>
+        <w:rPr>
+          <w:rFonts w:ascii="Times New Roman" w:hAnsi="Times New Roman" w:cs="Times New Roman"/>
+          <w:sz w:val="28"/>
+          <w:szCs w:val="28"/>
+        </w:rPr>
+        <w:t xml:space="preserve">нескольких заметок </w:t>
+      </w:r>
+      <w:r>
+        <w:rPr>
+          <w:rFonts w:ascii="Times New Roman" w:hAnsi="Times New Roman" w:cs="Times New Roman"/>
+          <w:sz w:val="28"/>
+          <w:szCs w:val="28"/>
+        </w:rPr>
+        <w:t>в директории, поиск и фильтраци</w:t>
+      </w:r>
+      <w:r>
+        <w:rPr>
+          <w:rFonts w:ascii="Times New Roman" w:hAnsi="Times New Roman" w:cs="Times New Roman"/>
+          <w:sz w:val="28"/>
+          <w:szCs w:val="28"/>
+        </w:rPr>
+        <w:t>ю (</w:t>
+      </w:r>
+      <w:r>
+        <w:rPr>
+          <w:rFonts w:ascii="Times New Roman" w:hAnsi="Times New Roman" w:cs="Times New Roman"/>
+          <w:sz w:val="28"/>
+          <w:szCs w:val="28"/>
+        </w:rPr>
+        <w:t>по возрастанию, по убыванию, по дате создания</w:t>
+      </w:r>
+      <w:r>
+        <w:rPr>
+          <w:rFonts w:ascii="Times New Roman" w:hAnsi="Times New Roman" w:cs="Times New Roman"/>
+          <w:sz w:val="28"/>
+          <w:szCs w:val="28"/>
+        </w:rPr>
+        <w:t>)</w:t>
+      </w:r>
+      <w:r>
+        <w:rPr>
+          <w:rFonts w:ascii="Times New Roman" w:hAnsi="Times New Roman" w:cs="Times New Roman"/>
+          <w:sz w:val="28"/>
+          <w:szCs w:val="28"/>
+        </w:rPr>
+        <w:t>, а также выделение наиболее важных</w:t>
+      </w:r>
+      <w:r>
+        <w:rPr>
+          <w:rFonts w:ascii="Times New Roman" w:hAnsi="Times New Roman" w:cs="Times New Roman"/>
+          <w:sz w:val="28"/>
+          <w:szCs w:val="28"/>
+        </w:rPr>
+        <w:t xml:space="preserve"> записей</w:t>
+      </w:r>
+      <w:r>
+        <w:rPr>
+          <w:rFonts w:ascii="Times New Roman" w:hAnsi="Times New Roman" w:cs="Times New Roman"/>
+          <w:sz w:val="28"/>
+          <w:szCs w:val="28"/>
+        </w:rPr>
+        <w:t xml:space="preserve"> отметкой «Избранное».</w:t>
       </w:r>
     </w:p>
     <w:p>
@@ -427,7 +555,23 @@
           <w:sz w:val="28"/>
           <w:szCs w:val="28"/>
         </w:rPr>
-        <w:t xml:space="preserve">Пользователям, заинтересованным в планировании и трекинге задач, система предлагает соответствующие инструменты – </w:t>
+        <w:t xml:space="preserve">Пользователям, заинтересованным в планировании и трекинге задач, система предлагает соответствующие </w:t>
+      </w:r>
+      <w:r>
+        <w:rPr>
+          <w:rFonts w:ascii="Times New Roman" w:hAnsi="Times New Roman" w:cs="Times New Roman"/>
+          <w:sz w:val="28"/>
+          <w:szCs w:val="28"/>
+        </w:rPr>
+        <w:t>шаблоны</w:t>
+      </w:r>
+      <w:r>
+        <w:rPr>
+          <w:rFonts w:ascii="Times New Roman" w:hAnsi="Times New Roman" w:cs="Times New Roman"/>
+          <w:sz w:val="28"/>
+          <w:szCs w:val="28"/>
+        </w:rPr>
+        <w:t xml:space="preserve"> – </w:t>
       </w:r>
       <w:proofErr w:type="spellStart"/>
       <w:r>
@@ -453,7 +597,15 @@
           <w:sz w:val="28"/>
           <w:szCs w:val="28"/>
         </w:rPr>
-        <w:t>Первые</w:t>
+        <w:t>Первы</w:t>
+      </w:r>
+      <w:r>
+        <w:rPr>
+          <w:rFonts w:ascii="Times New Roman" w:hAnsi="Times New Roman" w:cs="Times New Roman"/>
+          <w:sz w:val="28"/>
+          <w:szCs w:val="28"/>
+        </w:rPr>
+        <w:t>й</w:t>
       </w:r>
       <w:r>
         <w:rPr>
@@ -469,7 +621,7 @@
           <w:sz w:val="28"/>
           <w:szCs w:val="28"/>
         </w:rPr>
-        <w:t>ю</w:t>
+        <w:t>е</w:t>
       </w:r>
       <w:r>
         <w:rPr>
@@ -485,7 +637,7 @@
           <w:sz w:val="28"/>
           <w:szCs w:val="28"/>
         </w:rPr>
-        <w:t>отслеживать свой прогресс, а</w:t>
+        <w:t>а</w:t>
       </w:r>
       <w:r>
         <w:rPr>
@@ -517,7 +669,39 @@
           <w:sz w:val="28"/>
           <w:szCs w:val="28"/>
         </w:rPr>
-        <w:t>соотнести сроки с задачами и заметками, лучше организовывая</w:t>
+        <w:t xml:space="preserve">соотнести </w:t>
+      </w:r>
+      <w:r>
+        <w:rPr>
+          <w:rFonts w:ascii="Times New Roman" w:hAnsi="Times New Roman" w:cs="Times New Roman"/>
+          <w:sz w:val="28"/>
+          <w:szCs w:val="28"/>
+        </w:rPr>
+        <w:t>задачи со сроками и связанным материалом (</w:t>
+      </w:r>
+      <w:r>
+        <w:rPr>
+          <w:rFonts w:ascii="Times New Roman" w:hAnsi="Times New Roman" w:cs="Times New Roman"/>
+          <w:sz w:val="28"/>
+          <w:szCs w:val="28"/>
+        </w:rPr>
+        <w:t>заметками</w:t>
+      </w:r>
+      <w:r>
+        <w:rPr>
+          <w:rFonts w:ascii="Times New Roman" w:hAnsi="Times New Roman" w:cs="Times New Roman"/>
+          <w:sz w:val="28"/>
+          <w:szCs w:val="28"/>
+        </w:rPr>
+        <w:t>)</w:t>
+      </w:r>
+      <w:r>
+        <w:rPr>
+          <w:rFonts w:ascii="Times New Roman" w:hAnsi="Times New Roman" w:cs="Times New Roman"/>
+          <w:sz w:val="28"/>
+          <w:szCs w:val="28"/>
+        </w:rPr>
+        <w:t>, лучше организовывая</w:t>
       </w:r>
       <w:r>
         <w:rPr>
@@ -533,7 +717,47 @@
           <w:sz w:val="28"/>
           <w:szCs w:val="28"/>
         </w:rPr>
-        <w:t xml:space="preserve"> Для оценки эффективности выполнения работ программная система предоставляет функционал просмотра статистических данных в виде различных диаграмм и графиков. </w:t>
+        <w:t xml:space="preserve"> </w:t>
+      </w:r>
+      <w:r>
+        <w:rPr>
+          <w:rFonts w:ascii="Times New Roman" w:hAnsi="Times New Roman" w:cs="Times New Roman"/>
+          <w:sz w:val="28"/>
+          <w:szCs w:val="28"/>
+        </w:rPr>
+        <w:t>Для пользователей, не нуждающихся в данн</w:t>
+      </w:r>
+      <w:r>
+        <w:rPr>
+          <w:rFonts w:ascii="Times New Roman" w:hAnsi="Times New Roman" w:cs="Times New Roman"/>
+          <w:sz w:val="28"/>
+          <w:szCs w:val="28"/>
+        </w:rPr>
+        <w:t>ом</w:t>
+      </w:r>
+      <w:r>
+        <w:rPr>
+          <w:rFonts w:ascii="Times New Roman" w:hAnsi="Times New Roman" w:cs="Times New Roman"/>
+          <w:sz w:val="28"/>
+          <w:szCs w:val="28"/>
+        </w:rPr>
+        <w:t xml:space="preserve"> функци</w:t>
+      </w:r>
+      <w:r>
+        <w:rPr>
+          <w:rFonts w:ascii="Times New Roman" w:hAnsi="Times New Roman" w:cs="Times New Roman"/>
+          <w:sz w:val="28"/>
+          <w:szCs w:val="28"/>
+        </w:rPr>
+        <w:t>онале</w:t>
+      </w:r>
+      <w:r>
+        <w:rPr>
+          <w:rFonts w:ascii="Times New Roman" w:hAnsi="Times New Roman" w:cs="Times New Roman"/>
+          <w:sz w:val="28"/>
+          <w:szCs w:val="28"/>
+        </w:rPr>
+        <w:t>, предусмотрена возможность отключения соответствующих модулей в настройках системы.</w:t>
       </w:r>
     </w:p>
     <w:p>
@@ -554,135 +778,143 @@
           <w:sz w:val="28"/>
           <w:szCs w:val="28"/>
         </w:rPr>
-        <w:t xml:space="preserve">Ключевой особенностью системы является </w:t>
-      </w:r>
-      <w:r>
-        <w:rPr>
-          <w:rFonts w:ascii="Times New Roman" w:hAnsi="Times New Roman" w:cs="Times New Roman"/>
-          <w:sz w:val="28"/>
-          <w:szCs w:val="28"/>
-        </w:rPr>
-        <w:t>возможность организации</w:t>
-      </w:r>
-      <w:r>
-        <w:rPr>
-          <w:rFonts w:ascii="Times New Roman" w:hAnsi="Times New Roman" w:cs="Times New Roman"/>
-          <w:sz w:val="28"/>
-          <w:szCs w:val="28"/>
-        </w:rPr>
-        <w:t xml:space="preserve"> совместн</w:t>
-      </w:r>
-      <w:r>
-        <w:rPr>
-          <w:rFonts w:ascii="Times New Roman" w:hAnsi="Times New Roman" w:cs="Times New Roman"/>
-          <w:sz w:val="28"/>
-          <w:szCs w:val="28"/>
-        </w:rPr>
-        <w:t>ой</w:t>
-      </w:r>
-      <w:r>
-        <w:rPr>
-          <w:rFonts w:ascii="Times New Roman" w:hAnsi="Times New Roman" w:cs="Times New Roman"/>
-          <w:sz w:val="28"/>
-          <w:szCs w:val="28"/>
-        </w:rPr>
-        <w:t xml:space="preserve"> работ</w:t>
-      </w:r>
-      <w:r>
-        <w:rPr>
-          <w:rFonts w:ascii="Times New Roman" w:hAnsi="Times New Roman" w:cs="Times New Roman"/>
-          <w:sz w:val="28"/>
-          <w:szCs w:val="28"/>
-        </w:rPr>
-        <w:t>ы.</w:t>
-      </w:r>
-      <w:r>
-        <w:rPr>
-          <w:rFonts w:ascii="Times New Roman" w:hAnsi="Times New Roman" w:cs="Times New Roman"/>
-          <w:sz w:val="28"/>
-          <w:szCs w:val="28"/>
-        </w:rPr>
-        <w:t xml:space="preserve"> Для любого объекта </w:t>
-      </w:r>
-      <w:r>
-        <w:rPr>
-          <w:rFonts w:ascii="Times New Roman" w:hAnsi="Times New Roman" w:cs="Times New Roman"/>
-          <w:sz w:val="28"/>
-          <w:szCs w:val="28"/>
-        </w:rPr>
-        <w:t>(</w:t>
-      </w:r>
-      <w:r>
-        <w:rPr>
-          <w:rFonts w:ascii="Times New Roman" w:hAnsi="Times New Roman" w:cs="Times New Roman"/>
-          <w:sz w:val="28"/>
-          <w:szCs w:val="28"/>
-        </w:rPr>
-        <w:t>заметк</w:t>
-      </w:r>
-      <w:r>
-        <w:rPr>
-          <w:rFonts w:ascii="Times New Roman" w:hAnsi="Times New Roman" w:cs="Times New Roman"/>
-          <w:sz w:val="28"/>
-          <w:szCs w:val="28"/>
-        </w:rPr>
-        <w:t>и</w:t>
-      </w:r>
-      <w:r>
-        <w:rPr>
-          <w:rFonts w:ascii="Times New Roman" w:hAnsi="Times New Roman" w:cs="Times New Roman"/>
-          <w:sz w:val="28"/>
-          <w:szCs w:val="28"/>
-        </w:rPr>
-        <w:t>, доск</w:t>
-      </w:r>
-      <w:r>
-        <w:rPr>
-          <w:rFonts w:ascii="Times New Roman" w:hAnsi="Times New Roman" w:cs="Times New Roman"/>
-          <w:sz w:val="28"/>
-          <w:szCs w:val="28"/>
-        </w:rPr>
-        <w:t>и</w:t>
-      </w:r>
-      <w:r>
-        <w:rPr>
-          <w:rFonts w:ascii="Times New Roman" w:hAnsi="Times New Roman" w:cs="Times New Roman"/>
-          <w:sz w:val="28"/>
-          <w:szCs w:val="28"/>
-        </w:rPr>
-        <w:t xml:space="preserve"> или календар</w:t>
-      </w:r>
-      <w:r>
-        <w:rPr>
-          <w:rFonts w:ascii="Times New Roman" w:hAnsi="Times New Roman" w:cs="Times New Roman"/>
-          <w:sz w:val="28"/>
-          <w:szCs w:val="28"/>
-        </w:rPr>
-        <w:t>я)</w:t>
-      </w:r>
-      <w:r>
-        <w:rPr>
-          <w:rFonts w:ascii="Times New Roman" w:hAnsi="Times New Roman" w:cs="Times New Roman"/>
-          <w:sz w:val="28"/>
-          <w:szCs w:val="28"/>
-        </w:rPr>
-        <w:t xml:space="preserve"> можно гибко настроить права доступа </w:t>
-      </w:r>
-      <w:r>
-        <w:rPr>
-          <w:rFonts w:ascii="Times New Roman" w:hAnsi="Times New Roman" w:cs="Times New Roman"/>
-          <w:sz w:val="28"/>
-          <w:szCs w:val="28"/>
-        </w:rPr>
-        <w:t>для</w:t>
-      </w:r>
-      <w:r>
-        <w:rPr>
-          <w:rFonts w:ascii="Times New Roman" w:hAnsi="Times New Roman" w:cs="Times New Roman"/>
-          <w:sz w:val="28"/>
-          <w:szCs w:val="28"/>
-        </w:rPr>
-        <w:t xml:space="preserve"> других пользователей. Это создает единое рабочее пространство для коллективной работы над проектами, учебными курсами или личными задачами.</w:t>
+        <w:t>Также</w:t>
+      </w:r>
+      <w:r>
+        <w:rPr>
+          <w:rFonts w:ascii="Times New Roman" w:hAnsi="Times New Roman" w:cs="Times New Roman"/>
+          <w:sz w:val="28"/>
+          <w:szCs w:val="28"/>
+        </w:rPr>
+        <w:t xml:space="preserve"> программная система предоставляет </w:t>
+      </w:r>
+      <w:r>
+        <w:rPr>
+          <w:rFonts w:ascii="Times New Roman" w:hAnsi="Times New Roman" w:cs="Times New Roman"/>
+          <w:sz w:val="28"/>
+          <w:szCs w:val="28"/>
+        </w:rPr>
+        <w:t xml:space="preserve">возможность </w:t>
+      </w:r>
+      <w:r>
+        <w:rPr>
+          <w:rFonts w:ascii="Times New Roman" w:hAnsi="Times New Roman" w:cs="Times New Roman"/>
+          <w:sz w:val="28"/>
+          <w:szCs w:val="28"/>
+        </w:rPr>
+        <w:t>отслежива</w:t>
+      </w:r>
+      <w:r>
+        <w:rPr>
+          <w:rFonts w:ascii="Times New Roman" w:hAnsi="Times New Roman" w:cs="Times New Roman"/>
+          <w:sz w:val="28"/>
+          <w:szCs w:val="28"/>
+        </w:rPr>
+        <w:t>ть и просматривать данные</w:t>
+      </w:r>
+      <w:r>
+        <w:rPr>
+          <w:rFonts w:ascii="Times New Roman" w:hAnsi="Times New Roman" w:cs="Times New Roman"/>
+          <w:sz w:val="28"/>
+          <w:szCs w:val="28"/>
+        </w:rPr>
+        <w:t xml:space="preserve"> </w:t>
+      </w:r>
+      <w:r>
+        <w:rPr>
+          <w:rFonts w:ascii="Times New Roman" w:hAnsi="Times New Roman" w:cs="Times New Roman"/>
+          <w:sz w:val="28"/>
+          <w:szCs w:val="28"/>
+        </w:rPr>
+        <w:t xml:space="preserve">о </w:t>
+      </w:r>
+      <w:r>
+        <w:rPr>
+          <w:rFonts w:ascii="Times New Roman" w:hAnsi="Times New Roman" w:cs="Times New Roman"/>
+          <w:sz w:val="28"/>
+          <w:szCs w:val="28"/>
+        </w:rPr>
+        <w:t>динамик</w:t>
+      </w:r>
+      <w:r>
+        <w:rPr>
+          <w:rFonts w:ascii="Times New Roman" w:hAnsi="Times New Roman" w:cs="Times New Roman"/>
+          <w:sz w:val="28"/>
+          <w:szCs w:val="28"/>
+        </w:rPr>
+        <w:t>е</w:t>
+      </w:r>
+      <w:r>
+        <w:rPr>
+          <w:rFonts w:ascii="Times New Roman" w:hAnsi="Times New Roman" w:cs="Times New Roman"/>
+          <w:sz w:val="28"/>
+          <w:szCs w:val="28"/>
+        </w:rPr>
+        <w:t xml:space="preserve"> создания заметок и эффективности выполнения задач (через соотношение </w:t>
+      </w:r>
+      <w:r>
+        <w:rPr>
+          <w:rFonts w:ascii="Times New Roman" w:hAnsi="Times New Roman" w:cs="Times New Roman"/>
+          <w:sz w:val="28"/>
+          <w:szCs w:val="28"/>
+        </w:rPr>
+        <w:t xml:space="preserve">созданных и успешно </w:t>
+      </w:r>
+      <w:r>
+        <w:rPr>
+          <w:rFonts w:ascii="Times New Roman" w:hAnsi="Times New Roman" w:cs="Times New Roman"/>
+          <w:sz w:val="28"/>
+          <w:szCs w:val="28"/>
+        </w:rPr>
+        <w:t>заверш</w:t>
+      </w:r>
+      <w:r>
+        <w:rPr>
+          <w:rFonts w:ascii="Times New Roman" w:hAnsi="Times New Roman" w:cs="Times New Roman"/>
+          <w:sz w:val="28"/>
+          <w:szCs w:val="28"/>
+        </w:rPr>
+        <w:t>е</w:t>
+      </w:r>
+      <w:r>
+        <w:rPr>
+          <w:rFonts w:ascii="Times New Roman" w:hAnsi="Times New Roman" w:cs="Times New Roman"/>
+          <w:sz w:val="28"/>
+          <w:szCs w:val="28"/>
+        </w:rPr>
+        <w:t>нных)</w:t>
+      </w:r>
+      <w:r>
+        <w:rPr>
+          <w:rFonts w:ascii="Times New Roman" w:hAnsi="Times New Roman" w:cs="Times New Roman"/>
+          <w:sz w:val="28"/>
+          <w:szCs w:val="28"/>
+        </w:rPr>
+        <w:t xml:space="preserve"> </w:t>
+      </w:r>
+      <w:r>
+        <w:rPr>
+          <w:rFonts w:ascii="Times New Roman" w:hAnsi="Times New Roman" w:cs="Times New Roman"/>
+          <w:sz w:val="28"/>
+          <w:szCs w:val="28"/>
+        </w:rPr>
+        <w:t xml:space="preserve">в виде диаграмм </w:t>
+      </w:r>
+      <w:r>
+        <w:rPr>
+          <w:rFonts w:ascii="Times New Roman" w:hAnsi="Times New Roman" w:cs="Times New Roman"/>
+          <w:sz w:val="28"/>
+          <w:szCs w:val="28"/>
+        </w:rPr>
+        <w:t xml:space="preserve">и </w:t>
+      </w:r>
+      <w:r>
+        <w:rPr>
+          <w:rFonts w:ascii="Times New Roman" w:hAnsi="Times New Roman" w:cs="Times New Roman"/>
+          <w:sz w:val="28"/>
+          <w:szCs w:val="28"/>
+        </w:rPr>
+        <w:t>графиков.</w:t>
       </w:r>
     </w:p>
     <w:p>
@@ -703,23 +935,127 @@
           <w:sz w:val="28"/>
           <w:szCs w:val="28"/>
         </w:rPr>
-        <w:t xml:space="preserve">При внедрении </w:t>
-      </w:r>
-      <w:r>
-        <w:rPr>
-          <w:rFonts w:ascii="Times New Roman" w:hAnsi="Times New Roman" w:cs="Times New Roman"/>
-          <w:sz w:val="28"/>
-          <w:szCs w:val="28"/>
-        </w:rPr>
-        <w:t>программной системы удаленного управления заметками</w:t>
-      </w:r>
-      <w:r>
-        <w:rPr>
-          <w:rFonts w:ascii="Times New Roman" w:hAnsi="Times New Roman" w:cs="Times New Roman"/>
-          <w:sz w:val="28"/>
-          <w:szCs w:val="28"/>
-        </w:rPr>
-        <w:t xml:space="preserve"> пользователи получают ряд возможностей для решения множества </w:t>
+        <w:t xml:space="preserve">Ключевой особенностью системы является </w:t>
+      </w:r>
+      <w:r>
+        <w:rPr>
+          <w:rFonts w:ascii="Times New Roman" w:hAnsi="Times New Roman" w:cs="Times New Roman"/>
+          <w:sz w:val="28"/>
+          <w:szCs w:val="28"/>
+        </w:rPr>
+        <w:t>возможность организации</w:t>
+      </w:r>
+      <w:r>
+        <w:rPr>
+          <w:rFonts w:ascii="Times New Roman" w:hAnsi="Times New Roman" w:cs="Times New Roman"/>
+          <w:sz w:val="28"/>
+          <w:szCs w:val="28"/>
+        </w:rPr>
+        <w:t xml:space="preserve"> совместн</w:t>
+      </w:r>
+      <w:r>
+        <w:rPr>
+          <w:rFonts w:ascii="Times New Roman" w:hAnsi="Times New Roman" w:cs="Times New Roman"/>
+          <w:sz w:val="28"/>
+          <w:szCs w:val="28"/>
+        </w:rPr>
+        <w:t>ой</w:t>
+      </w:r>
+      <w:r>
+        <w:rPr>
+          <w:rFonts w:ascii="Times New Roman" w:hAnsi="Times New Roman" w:cs="Times New Roman"/>
+          <w:sz w:val="28"/>
+          <w:szCs w:val="28"/>
+        </w:rPr>
+        <w:t xml:space="preserve"> работ</w:t>
+      </w:r>
+      <w:r>
+        <w:rPr>
+          <w:rFonts w:ascii="Times New Roman" w:hAnsi="Times New Roman" w:cs="Times New Roman"/>
+          <w:sz w:val="28"/>
+          <w:szCs w:val="28"/>
+        </w:rPr>
+        <w:t>ы.</w:t>
+      </w:r>
+      <w:r>
+        <w:rPr>
+          <w:rFonts w:ascii="Times New Roman" w:hAnsi="Times New Roman" w:cs="Times New Roman"/>
+          <w:sz w:val="28"/>
+          <w:szCs w:val="28"/>
+        </w:rPr>
+        <w:t xml:space="preserve"> Для любо</w:t>
+      </w:r>
+      <w:r>
+        <w:rPr>
+          <w:rFonts w:ascii="Times New Roman" w:hAnsi="Times New Roman" w:cs="Times New Roman"/>
+          <w:sz w:val="28"/>
+          <w:szCs w:val="28"/>
+        </w:rPr>
+        <w:t>й заметки</w:t>
+      </w:r>
+      <w:r>
+        <w:rPr>
+          <w:rFonts w:ascii="Times New Roman" w:hAnsi="Times New Roman" w:cs="Times New Roman"/>
+          <w:sz w:val="28"/>
+          <w:szCs w:val="28"/>
+        </w:rPr>
+        <w:t xml:space="preserve"> можно </w:t>
+      </w:r>
+      <w:r>
+        <w:rPr>
+          <w:rFonts w:ascii="Times New Roman" w:hAnsi="Times New Roman" w:cs="Times New Roman"/>
+          <w:sz w:val="28"/>
+          <w:szCs w:val="28"/>
+        </w:rPr>
+        <w:t>выдать</w:t>
+      </w:r>
+      <w:r>
+        <w:rPr>
+          <w:rFonts w:ascii="Times New Roman" w:hAnsi="Times New Roman" w:cs="Times New Roman"/>
+          <w:sz w:val="28"/>
+          <w:szCs w:val="28"/>
+        </w:rPr>
+        <w:t xml:space="preserve"> права доступа други</w:t>
+      </w:r>
+      <w:r>
+        <w:rPr>
+          <w:rFonts w:ascii="Times New Roman" w:hAnsi="Times New Roman" w:cs="Times New Roman"/>
+          <w:sz w:val="28"/>
+          <w:szCs w:val="28"/>
+        </w:rPr>
+        <w:t>м</w:t>
+      </w:r>
+      <w:r>
+        <w:rPr>
+          <w:rFonts w:ascii="Times New Roman" w:hAnsi="Times New Roman" w:cs="Times New Roman"/>
+          <w:sz w:val="28"/>
+          <w:szCs w:val="28"/>
+        </w:rPr>
+        <w:t xml:space="preserve"> пользовател</w:t>
+      </w:r>
+      <w:r>
+        <w:rPr>
+          <w:rFonts w:ascii="Times New Roman" w:hAnsi="Times New Roman" w:cs="Times New Roman"/>
+          <w:sz w:val="28"/>
+          <w:szCs w:val="28"/>
+        </w:rPr>
+        <w:t>ям – «На просмотр» и «На редактирование»</w:t>
+      </w:r>
+      <w:r>
+        <w:rPr>
+          <w:rFonts w:ascii="Times New Roman" w:hAnsi="Times New Roman" w:cs="Times New Roman"/>
+          <w:sz w:val="28"/>
+          <w:szCs w:val="28"/>
+        </w:rPr>
+        <w:t xml:space="preserve">. Это </w:t>
+      </w:r>
+      <w:r>
+        <w:rPr>
+          <w:rFonts w:ascii="Times New Roman" w:hAnsi="Times New Roman" w:cs="Times New Roman"/>
+          <w:sz w:val="28"/>
+          <w:szCs w:val="28"/>
+        </w:rPr>
+        <w:t xml:space="preserve">позволяет </w:t>
       </w:r>
       <w:r>
         <w:rPr>
@@ -728,7 +1064,108 @@
           <w:szCs w:val="28"/>
         </w:rPr>
         <w:lastRenderedPageBreak/>
-        <w:t>проблем, связанных с организацией информации и оптимизацией рабочего процесса, что многократно повышает эффективность деятельности.</w:t>
+        <w:t>созда</w:t>
+      </w:r>
+      <w:r>
+        <w:rPr>
+          <w:rFonts w:ascii="Times New Roman" w:hAnsi="Times New Roman" w:cs="Times New Roman"/>
+          <w:sz w:val="28"/>
+          <w:szCs w:val="28"/>
+        </w:rPr>
+        <w:t>ть</w:t>
+      </w:r>
+      <w:r>
+        <w:rPr>
+          <w:rFonts w:ascii="Times New Roman" w:hAnsi="Times New Roman" w:cs="Times New Roman"/>
+          <w:sz w:val="28"/>
+          <w:szCs w:val="28"/>
+        </w:rPr>
+        <w:t xml:space="preserve"> единое рабочее пространство для коллективной работы над проектами, учебными </w:t>
+      </w:r>
+      <w:r>
+        <w:rPr>
+          <w:rFonts w:ascii="Times New Roman" w:hAnsi="Times New Roman" w:cs="Times New Roman"/>
+          <w:sz w:val="28"/>
+          <w:szCs w:val="28"/>
+        </w:rPr>
+        <w:t>документами</w:t>
+      </w:r>
+      <w:r>
+        <w:rPr>
+          <w:rFonts w:ascii="Times New Roman" w:hAnsi="Times New Roman" w:cs="Times New Roman"/>
+          <w:sz w:val="28"/>
+          <w:szCs w:val="28"/>
+        </w:rPr>
+        <w:t xml:space="preserve"> или личными задачами.</w:t>
+      </w:r>
+    </w:p>
+    <w:p>
+      <w:pPr>
+        <w:pStyle w:val="a7"/>
+        <w:spacing w:line="360" w:lineRule="auto"/>
+        <w:ind w:firstLine="709"/>
+        <w:jc w:val="both"/>
+        <w:rPr>
+          <w:rFonts w:ascii="Times New Roman" w:hAnsi="Times New Roman" w:cs="Times New Roman"/>
+          <w:sz w:val="28"/>
+          <w:szCs w:val="28"/>
+        </w:rPr>
+      </w:pPr>
+      <w:r>
+        <w:rPr>
+          <w:rFonts w:ascii="Times New Roman" w:hAnsi="Times New Roman" w:cs="Times New Roman"/>
+          <w:sz w:val="28"/>
+          <w:szCs w:val="28"/>
+        </w:rPr>
+        <w:t xml:space="preserve">Таким образом, внедрение данной программной системы предоставляет пользователю инструментарий для организации </w:t>
+      </w:r>
+      <w:r>
+        <w:rPr>
+          <w:rFonts w:ascii="Times New Roman" w:hAnsi="Times New Roman" w:cs="Times New Roman"/>
+          <w:sz w:val="28"/>
+          <w:szCs w:val="28"/>
+        </w:rPr>
+        <w:t xml:space="preserve">учебного или </w:t>
+      </w:r>
+      <w:r>
+        <w:rPr>
+          <w:rFonts w:ascii="Times New Roman" w:hAnsi="Times New Roman" w:cs="Times New Roman"/>
+          <w:sz w:val="28"/>
+          <w:szCs w:val="28"/>
+        </w:rPr>
+        <w:t xml:space="preserve">рабочего пространства. </w:t>
+      </w:r>
+      <w:r>
+        <w:rPr>
+          <w:rFonts w:ascii="Times New Roman" w:hAnsi="Times New Roman" w:cs="Times New Roman"/>
+          <w:sz w:val="28"/>
+          <w:szCs w:val="28"/>
+        </w:rPr>
+        <w:t>Ф</w:t>
+      </w:r>
+      <w:r>
+        <w:rPr>
+          <w:rFonts w:ascii="Times New Roman" w:hAnsi="Times New Roman" w:cs="Times New Roman"/>
+          <w:sz w:val="28"/>
+          <w:szCs w:val="28"/>
+        </w:rPr>
+        <w:t>ункционал</w:t>
+      </w:r>
+      <w:r>
+        <w:rPr>
+          <w:rFonts w:ascii="Times New Roman" w:hAnsi="Times New Roman" w:cs="Times New Roman"/>
+          <w:sz w:val="28"/>
+          <w:szCs w:val="28"/>
+        </w:rPr>
+        <w:t xml:space="preserve"> </w:t>
+      </w:r>
+      <w:r>
+        <w:rPr>
+          <w:rFonts w:ascii="Times New Roman" w:hAnsi="Times New Roman" w:cs="Times New Roman"/>
+          <w:sz w:val="28"/>
+          <w:szCs w:val="28"/>
+        </w:rPr>
+        <w:t>направлен на систематизацию работы и способствует повышению личной и командной эффективности.</w:t>
       </w:r>
     </w:p>
     <w:p>
@@ -791,13 +1228,22 @@
         <w:t>выделен набор</w:t>
       </w:r>
       <w:r>
-        <w:t xml:space="preserve"> ключевых сущностей, используемых в проектируемой системе: з</w:t>
+        <w:t xml:space="preserve"> ключевых сущностей, используемых в проектируемой системе: </w:t>
+      </w:r>
+      <w:r>
+        <w:t xml:space="preserve">пользователь, группа пользователей, права доступа, </w:t>
+      </w:r>
+      <w:r>
+        <w:t>з</w:t>
       </w:r>
       <w:r>
         <w:t>аметка,</w:t>
       </w:r>
       <w:r>
-        <w:t xml:space="preserve"> календарь, </w:t>
+        <w:t xml:space="preserve"> директория, шаблон заметки,</w:t>
+      </w:r>
+      <w:r>
+        <w:t xml:space="preserve"> </w:t>
       </w:r>
       <w:proofErr w:type="spellStart"/>
       <w:r>
@@ -805,10 +1251,16 @@
       </w:r>
       <w:proofErr w:type="spellEnd"/>
       <w:r>
-        <w:t>-доска,</w:t>
-      </w:r>
-      <w:r>
-        <w:t xml:space="preserve"> директория, редактор заметок, файловая система, шаблон заметки, права доступа, пользовательский профиль настроек, модуль интерфейса</w:t>
+        <w:t>-доска</w:t>
+      </w:r>
+      <w:r>
+        <w:t>, календарь</w:t>
+      </w:r>
+      <w:r>
+        <w:t>,</w:t>
+      </w:r>
+      <w:r>
+        <w:t xml:space="preserve"> редактор заметок, модуль интерфейса</w:t>
       </w:r>
       <w:r>
         <w:t>.</w:t>
@@ -827,13 +1279,25 @@
         <w:t xml:space="preserve"> </w:t>
       </w:r>
       <w:r>
-        <w:t>с описанием, списком атрибутов и функци</w:t>
-      </w:r>
-      <w:r>
-        <w:t>ями</w:t>
+        <w:t>– дано</w:t>
       </w:r>
       <w:r>
         <w:t xml:space="preserve"> </w:t>
+      </w:r>
+      <w:r>
+        <w:t>определение</w:t>
+      </w:r>
+      <w:r>
+        <w:t xml:space="preserve"> и </w:t>
+      </w:r>
+      <w:r>
+        <w:t>спис</w:t>
+      </w:r>
+      <w:r>
+        <w:t>ки</w:t>
+      </w:r>
+      <w:r>
+        <w:t xml:space="preserve"> атрибутов </w:t>
       </w:r>
       <w:r>
         <w:t>(см. т</w:t>
@@ -886,23 +1350,22 @@
     <w:tbl>
       <w:tblPr>
         <w:tblStyle w:val="af3"/>
-        <w:tblW w:w="0" w:type="auto"/>
+        <w:tblW w:w="9351" w:type="dxa"/>
         <w:tblLook w:val="04A0" w:firstRow="1" w:lastRow="0" w:firstColumn="1" w:lastColumn="0" w:noHBand="0" w:noVBand="1"/>
       </w:tblPr>
       <w:tblGrid>
-        <w:gridCol w:w="2263"/>
-        <w:gridCol w:w="2409"/>
-        <w:gridCol w:w="2336"/>
-        <w:gridCol w:w="2337"/>
+        <w:gridCol w:w="2405"/>
+        <w:gridCol w:w="4253"/>
+        <w:gridCol w:w="2693"/>
       </w:tblGrid>
       <w:tr>
         <w:tc>
           <w:tcPr>
-            <w:tcW w:w="2263" w:type="dxa"/>
+            <w:tcW w:w="2405" w:type="dxa"/>
           </w:tcPr>
           <w:p>
             <w:pPr>
-              <w:spacing w:before="120" w:after="120"/>
+              <w:spacing w:before="120" w:after="0" w:line="276" w:lineRule="auto"/>
               <w:ind w:left="-108" w:firstLine="0"/>
               <w:jc w:val="center"/>
               <w:rPr>
@@ -926,10 +1389,20 @@
           </w:p>
           <w:p>
             <w:pPr>
-              <w:spacing w:before="120" w:after="120"/>
+              <w:spacing w:after="120" w:line="276" w:lineRule="auto"/>
               <w:ind w:left="-108" w:firstLine="0"/>
               <w:jc w:val="center"/>
             </w:pPr>
+            <w:r>
+              <w:rPr>
+                <w:rFonts w:eastAsiaTheme="minorHAnsi" w:cstheme="minorBidi"/>
+                <w:color w:val="auto"/>
+                <w:sz w:val="24"/>
+                <w:szCs w:val="20"/>
+                <w:lang w:eastAsia="en-US"/>
+              </w:rPr>
+              <w:t xml:space="preserve"> </w:t>
+            </w:r>
             <w:r>
               <w:rPr>
                 <w:rFonts w:eastAsiaTheme="minorHAnsi" w:cstheme="minorBidi"/>
@@ -944,7 +1417,7 @@
         </w:tc>
         <w:tc>
           <w:tcPr>
-            <w:tcW w:w="2409" w:type="dxa"/>
+            <w:tcW w:w="4253" w:type="dxa"/>
             <w:vAlign w:val="center"/>
           </w:tcPr>
           <w:p>
@@ -974,7 +1447,7 @@
         </w:tc>
         <w:tc>
           <w:tcPr>
-            <w:tcW w:w="2336" w:type="dxa"/>
+            <w:tcW w:w="2693" w:type="dxa"/>
             <w:vAlign w:val="center"/>
           </w:tcPr>
           <w:p>
@@ -1002,41 +1475,11 @@
             </w:r>
           </w:p>
         </w:tc>
-        <w:tc>
-          <w:tcPr>
-            <w:tcW w:w="2337" w:type="dxa"/>
-            <w:vAlign w:val="center"/>
-          </w:tcPr>
-          <w:p>
-            <w:pPr>
-              <w:spacing w:before="120" w:after="120" w:line="360" w:lineRule="auto"/>
-              <w:ind w:left="-108" w:firstLine="0"/>
-              <w:jc w:val="center"/>
-              <w:rPr>
-                <w:rFonts w:eastAsiaTheme="minorHAnsi" w:cstheme="minorBidi"/>
-                <w:color w:val="auto"/>
-                <w:sz w:val="24"/>
-                <w:szCs w:val="20"/>
-                <w:lang w:eastAsia="en-US"/>
-              </w:rPr>
-            </w:pPr>
-            <w:r>
-              <w:rPr>
-                <w:rFonts w:eastAsiaTheme="minorHAnsi" w:cstheme="minorBidi"/>
-                <w:color w:val="auto"/>
-                <w:sz w:val="24"/>
-                <w:szCs w:val="20"/>
-                <w:lang w:eastAsia="en-US"/>
-              </w:rPr>
-              <w:t>Функции</w:t>
-            </w:r>
-          </w:p>
-        </w:tc>
       </w:tr>
       <w:tr>
         <w:tc>
           <w:tcPr>
-            <w:tcW w:w="2263" w:type="dxa"/>
+            <w:tcW w:w="2405" w:type="dxa"/>
           </w:tcPr>
           <w:p>
             <w:pPr>
@@ -1047,10 +1490,9 @@
               <w:ind w:left="0" w:firstLine="0"/>
               <w:jc w:val="left"/>
               <w:rPr>
-                <w:rFonts w:eastAsiaTheme="minorHAnsi" w:cstheme="minorBidi"/>
-                <w:color w:val="auto"/>
-                <w:sz w:val="24"/>
-                <w:szCs w:val="20"/>
+                <w:color w:val="auto"/>
+                <w:sz w:val="24"/>
+                <w:szCs w:val="24"/>
                 <w:lang w:eastAsia="en-US"/>
               </w:rPr>
             </w:pPr>
@@ -1061,185 +1503,13 @@
                 <w:szCs w:val="24"/>
                 <w:lang w:eastAsia="en-US"/>
               </w:rPr>
-              <w:t>Заметка</w:t>
+              <w:t>Пользователь</w:t>
             </w:r>
           </w:p>
         </w:tc>
         <w:tc>
           <w:tcPr>
-            <w:tcW w:w="2409" w:type="dxa"/>
-          </w:tcPr>
-          <w:p>
-            <w:pPr>
-              <w:widowControl w:val="0"/>
-              <w:autoSpaceDE w:val="0"/>
-              <w:autoSpaceDN w:val="0"/>
-              <w:spacing w:before="120" w:after="120" w:line="276" w:lineRule="auto"/>
-              <w:ind w:left="0" w:firstLine="0"/>
-              <w:jc w:val="center"/>
-              <w:rPr>
-                <w:rFonts w:eastAsiaTheme="minorHAnsi" w:cstheme="minorBidi"/>
-                <w:noProof/>
-                <w:color w:val="auto"/>
-                <w:sz w:val="24"/>
-                <w:szCs w:val="20"/>
-                <w:lang w:eastAsia="en-US"/>
-              </w:rPr>
-            </w:pPr>
-            <w:r>
-              <w:rPr>
-                <w:noProof/>
-                <w:color w:val="auto"/>
-                <w:sz w:val="24"/>
-                <w:szCs w:val="24"/>
-                <w:lang w:eastAsia="en-US"/>
-              </w:rPr>
-              <w:t>Объект, позволя</w:t>
-            </w:r>
-            <w:r>
-              <w:rPr>
-                <w:noProof/>
-                <w:color w:val="auto"/>
-                <w:sz w:val="24"/>
-                <w:szCs w:val="24"/>
-                <w:lang w:eastAsia="en-US"/>
-              </w:rPr>
-              <w:softHyphen/>
-            </w:r>
-            <w:r>
-              <w:rPr>
-                <w:noProof/>
-                <w:color w:val="auto"/>
-                <w:sz w:val="24"/>
-                <w:szCs w:val="24"/>
-                <w:lang w:eastAsia="en-US"/>
-              </w:rPr>
-              <w:t>ющий хранить текст</w:t>
-            </w:r>
-            <w:r>
-              <w:rPr>
-                <w:noProof/>
-                <w:color w:val="auto"/>
-                <w:sz w:val="24"/>
-                <w:szCs w:val="24"/>
-                <w:lang w:eastAsia="en-US"/>
-              </w:rPr>
-              <w:softHyphen/>
-            </w:r>
-            <w:r>
-              <w:rPr>
-                <w:noProof/>
-                <w:color w:val="auto"/>
-                <w:sz w:val="24"/>
-                <w:szCs w:val="24"/>
-                <w:lang w:eastAsia="en-US"/>
-              </w:rPr>
-              <w:t>овую и мультимедиа информацию</w:t>
-            </w:r>
-          </w:p>
-        </w:tc>
-        <w:tc>
-          <w:tcPr>
-            <w:tcW w:w="2336" w:type="dxa"/>
-          </w:tcPr>
-          <w:p>
-            <w:pPr>
-              <w:widowControl w:val="0"/>
-              <w:autoSpaceDE w:val="0"/>
-              <w:autoSpaceDN w:val="0"/>
-              <w:spacing w:before="120" w:after="120" w:line="276" w:lineRule="auto"/>
-              <w:ind w:left="0" w:firstLine="0"/>
-              <w:jc w:val="center"/>
-              <w:rPr>
-                <w:rFonts w:eastAsiaTheme="minorHAnsi" w:cstheme="minorBidi"/>
-                <w:color w:val="auto"/>
-                <w:sz w:val="24"/>
-                <w:szCs w:val="20"/>
-                <w:lang w:eastAsia="en-US"/>
-              </w:rPr>
-            </w:pPr>
-            <w:r>
-              <w:rPr>
-                <w:color w:val="auto"/>
-                <w:sz w:val="24"/>
-                <w:szCs w:val="24"/>
-                <w:lang w:eastAsia="en-US"/>
-              </w:rPr>
-              <w:t>Название, контент, дата создания, шаб</w:t>
-            </w:r>
-            <w:r>
-              <w:rPr>
-                <w:color w:val="auto"/>
-                <w:sz w:val="24"/>
-                <w:szCs w:val="24"/>
-                <w:lang w:eastAsia="en-US"/>
-              </w:rPr>
-              <w:softHyphen/>
-            </w:r>
-            <w:r>
-              <w:rPr>
-                <w:color w:val="auto"/>
-                <w:sz w:val="24"/>
-                <w:szCs w:val="24"/>
-                <w:lang w:eastAsia="en-US"/>
-              </w:rPr>
-              <w:t>лон заметки, пользо</w:t>
-            </w:r>
-            <w:r>
-              <w:rPr>
-                <w:color w:val="auto"/>
-                <w:sz w:val="24"/>
-                <w:szCs w:val="24"/>
-                <w:lang w:eastAsia="en-US"/>
-              </w:rPr>
-              <w:softHyphen/>
-            </w:r>
-            <w:r>
-              <w:rPr>
-                <w:color w:val="auto"/>
-                <w:sz w:val="24"/>
-                <w:szCs w:val="24"/>
-                <w:lang w:eastAsia="en-US"/>
-              </w:rPr>
-              <w:t>ватель</w:t>
-            </w:r>
-          </w:p>
-        </w:tc>
-        <w:tc>
-          <w:tcPr>
-            <w:tcW w:w="2337" w:type="dxa"/>
-            <w:vAlign w:val="center"/>
-          </w:tcPr>
-          <w:p>
-            <w:pPr>
-              <w:spacing w:before="120" w:after="120" w:line="360" w:lineRule="auto"/>
-              <w:ind w:left="-108" w:firstLine="0"/>
-              <w:jc w:val="center"/>
-              <w:rPr>
-                <w:rFonts w:eastAsiaTheme="minorHAnsi" w:cstheme="minorBidi"/>
-                <w:color w:val="auto"/>
-                <w:sz w:val="24"/>
-                <w:szCs w:val="20"/>
-                <w:lang w:eastAsia="en-US"/>
-              </w:rPr>
-            </w:pPr>
-            <w:r>
-              <w:rPr>
-                <w:rFonts w:eastAsiaTheme="minorHAnsi" w:cstheme="minorBidi"/>
-                <w:color w:val="auto"/>
-                <w:sz w:val="24"/>
-                <w:szCs w:val="20"/>
-                <w:lang w:eastAsia="en-US"/>
-              </w:rPr>
-              <w:t>–</w:t>
-            </w:r>
-          </w:p>
-        </w:tc>
-      </w:tr>
-      <w:tr>
-        <w:tc>
-          <w:tcPr>
-            <w:tcW w:w="2263" w:type="dxa"/>
+            <w:tcW w:w="4253" w:type="dxa"/>
           </w:tcPr>
           <w:p>
             <w:pPr>
@@ -1250,240 +1520,128 @@
               <w:ind w:left="0" w:firstLine="0"/>
               <w:jc w:val="left"/>
               <w:rPr>
-                <w:rFonts w:eastAsiaTheme="minorHAnsi" w:cstheme="minorBidi"/>
-                <w:color w:val="auto"/>
-                <w:sz w:val="24"/>
-                <w:szCs w:val="20"/>
+                <w:noProof/>
+                <w:color w:val="auto"/>
+                <w:sz w:val="24"/>
+                <w:szCs w:val="24"/>
                 <w:lang w:eastAsia="en-US"/>
               </w:rPr>
             </w:pPr>
-            <w:proofErr w:type="spellStart"/>
-            <w:r>
-              <w:rPr>
-                <w:rFonts w:eastAsiaTheme="minorHAnsi" w:cstheme="minorBidi"/>
-                <w:color w:val="auto"/>
-                <w:sz w:val="24"/>
-                <w:szCs w:val="20"/>
-                <w:lang w:eastAsia="en-US"/>
-              </w:rPr>
-              <w:t>Канбан</w:t>
-            </w:r>
-            <w:proofErr w:type="spellEnd"/>
-            <w:r>
-              <w:rPr>
-                <w:rFonts w:eastAsiaTheme="minorHAnsi" w:cstheme="minorBidi"/>
-                <w:color w:val="auto"/>
-                <w:sz w:val="24"/>
-                <w:szCs w:val="20"/>
-                <w:lang w:eastAsia="en-US"/>
-              </w:rPr>
-              <w:t>-доска</w:t>
+            <w:r>
+              <w:rPr>
+                <w:noProof/>
+                <w:color w:val="auto"/>
+                <w:sz w:val="24"/>
+                <w:szCs w:val="24"/>
+                <w:lang w:eastAsia="en-US"/>
+              </w:rPr>
+              <w:t>Ч</w:t>
+            </w:r>
+            <w:r>
+              <w:rPr>
+                <w:noProof/>
+                <w:color w:val="auto"/>
+                <w:sz w:val="24"/>
+                <w:szCs w:val="24"/>
+                <w:lang w:eastAsia="en-US"/>
+              </w:rPr>
+              <w:t>еловек</w:t>
+            </w:r>
+            <w:r>
+              <w:rPr>
+                <w:noProof/>
+                <w:color w:val="auto"/>
+                <w:sz w:val="24"/>
+                <w:szCs w:val="24"/>
+                <w:lang w:eastAsia="en-US"/>
+              </w:rPr>
+              <w:t>,</w:t>
+            </w:r>
+            <w:r>
+              <w:rPr>
+                <w:noProof/>
+                <w:color w:val="auto"/>
+                <w:sz w:val="24"/>
+                <w:szCs w:val="24"/>
+                <w:lang w:eastAsia="en-US"/>
+              </w:rPr>
+              <w:t xml:space="preserve"> </w:t>
+            </w:r>
+            <w:r>
+              <w:rPr>
+                <w:noProof/>
+                <w:color w:val="auto"/>
+                <w:sz w:val="24"/>
+                <w:szCs w:val="24"/>
+                <w:lang w:eastAsia="en-US"/>
+              </w:rPr>
+              <w:t xml:space="preserve">имеющий аккаунт </w:t>
+            </w:r>
+            <w:r>
+              <w:rPr>
+                <w:noProof/>
+                <w:color w:val="auto"/>
+                <w:sz w:val="24"/>
+                <w:szCs w:val="24"/>
+                <w:lang w:eastAsia="en-US"/>
+              </w:rPr>
+              <w:t>в системе</w:t>
+            </w:r>
+            <w:r>
+              <w:rPr>
+                <w:noProof/>
+                <w:color w:val="auto"/>
+                <w:sz w:val="24"/>
+                <w:szCs w:val="24"/>
+                <w:lang w:eastAsia="en-US"/>
+              </w:rPr>
+              <w:t>,</w:t>
+            </w:r>
+            <w:r>
+              <w:rPr>
+                <w:noProof/>
+                <w:color w:val="auto"/>
+                <w:sz w:val="24"/>
+                <w:szCs w:val="24"/>
+                <w:lang w:eastAsia="en-US"/>
+              </w:rPr>
+              <w:t xml:space="preserve"> </w:t>
+            </w:r>
+            <w:r>
+              <w:rPr>
+                <w:noProof/>
+                <w:color w:val="auto"/>
+                <w:sz w:val="24"/>
+                <w:szCs w:val="24"/>
+                <w:lang w:eastAsia="en-US"/>
+              </w:rPr>
+              <w:t xml:space="preserve">взаимодействует с </w:t>
+            </w:r>
+            <w:r>
+              <w:rPr>
+                <w:noProof/>
+                <w:color w:val="auto"/>
+                <w:sz w:val="24"/>
+                <w:szCs w:val="24"/>
+                <w:lang w:eastAsia="en-US"/>
+              </w:rPr>
+              <w:t>ней</w:t>
+            </w:r>
+            <w:r>
+              <w:rPr>
+                <w:noProof/>
+                <w:color w:val="auto"/>
+                <w:sz w:val="24"/>
+                <w:szCs w:val="24"/>
+                <w:lang w:eastAsia="en-US"/>
+              </w:rPr>
+              <w:t xml:space="preserve"> для ведения заметок, управления задачами и организации совместной работы, настраивая функционал под свои нужды</w:t>
             </w:r>
           </w:p>
         </w:tc>
         <w:tc>
           <w:tcPr>
-            <w:tcW w:w="2409" w:type="dxa"/>
-          </w:tcPr>
-          <w:p>
-            <w:pPr>
-              <w:widowControl w:val="0"/>
-              <w:autoSpaceDE w:val="0"/>
-              <w:autoSpaceDN w:val="0"/>
-              <w:spacing w:before="120" w:after="120" w:line="276" w:lineRule="auto"/>
-              <w:ind w:left="0" w:firstLine="0"/>
-              <w:jc w:val="center"/>
-              <w:rPr>
-                <w:color w:val="auto"/>
-                <w:sz w:val="24"/>
-                <w:szCs w:val="24"/>
-                <w:lang w:eastAsia="en-US"/>
-              </w:rPr>
-            </w:pPr>
-            <w:r>
-              <w:rPr>
-                <w:color w:val="auto"/>
-                <w:sz w:val="24"/>
-                <w:szCs w:val="24"/>
-                <w:lang w:eastAsia="en-US"/>
-              </w:rPr>
-              <w:t>Тип заметки</w:t>
-            </w:r>
-            <w:r>
-              <w:rPr>
-                <w:color w:val="auto"/>
-                <w:sz w:val="24"/>
-                <w:szCs w:val="24"/>
-                <w:lang w:eastAsia="en-US"/>
-              </w:rPr>
-              <w:t xml:space="preserve">, </w:t>
-            </w:r>
-            <w:r>
-              <w:rPr>
-                <w:color w:val="auto"/>
-                <w:sz w:val="24"/>
-                <w:szCs w:val="24"/>
-                <w:lang w:eastAsia="en-US"/>
-              </w:rPr>
-              <w:t>представляющий</w:t>
-            </w:r>
-            <w:r>
-              <w:rPr>
-                <w:color w:val="auto"/>
-                <w:sz w:val="24"/>
-                <w:szCs w:val="24"/>
-                <w:lang w:eastAsia="en-US"/>
-              </w:rPr>
-              <w:t xml:space="preserve"> </w:t>
-            </w:r>
-            <w:r>
-              <w:rPr>
-                <w:color w:val="auto"/>
-                <w:sz w:val="24"/>
-                <w:szCs w:val="24"/>
-                <w:lang w:eastAsia="en-US"/>
-              </w:rPr>
-              <w:t xml:space="preserve">инструмент для управления задачами, где задачи представлены в виде карточек, а этапы работы </w:t>
-            </w:r>
-            <w:r>
-              <w:rPr>
-                <w:color w:val="auto"/>
-                <w:sz w:val="24"/>
-                <w:szCs w:val="24"/>
-                <w:lang w:eastAsia="en-US"/>
-              </w:rPr>
-              <w:t xml:space="preserve">- </w:t>
-            </w:r>
-            <w:r>
-              <w:rPr>
-                <w:color w:val="auto"/>
-                <w:sz w:val="24"/>
-                <w:szCs w:val="24"/>
-                <w:lang w:eastAsia="en-US"/>
-              </w:rPr>
-              <w:t>в виде столбцов</w:t>
-            </w:r>
-          </w:p>
-        </w:tc>
-        <w:tc>
-          <w:tcPr>
-            <w:tcW w:w="2336" w:type="dxa"/>
-          </w:tcPr>
-          <w:p>
-            <w:pPr>
-              <w:widowControl w:val="0"/>
-              <w:autoSpaceDE w:val="0"/>
-              <w:autoSpaceDN w:val="0"/>
-              <w:spacing w:before="120" w:after="120" w:line="276" w:lineRule="auto"/>
-              <w:ind w:left="0" w:firstLine="0"/>
-              <w:jc w:val="center"/>
-              <w:rPr>
-                <w:rFonts w:eastAsiaTheme="minorHAnsi" w:cstheme="minorBidi"/>
-                <w:color w:val="auto"/>
-                <w:sz w:val="24"/>
-                <w:szCs w:val="20"/>
-                <w:lang w:eastAsia="en-US"/>
-              </w:rPr>
-            </w:pPr>
-            <w:r>
-              <w:rPr>
-                <w:color w:val="auto"/>
-                <w:sz w:val="24"/>
-                <w:szCs w:val="24"/>
-                <w:lang w:eastAsia="en-US"/>
-              </w:rPr>
-              <w:t>Список столбцов, список задач, список заметок</w:t>
-            </w:r>
-          </w:p>
-        </w:tc>
-        <w:tc>
-          <w:tcPr>
-            <w:tcW w:w="2337" w:type="dxa"/>
-            <w:vAlign w:val="center"/>
-          </w:tcPr>
-          <w:p>
-            <w:pPr>
-              <w:spacing w:before="120" w:after="120" w:line="360" w:lineRule="auto"/>
-              <w:ind w:left="-108" w:firstLine="0"/>
-              <w:jc w:val="center"/>
-              <w:rPr>
-                <w:rFonts w:eastAsiaTheme="minorHAnsi" w:cstheme="minorBidi"/>
-                <w:color w:val="auto"/>
-                <w:sz w:val="24"/>
-                <w:szCs w:val="20"/>
-                <w:lang w:eastAsia="en-US"/>
-              </w:rPr>
-            </w:pPr>
-            <w:r>
-              <w:rPr>
-                <w:rFonts w:eastAsiaTheme="minorHAnsi" w:cstheme="minorBidi"/>
-                <w:color w:val="auto"/>
-                <w:sz w:val="24"/>
-                <w:szCs w:val="20"/>
-                <w:lang w:eastAsia="en-US"/>
-              </w:rPr>
-              <w:t>–</w:t>
-            </w:r>
-          </w:p>
-        </w:tc>
-      </w:tr>
-    </w:tbl>
-    <w:p>
-      <w:pPr>
-        <w:spacing w:after="160"/>
-        <w:ind w:left="0" w:firstLine="0"/>
-        <w:jc w:val="left"/>
-        <w:rPr>
-          <w:caps/>
-          <w:sz w:val="72"/>
-          <w:szCs w:val="72"/>
-        </w:rPr>
-      </w:pPr>
-      <w:r>
-        <w:rPr>
-          <w:caps/>
-          <w:sz w:val="72"/>
-          <w:szCs w:val="72"/>
-        </w:rPr>
-        <w:br w:type="page"/>
-      </w:r>
-    </w:p>
-    <w:p>
-      <w:pPr>
-        <w:spacing w:after="160"/>
-        <w:ind w:left="0" w:firstLine="0"/>
-        <w:jc w:val="left"/>
-        <w:rPr>
-          <w:caps/>
-          <w:sz w:val="28"/>
-          <w:szCs w:val="28"/>
-        </w:rPr>
-      </w:pPr>
-      <w:r>
-        <w:rPr>
-          <w:sz w:val="28"/>
-          <w:szCs w:val="28"/>
-        </w:rPr>
-        <w:lastRenderedPageBreak/>
-        <w:t>Продолжение таблицы 1.</w:t>
-      </w:r>
-    </w:p>
-    <w:tbl>
-      <w:tblPr>
-        <w:tblStyle w:val="af3"/>
-        <w:tblW w:w="9405" w:type="dxa"/>
-        <w:tblLook w:val="04A0" w:firstRow="1" w:lastRow="0" w:firstColumn="1" w:lastColumn="0" w:noHBand="0" w:noVBand="1"/>
-      </w:tblPr>
-      <w:tblGrid>
-        <w:gridCol w:w="2232"/>
-        <w:gridCol w:w="2441"/>
-        <w:gridCol w:w="2365"/>
-        <w:gridCol w:w="2367"/>
-      </w:tblGrid>
-      <w:tr>
-        <w:tc>
-          <w:tcPr>
-            <w:tcW w:w="2232" w:type="dxa"/>
+            <w:tcW w:w="2693" w:type="dxa"/>
           </w:tcPr>
           <w:p>
             <w:pPr>
@@ -1494,10 +1652,9 @@
               <w:ind w:left="0" w:firstLine="0"/>
               <w:jc w:val="left"/>
               <w:rPr>
-                <w:rFonts w:eastAsiaTheme="minorHAnsi" w:cstheme="minorBidi"/>
-                <w:color w:val="auto"/>
-                <w:sz w:val="24"/>
-                <w:szCs w:val="20"/>
+                <w:color w:val="auto"/>
+                <w:sz w:val="24"/>
+                <w:szCs w:val="24"/>
                 <w:lang w:eastAsia="en-US"/>
               </w:rPr>
             </w:pPr>
@@ -1508,22 +1665,42 @@
                 <w:szCs w:val="24"/>
                 <w:lang w:eastAsia="en-US"/>
               </w:rPr>
-              <w:t>Календарь</w:t>
+              <w:t>Имя, фамилия, дата рождения, дата регистрации, почтовый адрес, пароль</w:t>
+            </w:r>
+            <w:r>
+              <w:rPr>
+                <w:color w:val="auto"/>
+                <w:sz w:val="24"/>
+                <w:szCs w:val="24"/>
+                <w:lang w:eastAsia="en-US"/>
+              </w:rPr>
+              <w:t xml:space="preserve">, </w:t>
+            </w:r>
+            <w:r>
+              <w:rPr>
+                <w:color w:val="auto"/>
+                <w:sz w:val="24"/>
+                <w:szCs w:val="24"/>
+                <w:lang w:eastAsia="en-US"/>
+              </w:rPr>
+              <w:t>список заметок</w:t>
             </w:r>
           </w:p>
         </w:tc>
+      </w:tr>
+      <w:tr>
         <w:tc>
           <w:tcPr>
-            <w:tcW w:w="2441" w:type="dxa"/>
+            <w:tcW w:w="2405" w:type="dxa"/>
           </w:tcPr>
           <w:p>
             <w:pPr>
               <w:widowControl w:val="0"/>
               <w:autoSpaceDE w:val="0"/>
               <w:autoSpaceDN w:val="0"/>
-              <w:spacing w:before="120" w:after="120" w:line="276" w:lineRule="auto"/>
+              <w:spacing w:before="120" w:after="0" w:line="276" w:lineRule="auto"/>
               <w:ind w:left="0" w:firstLine="0"/>
-              <w:jc w:val="center"/>
+              <w:jc w:val="left"/>
               <w:rPr>
                 <w:color w:val="auto"/>
                 <w:sz w:val="24"/>
@@ -1538,112 +1715,17 @@
                 <w:szCs w:val="24"/>
                 <w:lang w:eastAsia="en-US"/>
               </w:rPr>
-              <w:t>Тип заметки, представляющий систему управления задачами с датами их выполнения (собы</w:t>
-            </w:r>
-            <w:r>
-              <w:rPr>
-                <w:color w:val="auto"/>
-                <w:sz w:val="24"/>
-                <w:szCs w:val="24"/>
-                <w:lang w:eastAsia="en-US"/>
-              </w:rPr>
-              <w:softHyphen/>
-            </w:r>
-            <w:r>
-              <w:rPr>
-                <w:color w:val="auto"/>
-                <w:sz w:val="24"/>
-                <w:szCs w:val="24"/>
-                <w:lang w:eastAsia="en-US"/>
-              </w:rPr>
-              <w:t>ти</w:t>
-            </w:r>
-            <w:r>
-              <w:rPr>
-                <w:color w:val="auto"/>
-                <w:sz w:val="24"/>
-                <w:szCs w:val="24"/>
-                <w:lang w:eastAsia="en-US"/>
-              </w:rPr>
-              <w:softHyphen/>
-            </w:r>
-            <w:r>
-              <w:rPr>
-                <w:color w:val="auto"/>
-                <w:sz w:val="24"/>
-                <w:szCs w:val="24"/>
-                <w:lang w:eastAsia="en-US"/>
-              </w:rPr>
-              <w:t>ями) для нагляд</w:t>
-            </w:r>
-            <w:r>
-              <w:rPr>
-                <w:color w:val="auto"/>
-                <w:sz w:val="24"/>
-                <w:szCs w:val="24"/>
-                <w:lang w:eastAsia="en-US"/>
-              </w:rPr>
-              <w:softHyphen/>
-            </w:r>
-            <w:r>
-              <w:rPr>
-                <w:color w:val="auto"/>
-                <w:sz w:val="24"/>
-                <w:szCs w:val="24"/>
-                <w:lang w:eastAsia="en-US"/>
-              </w:rPr>
-              <w:t>ного отображения край</w:t>
-            </w:r>
-            <w:r>
-              <w:rPr>
-                <w:color w:val="auto"/>
-                <w:sz w:val="24"/>
-                <w:szCs w:val="24"/>
-                <w:lang w:eastAsia="en-US"/>
-              </w:rPr>
-              <w:softHyphen/>
-            </w:r>
-            <w:r>
-              <w:rPr>
-                <w:color w:val="auto"/>
-                <w:sz w:val="24"/>
-                <w:szCs w:val="24"/>
-                <w:lang w:eastAsia="en-US"/>
-              </w:rPr>
-              <w:t>них сроков за</w:t>
-            </w:r>
-            <w:r>
-              <w:rPr>
-                <w:color w:val="auto"/>
-                <w:sz w:val="24"/>
-                <w:szCs w:val="24"/>
-                <w:lang w:eastAsia="en-US"/>
-              </w:rPr>
-              <w:softHyphen/>
-            </w:r>
-            <w:r>
-              <w:rPr>
-                <w:color w:val="auto"/>
-                <w:sz w:val="24"/>
-                <w:szCs w:val="24"/>
-                <w:lang w:eastAsia="en-US"/>
-              </w:rPr>
-              <w:t>дач</w:t>
+              <w:t>Группа</w:t>
             </w:r>
           </w:p>
-        </w:tc>
-        <w:tc>
-          <w:tcPr>
-            <w:tcW w:w="2365" w:type="dxa"/>
-          </w:tcPr>
           <w:p>
             <w:pPr>
               <w:widowControl w:val="0"/>
               <w:autoSpaceDE w:val="0"/>
               <w:autoSpaceDN w:val="0"/>
-              <w:spacing w:before="120" w:after="120" w:line="276" w:lineRule="auto"/>
+              <w:spacing w:after="120" w:line="276" w:lineRule="auto"/>
               <w:ind w:left="0" w:firstLine="0"/>
-              <w:jc w:val="center"/>
+              <w:jc w:val="left"/>
               <w:rPr>
                 <w:color w:val="auto"/>
                 <w:sz w:val="24"/>
@@ -1658,45 +1740,13 @@
                 <w:szCs w:val="24"/>
                 <w:lang w:eastAsia="en-US"/>
               </w:rPr>
-              <w:t>Список событий, список заметок</w:t>
+              <w:t>пользователей</w:t>
             </w:r>
           </w:p>
         </w:tc>
         <w:tc>
           <w:tcPr>
-            <w:tcW w:w="2367" w:type="dxa"/>
-            <w:vAlign w:val="center"/>
-          </w:tcPr>
-          <w:p>
-            <w:pPr>
-              <w:spacing w:before="120" w:after="120" w:line="360" w:lineRule="auto"/>
-              <w:ind w:left="-108" w:firstLine="0"/>
-              <w:jc w:val="center"/>
-              <w:rPr>
-                <w:rFonts w:eastAsiaTheme="minorHAnsi" w:cstheme="minorBidi"/>
-                <w:color w:val="auto"/>
-                <w:sz w:val="24"/>
-                <w:szCs w:val="20"/>
-                <w:lang w:eastAsia="en-US"/>
-              </w:rPr>
-            </w:pPr>
-            <w:r>
-              <w:rPr>
-                <w:rFonts w:eastAsiaTheme="minorHAnsi" w:cstheme="minorBidi"/>
-                <w:color w:val="auto"/>
-                <w:sz w:val="24"/>
-                <w:szCs w:val="20"/>
-                <w:lang w:eastAsia="en-US"/>
-              </w:rPr>
-              <w:t>–</w:t>
-            </w:r>
-          </w:p>
-        </w:tc>
-      </w:tr>
-      <w:tr>
-        <w:tc>
-          <w:tcPr>
-            <w:tcW w:w="2232" w:type="dxa"/>
+            <w:tcW w:w="4253" w:type="dxa"/>
           </w:tcPr>
           <w:p>
             <w:pPr>
@@ -1707,27 +1757,185 @@
               <w:ind w:left="0" w:firstLine="0"/>
               <w:jc w:val="left"/>
               <w:rPr>
-                <w:rFonts w:eastAsiaTheme="minorHAnsi" w:cstheme="minorBidi"/>
-                <w:color w:val="auto"/>
-                <w:sz w:val="24"/>
-                <w:szCs w:val="20"/>
+                <w:noProof/>
+                <w:color w:val="auto"/>
+                <w:sz w:val="24"/>
+                <w:szCs w:val="24"/>
                 <w:lang w:eastAsia="en-US"/>
               </w:rPr>
             </w:pPr>
             <w:r>
               <w:rPr>
-                <w:color w:val="auto"/>
-                <w:sz w:val="24"/>
-                <w:szCs w:val="24"/>
-                <w:lang w:eastAsia="en-US"/>
-              </w:rPr>
-              <w:t>Директория</w:t>
+                <w:noProof/>
+                <w:color w:val="auto"/>
+                <w:sz w:val="24"/>
+                <w:szCs w:val="24"/>
+                <w:lang w:eastAsia="en-US"/>
+              </w:rPr>
+              <w:t>Несколько</w:t>
+            </w:r>
+            <w:r>
+              <w:rPr>
+                <w:noProof/>
+                <w:color w:val="auto"/>
+                <w:sz w:val="24"/>
+                <w:szCs w:val="24"/>
+                <w:lang w:eastAsia="en-US"/>
+              </w:rPr>
+              <w:t xml:space="preserve"> пользовател</w:t>
+            </w:r>
+            <w:r>
+              <w:rPr>
+                <w:noProof/>
+                <w:color w:val="auto"/>
+                <w:sz w:val="24"/>
+                <w:szCs w:val="24"/>
+                <w:lang w:eastAsia="en-US"/>
+              </w:rPr>
+              <w:t>ей</w:t>
+            </w:r>
+            <w:r>
+              <w:rPr>
+                <w:noProof/>
+                <w:color w:val="auto"/>
+                <w:sz w:val="24"/>
+                <w:szCs w:val="24"/>
+                <w:lang w:eastAsia="en-US"/>
+              </w:rPr>
+              <w:t xml:space="preserve"> системы</w:t>
+            </w:r>
+            <w:r>
+              <w:rPr>
+                <w:noProof/>
+                <w:color w:val="auto"/>
+                <w:sz w:val="24"/>
+                <w:szCs w:val="24"/>
+                <w:lang w:eastAsia="en-US"/>
+              </w:rPr>
+              <w:t xml:space="preserve"> (два и более)</w:t>
+            </w:r>
+            <w:r>
+              <w:rPr>
+                <w:noProof/>
+                <w:color w:val="auto"/>
+                <w:sz w:val="24"/>
+                <w:szCs w:val="24"/>
+                <w:lang w:eastAsia="en-US"/>
+              </w:rPr>
+              <w:t>, объедин</w:t>
+            </w:r>
+            <w:r>
+              <w:rPr>
+                <w:noProof/>
+                <w:color w:val="auto"/>
+                <w:sz w:val="24"/>
+                <w:szCs w:val="24"/>
+                <w:lang w:eastAsia="en-US"/>
+              </w:rPr>
+              <w:t>е</w:t>
+            </w:r>
+            <w:r>
+              <w:rPr>
+                <w:noProof/>
+                <w:color w:val="auto"/>
+                <w:sz w:val="24"/>
+                <w:szCs w:val="24"/>
+                <w:lang w:eastAsia="en-US"/>
+              </w:rPr>
+              <w:t>нны</w:t>
+            </w:r>
+            <w:r>
+              <w:rPr>
+                <w:noProof/>
+                <w:color w:val="auto"/>
+                <w:sz w:val="24"/>
+                <w:szCs w:val="24"/>
+                <w:lang w:eastAsia="en-US"/>
+              </w:rPr>
+              <w:t>х</w:t>
+            </w:r>
+            <w:r>
+              <w:rPr>
+                <w:noProof/>
+                <w:color w:val="auto"/>
+                <w:sz w:val="24"/>
+                <w:szCs w:val="24"/>
+                <w:lang w:eastAsia="en-US"/>
+              </w:rPr>
+              <w:t xml:space="preserve"> общим доступом к заметк</w:t>
+            </w:r>
+            <w:r>
+              <w:rPr>
+                <w:noProof/>
+                <w:color w:val="auto"/>
+                <w:sz w:val="24"/>
+                <w:szCs w:val="24"/>
+                <w:lang w:eastAsia="en-US"/>
+              </w:rPr>
+              <w:t>е</w:t>
             </w:r>
           </w:p>
         </w:tc>
         <w:tc>
           <w:tcPr>
-            <w:tcW w:w="2441" w:type="dxa"/>
+            <w:tcW w:w="2693" w:type="dxa"/>
+          </w:tcPr>
+          <w:p>
+            <w:pPr>
+              <w:widowControl w:val="0"/>
+              <w:autoSpaceDE w:val="0"/>
+              <w:autoSpaceDN w:val="0"/>
+              <w:spacing w:before="120" w:after="0" w:line="276" w:lineRule="auto"/>
+              <w:ind w:left="0" w:firstLine="0"/>
+              <w:jc w:val="left"/>
+              <w:rPr>
+                <w:color w:val="auto"/>
+                <w:sz w:val="24"/>
+                <w:szCs w:val="24"/>
+                <w:lang w:eastAsia="en-US"/>
+              </w:rPr>
+            </w:pPr>
+            <w:r>
+              <w:rPr>
+                <w:color w:val="auto"/>
+                <w:sz w:val="24"/>
+                <w:szCs w:val="24"/>
+                <w:lang w:eastAsia="en-US"/>
+              </w:rPr>
+              <w:t>Список</w:t>
+            </w:r>
+          </w:p>
+          <w:p>
+            <w:pPr>
+              <w:widowControl w:val="0"/>
+              <w:autoSpaceDE w:val="0"/>
+              <w:autoSpaceDN w:val="0"/>
+              <w:spacing w:after="0" w:line="276" w:lineRule="auto"/>
+              <w:ind w:left="0" w:firstLine="0"/>
+              <w:jc w:val="left"/>
+              <w:rPr>
+                <w:color w:val="auto"/>
+                <w:sz w:val="24"/>
+                <w:szCs w:val="24"/>
+                <w:lang w:eastAsia="en-US"/>
+              </w:rPr>
+            </w:pPr>
+            <w:r>
+              <w:rPr>
+                <w:color w:val="auto"/>
+                <w:sz w:val="24"/>
+                <w:szCs w:val="24"/>
+                <w:lang w:eastAsia="en-US"/>
+              </w:rPr>
+              <w:t>пользователей</w:t>
+            </w:r>
+          </w:p>
+        </w:tc>
+      </w:tr>
+      <w:tr>
+        <w:tc>
+          <w:tcPr>
+            <w:tcW w:w="2405" w:type="dxa"/>
           </w:tcPr>
           <w:p>
             <w:pPr>
@@ -1736,7 +1944,7 @@
               <w:autoSpaceDN w:val="0"/>
               <w:spacing w:before="120" w:after="120" w:line="276" w:lineRule="auto"/>
               <w:ind w:left="0" w:firstLine="0"/>
-              <w:jc w:val="center"/>
+              <w:jc w:val="left"/>
               <w:rPr>
                 <w:color w:val="auto"/>
                 <w:sz w:val="24"/>
@@ -1751,13 +1959,13 @@
                 <w:szCs w:val="24"/>
                 <w:lang w:eastAsia="en-US"/>
               </w:rPr>
-              <w:t>Объект, позволяющий группировать несколько заметок или их типы</w:t>
+              <w:t>Права доступа</w:t>
             </w:r>
           </w:p>
         </w:tc>
         <w:tc>
           <w:tcPr>
-            <w:tcW w:w="2365" w:type="dxa"/>
+            <w:tcW w:w="4253" w:type="dxa"/>
           </w:tcPr>
           <w:p>
             <w:pPr>
@@ -1766,8 +1974,9 @@
               <w:autoSpaceDN w:val="0"/>
               <w:spacing w:before="120" w:after="120" w:line="276" w:lineRule="auto"/>
               <w:ind w:left="0" w:firstLine="0"/>
-              <w:jc w:val="center"/>
-              <w:rPr>
+              <w:jc w:val="left"/>
+              <w:rPr>
+                <w:noProof/>
                 <w:color w:val="auto"/>
                 <w:sz w:val="24"/>
                 <w:szCs w:val="24"/>
@@ -1781,20 +1990,39 @@
                 <w:szCs w:val="24"/>
                 <w:lang w:eastAsia="en-US"/>
               </w:rPr>
-              <w:t>Название, пользователь, список заметок, дата создания</w:t>
+              <w:t>У</w:t>
+            </w:r>
+            <w:r>
+              <w:rPr>
+                <w:color w:val="auto"/>
+                <w:sz w:val="24"/>
+                <w:szCs w:val="24"/>
+                <w:lang w:eastAsia="en-US"/>
+              </w:rPr>
+              <w:t>ровень полномочий, который владелец заметки назначает другому пользователю для организации совместной работы</w:t>
             </w:r>
           </w:p>
         </w:tc>
         <w:tc>
           <w:tcPr>
-            <w:tcW w:w="2367" w:type="dxa"/>
-            <w:vAlign w:val="center"/>
+            <w:tcW w:w="2693" w:type="dxa"/>
           </w:tcPr>
           <w:p>
             <w:pPr>
-              <w:spacing w:before="120" w:after="120" w:line="360" w:lineRule="auto"/>
-              <w:ind w:left="-108" w:firstLine="0"/>
-              <w:jc w:val="center"/>
+              <w:widowControl w:val="0"/>
+              <w:autoSpaceDE w:val="0"/>
+              <w:autoSpaceDN w:val="0"/>
+              <w:spacing w:before="120" w:after="120" w:line="276" w:lineRule="auto"/>
+              <w:ind w:left="0" w:firstLine="0"/>
+              <w:jc w:val="left"/>
+              <w:rPr>
+                <w:color w:val="auto"/>
+                <w:sz w:val="24"/>
+                <w:szCs w:val="24"/>
+                <w:lang w:eastAsia="en-US"/>
+              </w:rPr>
+            </w:pPr>
+            <w:r>
               <w:rPr>
                 <w:rFonts w:eastAsiaTheme="minorHAnsi" w:cstheme="minorBidi"/>
                 <w:color w:val="auto"/>
@@ -1802,16 +2030,321 @@
                 <w:szCs w:val="20"/>
                 <w:lang w:eastAsia="en-US"/>
               </w:rPr>
+              <w:t xml:space="preserve">Заметка, </w:t>
+            </w:r>
+            <w:r>
+              <w:rPr>
+                <w:rFonts w:eastAsiaTheme="minorHAnsi" w:cstheme="minorBidi"/>
+                <w:color w:val="auto"/>
+                <w:sz w:val="24"/>
+                <w:szCs w:val="20"/>
+                <w:lang w:eastAsia="en-US"/>
+              </w:rPr>
+              <w:t xml:space="preserve">соавтор, </w:t>
+            </w:r>
+            <w:r>
+              <w:rPr>
+                <w:rFonts w:eastAsiaTheme="minorHAnsi" w:cstheme="minorBidi"/>
+                <w:color w:val="auto"/>
+                <w:sz w:val="24"/>
+                <w:szCs w:val="20"/>
+                <w:lang w:eastAsia="en-US"/>
+              </w:rPr>
+              <w:t xml:space="preserve">тип </w:t>
+            </w:r>
+            <w:r>
+              <w:rPr>
+                <w:rFonts w:eastAsiaTheme="minorHAnsi" w:cstheme="minorBidi"/>
+                <w:color w:val="auto"/>
+                <w:sz w:val="24"/>
+                <w:szCs w:val="20"/>
+                <w:lang w:eastAsia="en-US"/>
+              </w:rPr>
+              <w:t>разрешени</w:t>
+            </w:r>
+            <w:r>
+              <w:rPr>
+                <w:rFonts w:eastAsiaTheme="minorHAnsi" w:cstheme="minorBidi"/>
+                <w:color w:val="auto"/>
+                <w:sz w:val="24"/>
+                <w:szCs w:val="20"/>
+                <w:lang w:eastAsia="en-US"/>
+              </w:rPr>
+              <w:t xml:space="preserve">я </w:t>
+            </w:r>
+            <w:r>
+              <w:rPr>
+                <w:color w:val="auto"/>
+                <w:sz w:val="24"/>
+                <w:szCs w:val="24"/>
+                <w:lang w:eastAsia="en-US"/>
+              </w:rPr>
+              <w:t>(«На просмотр», «На редактирование»)</w:t>
+            </w:r>
+          </w:p>
+        </w:tc>
+      </w:tr>
+    </w:tbl>
+    <w:p>
+      <w:pPr>
+        <w:pStyle w:val="a7"/>
+        <w:spacing w:line="360" w:lineRule="auto"/>
+        <w:jc w:val="both"/>
+        <w:rPr>
+          <w:rFonts w:ascii="Times New Roman" w:hAnsi="Times New Roman" w:cs="Times New Roman"/>
+          <w:sz w:val="28"/>
+          <w:szCs w:val="28"/>
+        </w:rPr>
+      </w:pPr>
+      <w:r>
+        <w:rPr>
+          <w:rFonts w:ascii="Times New Roman" w:hAnsi="Times New Roman" w:cs="Times New Roman"/>
+          <w:sz w:val="28"/>
+          <w:szCs w:val="28"/>
+        </w:rPr>
+        <w:lastRenderedPageBreak/>
+        <w:t>Продолжение т</w:t>
+      </w:r>
+      <w:r>
+        <w:rPr>
+          <w:rFonts w:ascii="Times New Roman" w:hAnsi="Times New Roman" w:cs="Times New Roman"/>
+          <w:sz w:val="28"/>
+          <w:szCs w:val="28"/>
+        </w:rPr>
+        <w:t>аблиц</w:t>
+      </w:r>
+      <w:r>
+        <w:rPr>
+          <w:rFonts w:ascii="Times New Roman" w:hAnsi="Times New Roman" w:cs="Times New Roman"/>
+          <w:sz w:val="28"/>
+          <w:szCs w:val="28"/>
+        </w:rPr>
+        <w:t>ы</w:t>
+      </w:r>
+      <w:r>
+        <w:rPr>
+          <w:rFonts w:ascii="Times New Roman" w:hAnsi="Times New Roman" w:cs="Times New Roman"/>
+          <w:sz w:val="28"/>
+          <w:szCs w:val="28"/>
+        </w:rPr>
+        <w:t xml:space="preserve"> 1</w:t>
+      </w:r>
+      <w:r>
+        <w:rPr>
+          <w:rFonts w:ascii="Times New Roman" w:hAnsi="Times New Roman" w:cs="Times New Roman"/>
+          <w:sz w:val="28"/>
+          <w:szCs w:val="28"/>
+        </w:rPr>
+        <w:t>.</w:t>
+      </w:r>
+    </w:p>
+    <w:tbl>
+      <w:tblPr>
+        <w:tblStyle w:val="af3"/>
+        <w:tblW w:w="9351" w:type="dxa"/>
+        <w:tblLook w:val="04A0" w:firstRow="1" w:lastRow="0" w:firstColumn="1" w:lastColumn="0" w:noHBand="0" w:noVBand="1"/>
+      </w:tblPr>
+      <w:tblGrid>
+        <w:gridCol w:w="2405"/>
+        <w:gridCol w:w="4253"/>
+        <w:gridCol w:w="2693"/>
+      </w:tblGrid>
+      <w:tr>
+        <w:tc>
+          <w:tcPr>
+            <w:tcW w:w="2405" w:type="dxa"/>
+          </w:tcPr>
+          <w:p>
+            <w:pPr>
+              <w:widowControl w:val="0"/>
+              <w:autoSpaceDE w:val="0"/>
+              <w:autoSpaceDN w:val="0"/>
+              <w:spacing w:before="120" w:after="120" w:line="276" w:lineRule="auto"/>
+              <w:ind w:left="0" w:firstLine="0"/>
+              <w:jc w:val="left"/>
+              <w:rPr>
+                <w:rFonts w:eastAsiaTheme="minorHAnsi" w:cstheme="minorBidi"/>
+                <w:color w:val="auto"/>
+                <w:sz w:val="24"/>
+                <w:szCs w:val="20"/>
+                <w:lang w:eastAsia="en-US"/>
+              </w:rPr>
             </w:pPr>
             <w:r>
               <w:rPr>
+                <w:color w:val="auto"/>
+                <w:sz w:val="24"/>
+                <w:szCs w:val="24"/>
+                <w:lang w:eastAsia="en-US"/>
+              </w:rPr>
+              <w:t>Заметка</w:t>
+            </w:r>
+          </w:p>
+        </w:tc>
+        <w:tc>
+          <w:tcPr>
+            <w:tcW w:w="4253" w:type="dxa"/>
+          </w:tcPr>
+          <w:p>
+            <w:pPr>
+              <w:widowControl w:val="0"/>
+              <w:autoSpaceDE w:val="0"/>
+              <w:autoSpaceDN w:val="0"/>
+              <w:spacing w:before="120" w:after="120" w:line="276" w:lineRule="auto"/>
+              <w:ind w:left="0" w:firstLine="0"/>
+              <w:jc w:val="left"/>
+              <w:rPr>
                 <w:rFonts w:eastAsiaTheme="minorHAnsi" w:cstheme="minorBidi"/>
+                <w:noProof/>
                 <w:color w:val="auto"/>
                 <w:sz w:val="24"/>
                 <w:szCs w:val="20"/>
                 <w:lang w:eastAsia="en-US"/>
               </w:rPr>
-              <w:t>–</w:t>
+            </w:pPr>
+            <w:r>
+              <w:rPr>
+                <w:noProof/>
+                <w:color w:val="auto"/>
+                <w:sz w:val="24"/>
+                <w:szCs w:val="24"/>
+                <w:lang w:eastAsia="en-US"/>
+              </w:rPr>
+              <w:t>О</w:t>
+            </w:r>
+            <w:r>
+              <w:rPr>
+                <w:noProof/>
+                <w:color w:val="auto"/>
+                <w:sz w:val="24"/>
+                <w:szCs w:val="24"/>
+                <w:lang w:eastAsia="en-US"/>
+              </w:rPr>
+              <w:t xml:space="preserve">сновной документ в системе, предназначенный для хранения и структурирования информации </w:t>
+            </w:r>
+            <w:r>
+              <w:rPr>
+                <w:noProof/>
+                <w:color w:val="auto"/>
+                <w:sz w:val="24"/>
+                <w:szCs w:val="24"/>
+                <w:lang w:eastAsia="en-US"/>
+              </w:rPr>
+              <w:t>(</w:t>
+            </w:r>
+            <w:r>
+              <w:rPr>
+                <w:noProof/>
+                <w:color w:val="auto"/>
+                <w:sz w:val="24"/>
+                <w:szCs w:val="24"/>
+                <w:lang w:eastAsia="en-US"/>
+              </w:rPr>
+              <w:t>преимущественно в текстовом формате</w:t>
+            </w:r>
+            <w:r>
+              <w:rPr>
+                <w:noProof/>
+                <w:color w:val="auto"/>
+                <w:sz w:val="24"/>
+                <w:szCs w:val="24"/>
+                <w:lang w:eastAsia="en-US"/>
+              </w:rPr>
+              <w:t>)</w:t>
+            </w:r>
+          </w:p>
+        </w:tc>
+        <w:tc>
+          <w:tcPr>
+            <w:tcW w:w="2693" w:type="dxa"/>
+          </w:tcPr>
+          <w:p>
+            <w:pPr>
+              <w:widowControl w:val="0"/>
+              <w:autoSpaceDE w:val="0"/>
+              <w:autoSpaceDN w:val="0"/>
+              <w:spacing w:before="120" w:after="120" w:line="276" w:lineRule="auto"/>
+              <w:ind w:left="0" w:firstLine="0"/>
+              <w:jc w:val="left"/>
+              <w:rPr>
+                <w:rFonts w:eastAsiaTheme="minorHAnsi" w:cstheme="minorBidi"/>
+                <w:color w:val="auto"/>
+                <w:sz w:val="24"/>
+                <w:szCs w:val="20"/>
+                <w:lang w:eastAsia="en-US"/>
+              </w:rPr>
+            </w:pPr>
+            <w:r>
+              <w:rPr>
+                <w:color w:val="auto"/>
+                <w:sz w:val="24"/>
+                <w:szCs w:val="24"/>
+                <w:lang w:eastAsia="en-US"/>
+              </w:rPr>
+              <w:t>Название,</w:t>
+            </w:r>
+            <w:r>
+              <w:rPr>
+                <w:color w:val="auto"/>
+                <w:sz w:val="24"/>
+                <w:szCs w:val="24"/>
+                <w:lang w:eastAsia="en-US"/>
+              </w:rPr>
+              <w:t xml:space="preserve"> </w:t>
+            </w:r>
+            <w:r>
+              <w:rPr>
+                <w:color w:val="auto"/>
+                <w:sz w:val="24"/>
+                <w:szCs w:val="24"/>
+                <w:lang w:eastAsia="en-US"/>
+              </w:rPr>
+              <w:t>шаблон,</w:t>
+            </w:r>
+            <w:r>
+              <w:rPr>
+                <w:color w:val="auto"/>
+                <w:sz w:val="24"/>
+                <w:szCs w:val="24"/>
+                <w:lang w:eastAsia="en-US"/>
+              </w:rPr>
+              <w:t xml:space="preserve"> контент, </w:t>
+            </w:r>
+            <w:r>
+              <w:rPr>
+                <w:color w:val="auto"/>
+                <w:sz w:val="24"/>
+                <w:szCs w:val="24"/>
+                <w:lang w:eastAsia="en-US"/>
+              </w:rPr>
+              <w:t>владелец</w:t>
+            </w:r>
+            <w:r>
+              <w:rPr>
+                <w:color w:val="auto"/>
+                <w:sz w:val="24"/>
+                <w:szCs w:val="24"/>
+                <w:lang w:eastAsia="en-US"/>
+              </w:rPr>
+              <w:t xml:space="preserve">, </w:t>
+            </w:r>
+            <w:r>
+              <w:rPr>
+                <w:color w:val="auto"/>
+                <w:sz w:val="24"/>
+                <w:szCs w:val="24"/>
+                <w:lang w:eastAsia="en-US"/>
+              </w:rPr>
+              <w:t>дата создания,</w:t>
+            </w:r>
+            <w:r>
+              <w:rPr>
+                <w:color w:val="auto"/>
+                <w:sz w:val="24"/>
+                <w:szCs w:val="24"/>
+                <w:lang w:eastAsia="en-US"/>
+              </w:rPr>
+              <w:t xml:space="preserve"> права доступа</w:t>
             </w:r>
           </w:p>
         </w:tc>
@@ -1819,7 +2352,145 @@
       <w:tr>
         <w:tc>
           <w:tcPr>
-            <w:tcW w:w="2232" w:type="dxa"/>
+            <w:tcW w:w="2405" w:type="dxa"/>
+          </w:tcPr>
+          <w:p>
+            <w:pPr>
+              <w:widowControl w:val="0"/>
+              <w:autoSpaceDE w:val="0"/>
+              <w:autoSpaceDN w:val="0"/>
+              <w:spacing w:before="120" w:after="120" w:line="276" w:lineRule="auto"/>
+              <w:ind w:left="0" w:firstLine="0"/>
+              <w:jc w:val="left"/>
+              <w:rPr>
+                <w:color w:val="auto"/>
+                <w:sz w:val="24"/>
+                <w:szCs w:val="24"/>
+                <w:lang w:eastAsia="en-US"/>
+              </w:rPr>
+            </w:pPr>
+            <w:r>
+              <w:rPr>
+                <w:color w:val="auto"/>
+                <w:sz w:val="24"/>
+                <w:szCs w:val="24"/>
+                <w:lang w:eastAsia="en-US"/>
+              </w:rPr>
+              <w:t>Директория</w:t>
+            </w:r>
+          </w:p>
+        </w:tc>
+        <w:tc>
+          <w:tcPr>
+            <w:tcW w:w="4253" w:type="dxa"/>
+          </w:tcPr>
+          <w:p>
+            <w:pPr>
+              <w:widowControl w:val="0"/>
+              <w:autoSpaceDE w:val="0"/>
+              <w:autoSpaceDN w:val="0"/>
+              <w:spacing w:before="120" w:after="120" w:line="276" w:lineRule="auto"/>
+              <w:ind w:left="0" w:firstLine="0"/>
+              <w:jc w:val="left"/>
+              <w:rPr>
+                <w:noProof/>
+                <w:color w:val="auto"/>
+                <w:sz w:val="24"/>
+                <w:szCs w:val="24"/>
+                <w:lang w:eastAsia="en-US"/>
+              </w:rPr>
+            </w:pPr>
+            <w:r>
+              <w:rPr>
+                <w:color w:val="auto"/>
+                <w:sz w:val="24"/>
+                <w:szCs w:val="24"/>
+                <w:lang w:eastAsia="en-US"/>
+              </w:rPr>
+              <w:t xml:space="preserve">Группа заметок, </w:t>
+            </w:r>
+            <w:r>
+              <w:rPr>
+                <w:color w:val="auto"/>
+                <w:sz w:val="24"/>
+                <w:szCs w:val="24"/>
+                <w:lang w:eastAsia="en-US"/>
+              </w:rPr>
+              <w:t>создаваем</w:t>
+            </w:r>
+            <w:r>
+              <w:rPr>
+                <w:color w:val="auto"/>
+                <w:sz w:val="24"/>
+                <w:szCs w:val="24"/>
+                <w:lang w:eastAsia="en-US"/>
+              </w:rPr>
+              <w:t>ая</w:t>
+            </w:r>
+            <w:r>
+              <w:rPr>
+                <w:color w:val="auto"/>
+                <w:sz w:val="24"/>
+                <w:szCs w:val="24"/>
+                <w:lang w:eastAsia="en-US"/>
+              </w:rPr>
+              <w:t xml:space="preserve"> пользователем с целью структурирования и эффективного управления большим количеством документов</w:t>
+            </w:r>
+          </w:p>
+        </w:tc>
+        <w:tc>
+          <w:tcPr>
+            <w:tcW w:w="2693" w:type="dxa"/>
+          </w:tcPr>
+          <w:p>
+            <w:pPr>
+              <w:widowControl w:val="0"/>
+              <w:autoSpaceDE w:val="0"/>
+              <w:autoSpaceDN w:val="0"/>
+              <w:spacing w:before="120" w:after="120" w:line="276" w:lineRule="auto"/>
+              <w:ind w:left="0" w:firstLine="0"/>
+              <w:jc w:val="left"/>
+              <w:rPr>
+                <w:color w:val="auto"/>
+                <w:sz w:val="24"/>
+                <w:szCs w:val="24"/>
+                <w:lang w:eastAsia="en-US"/>
+              </w:rPr>
+            </w:pPr>
+            <w:r>
+              <w:rPr>
+                <w:color w:val="auto"/>
+                <w:sz w:val="24"/>
+                <w:szCs w:val="24"/>
+                <w:lang w:eastAsia="en-US"/>
+              </w:rPr>
+              <w:t>Название, список заметок, дата создания</w:t>
+            </w:r>
+            <w:r>
+              <w:rPr>
+                <w:color w:val="auto"/>
+                <w:sz w:val="24"/>
+                <w:szCs w:val="24"/>
+                <w:lang w:eastAsia="en-US"/>
+              </w:rPr>
+              <w:t xml:space="preserve">, владелец, </w:t>
+            </w:r>
+            <w:r>
+              <w:rPr>
+                <w:color w:val="auto"/>
+                <w:sz w:val="24"/>
+                <w:szCs w:val="24"/>
+                <w:lang w:eastAsia="en-US"/>
+              </w:rPr>
+              <w:t>права доступа</w:t>
+            </w:r>
+          </w:p>
+        </w:tc>
+      </w:tr>
+      <w:tr>
+        <w:tc>
+          <w:tcPr>
+            <w:tcW w:w="2405" w:type="dxa"/>
           </w:tcPr>
           <w:p>
             <w:pPr>
@@ -1830,6 +2501,460 @@
               <w:ind w:left="0" w:firstLine="0"/>
               <w:jc w:val="left"/>
               <w:rPr>
+                <w:rFonts w:eastAsiaTheme="minorHAnsi" w:cstheme="minorBidi"/>
+                <w:color w:val="auto"/>
+                <w:sz w:val="24"/>
+                <w:szCs w:val="20"/>
+                <w:lang w:eastAsia="en-US"/>
+              </w:rPr>
+            </w:pPr>
+            <w:r>
+              <w:rPr>
+                <w:rFonts w:eastAsiaTheme="minorHAnsi" w:cstheme="minorBidi"/>
+                <w:color w:val="auto"/>
+                <w:sz w:val="24"/>
+                <w:szCs w:val="20"/>
+                <w:lang w:eastAsia="en-US"/>
+              </w:rPr>
+              <w:t>Шаблон</w:t>
+            </w:r>
+          </w:p>
+          <w:p>
+            <w:pPr>
+              <w:widowControl w:val="0"/>
+              <w:autoSpaceDE w:val="0"/>
+              <w:autoSpaceDN w:val="0"/>
+              <w:spacing w:before="120" w:after="120" w:line="276" w:lineRule="auto"/>
+              <w:ind w:left="0" w:firstLine="0"/>
+              <w:jc w:val="left"/>
+              <w:rPr>
+                <w:color w:val="auto"/>
+                <w:sz w:val="24"/>
+                <w:szCs w:val="24"/>
+                <w:lang w:eastAsia="en-US"/>
+              </w:rPr>
+            </w:pPr>
+            <w:r>
+              <w:rPr>
+                <w:color w:val="auto"/>
+                <w:sz w:val="24"/>
+                <w:szCs w:val="24"/>
+                <w:lang w:eastAsia="en-US"/>
+              </w:rPr>
+              <w:t>заметки</w:t>
+            </w:r>
+          </w:p>
+        </w:tc>
+        <w:tc>
+          <w:tcPr>
+            <w:tcW w:w="4253" w:type="dxa"/>
+          </w:tcPr>
+          <w:p>
+            <w:pPr>
+              <w:widowControl w:val="0"/>
+              <w:autoSpaceDE w:val="0"/>
+              <w:autoSpaceDN w:val="0"/>
+              <w:spacing w:before="120" w:after="120" w:line="276" w:lineRule="auto"/>
+              <w:ind w:left="0" w:firstLine="0"/>
+              <w:jc w:val="left"/>
+              <w:rPr>
+                <w:color w:val="auto"/>
+                <w:sz w:val="24"/>
+                <w:szCs w:val="24"/>
+                <w:lang w:eastAsia="en-US"/>
+              </w:rPr>
+            </w:pPr>
+            <w:r>
+              <w:rPr>
+                <w:color w:val="auto"/>
+                <w:sz w:val="24"/>
+                <w:szCs w:val="24"/>
+                <w:lang w:eastAsia="en-US"/>
+              </w:rPr>
+              <w:t>Готовый образец</w:t>
+            </w:r>
+            <w:r>
+              <w:rPr>
+                <w:color w:val="auto"/>
+                <w:sz w:val="24"/>
+                <w:szCs w:val="24"/>
+                <w:lang w:eastAsia="en-US"/>
+              </w:rPr>
+              <w:t xml:space="preserve"> заметки</w:t>
+            </w:r>
+            <w:r>
+              <w:rPr>
+                <w:color w:val="auto"/>
+                <w:sz w:val="24"/>
+                <w:szCs w:val="24"/>
+                <w:lang w:eastAsia="en-US"/>
+              </w:rPr>
+              <w:t xml:space="preserve">, </w:t>
+            </w:r>
+            <w:r>
+              <w:rPr>
+                <w:color w:val="auto"/>
+                <w:sz w:val="24"/>
+                <w:szCs w:val="24"/>
+                <w:lang w:eastAsia="en-US"/>
+              </w:rPr>
+              <w:t>позволя</w:t>
+            </w:r>
+            <w:r>
+              <w:rPr>
+                <w:color w:val="auto"/>
+                <w:sz w:val="24"/>
+                <w:szCs w:val="24"/>
+                <w:lang w:eastAsia="en-US"/>
+              </w:rPr>
+              <w:t xml:space="preserve">ющий </w:t>
+            </w:r>
+            <w:r>
+              <w:rPr>
+                <w:color w:val="auto"/>
+                <w:sz w:val="24"/>
+                <w:szCs w:val="24"/>
+                <w:lang w:eastAsia="en-US"/>
+              </w:rPr>
+              <w:t>быстро начать работу</w:t>
+            </w:r>
+          </w:p>
+        </w:tc>
+        <w:tc>
+          <w:tcPr>
+            <w:tcW w:w="2693" w:type="dxa"/>
+          </w:tcPr>
+          <w:p>
+            <w:pPr>
+              <w:widowControl w:val="0"/>
+              <w:autoSpaceDE w:val="0"/>
+              <w:autoSpaceDN w:val="0"/>
+              <w:spacing w:before="120" w:after="120" w:line="276" w:lineRule="auto"/>
+              <w:ind w:left="0" w:firstLine="0"/>
+              <w:jc w:val="left"/>
+              <w:rPr>
+                <w:color w:val="auto"/>
+                <w:sz w:val="24"/>
+                <w:szCs w:val="24"/>
+                <w:lang w:eastAsia="en-US"/>
+              </w:rPr>
+            </w:pPr>
+            <w:r>
+              <w:rPr>
+                <w:color w:val="auto"/>
+                <w:sz w:val="24"/>
+                <w:szCs w:val="24"/>
+                <w:lang w:eastAsia="en-US"/>
+              </w:rPr>
+              <w:t>Название (тип), структура</w:t>
+            </w:r>
+          </w:p>
+        </w:tc>
+      </w:tr>
+      <w:tr>
+        <w:tc>
+          <w:tcPr>
+            <w:tcW w:w="2405" w:type="dxa"/>
+          </w:tcPr>
+          <w:p>
+            <w:pPr>
+              <w:widowControl w:val="0"/>
+              <w:autoSpaceDE w:val="0"/>
+              <w:autoSpaceDN w:val="0"/>
+              <w:spacing w:before="120" w:after="120" w:line="276" w:lineRule="auto"/>
+              <w:ind w:left="0" w:firstLine="0"/>
+              <w:jc w:val="left"/>
+              <w:rPr>
+                <w:rFonts w:eastAsiaTheme="minorHAnsi" w:cstheme="minorBidi"/>
+                <w:color w:val="auto"/>
+                <w:sz w:val="24"/>
+                <w:szCs w:val="20"/>
+                <w:lang w:eastAsia="en-US"/>
+              </w:rPr>
+            </w:pPr>
+            <w:proofErr w:type="spellStart"/>
+            <w:r>
+              <w:rPr>
+                <w:rFonts w:eastAsiaTheme="minorHAnsi" w:cstheme="minorBidi"/>
+                <w:color w:val="auto"/>
+                <w:sz w:val="24"/>
+                <w:szCs w:val="20"/>
+                <w:lang w:eastAsia="en-US"/>
+              </w:rPr>
+              <w:t>Канбан</w:t>
+            </w:r>
+            <w:proofErr w:type="spellEnd"/>
+            <w:r>
+              <w:rPr>
+                <w:rFonts w:eastAsiaTheme="minorHAnsi" w:cstheme="minorBidi"/>
+                <w:color w:val="auto"/>
+                <w:sz w:val="24"/>
+                <w:szCs w:val="20"/>
+                <w:lang w:eastAsia="en-US"/>
+              </w:rPr>
+              <w:t>-доска</w:t>
+            </w:r>
+          </w:p>
+        </w:tc>
+        <w:tc>
+          <w:tcPr>
+            <w:tcW w:w="4253" w:type="dxa"/>
+          </w:tcPr>
+          <w:p>
+            <w:pPr>
+              <w:widowControl w:val="0"/>
+              <w:autoSpaceDE w:val="0"/>
+              <w:autoSpaceDN w:val="0"/>
+              <w:spacing w:before="120" w:after="120" w:line="276" w:lineRule="auto"/>
+              <w:ind w:left="0" w:firstLine="0"/>
+              <w:jc w:val="left"/>
+              <w:rPr>
+                <w:color w:val="auto"/>
+                <w:sz w:val="24"/>
+                <w:szCs w:val="24"/>
+                <w:lang w:eastAsia="en-US"/>
+              </w:rPr>
+            </w:pPr>
+            <w:r>
+              <w:rPr>
+                <w:color w:val="auto"/>
+                <w:sz w:val="24"/>
+                <w:szCs w:val="24"/>
+                <w:lang w:eastAsia="en-US"/>
+              </w:rPr>
+              <w:t>Шаблон заметки для наглядного управления задачами</w:t>
+            </w:r>
+            <w:r>
+              <w:rPr>
+                <w:color w:val="auto"/>
+                <w:sz w:val="24"/>
+                <w:szCs w:val="24"/>
+                <w:lang w:eastAsia="en-US"/>
+              </w:rPr>
+              <w:t xml:space="preserve">, где </w:t>
+            </w:r>
+            <w:r>
+              <w:rPr>
+                <w:color w:val="auto"/>
+                <w:sz w:val="24"/>
+                <w:szCs w:val="24"/>
+                <w:lang w:eastAsia="en-US"/>
+              </w:rPr>
+              <w:t>они</w:t>
+            </w:r>
+            <w:r>
+              <w:rPr>
+                <w:color w:val="auto"/>
+                <w:sz w:val="24"/>
+                <w:szCs w:val="24"/>
+                <w:lang w:eastAsia="en-US"/>
+              </w:rPr>
+              <w:t xml:space="preserve"> представлены в виде карточек, а этапы работы - в виде столбцов</w:t>
+            </w:r>
+          </w:p>
+        </w:tc>
+        <w:tc>
+          <w:tcPr>
+            <w:tcW w:w="2693" w:type="dxa"/>
+          </w:tcPr>
+          <w:p>
+            <w:pPr>
+              <w:widowControl w:val="0"/>
+              <w:autoSpaceDE w:val="0"/>
+              <w:autoSpaceDN w:val="0"/>
+              <w:spacing w:before="120" w:after="120" w:line="276" w:lineRule="auto"/>
+              <w:ind w:left="0" w:firstLine="0"/>
+              <w:jc w:val="left"/>
+              <w:rPr>
+                <w:rFonts w:eastAsiaTheme="minorHAnsi" w:cstheme="minorBidi"/>
+                <w:color w:val="auto"/>
+                <w:sz w:val="24"/>
+                <w:szCs w:val="20"/>
+                <w:lang w:eastAsia="en-US"/>
+              </w:rPr>
+            </w:pPr>
+            <w:r>
+              <w:rPr>
+                <w:color w:val="auto"/>
+                <w:sz w:val="24"/>
+                <w:szCs w:val="24"/>
+                <w:lang w:eastAsia="en-US"/>
+              </w:rPr>
+              <w:t>Список столбцов, список задач</w:t>
+            </w:r>
+          </w:p>
+        </w:tc>
+      </w:tr>
+      <w:tr>
+        <w:tc>
+          <w:tcPr>
+            <w:tcW w:w="2405" w:type="dxa"/>
+          </w:tcPr>
+          <w:p>
+            <w:pPr>
+              <w:widowControl w:val="0"/>
+              <w:autoSpaceDE w:val="0"/>
+              <w:autoSpaceDN w:val="0"/>
+              <w:spacing w:before="120" w:after="120" w:line="276" w:lineRule="auto"/>
+              <w:ind w:left="0" w:firstLine="0"/>
+              <w:jc w:val="left"/>
+              <w:rPr>
+                <w:rFonts w:eastAsiaTheme="minorHAnsi" w:cstheme="minorBidi"/>
+                <w:color w:val="auto"/>
+                <w:sz w:val="24"/>
+                <w:szCs w:val="20"/>
+                <w:lang w:eastAsia="en-US"/>
+              </w:rPr>
+            </w:pPr>
+            <w:r>
+              <w:rPr>
+                <w:color w:val="auto"/>
+                <w:sz w:val="24"/>
+                <w:szCs w:val="24"/>
+                <w:lang w:eastAsia="en-US"/>
+              </w:rPr>
+              <w:t>Календарь</w:t>
+            </w:r>
+          </w:p>
+        </w:tc>
+        <w:tc>
+          <w:tcPr>
+            <w:tcW w:w="4253" w:type="dxa"/>
+          </w:tcPr>
+          <w:p>
+            <w:pPr>
+              <w:widowControl w:val="0"/>
+              <w:autoSpaceDE w:val="0"/>
+              <w:autoSpaceDN w:val="0"/>
+              <w:spacing w:before="120" w:after="120" w:line="276" w:lineRule="auto"/>
+              <w:ind w:left="0" w:firstLine="0"/>
+              <w:jc w:val="left"/>
+              <w:rPr>
+                <w:color w:val="auto"/>
+                <w:sz w:val="24"/>
+                <w:szCs w:val="24"/>
+                <w:lang w:eastAsia="en-US"/>
+              </w:rPr>
+            </w:pPr>
+            <w:r>
+              <w:rPr>
+                <w:color w:val="auto"/>
+                <w:sz w:val="24"/>
+                <w:szCs w:val="24"/>
+                <w:lang w:eastAsia="en-US"/>
+              </w:rPr>
+              <w:t xml:space="preserve">Шаблон заметки </w:t>
+            </w:r>
+            <w:r>
+              <w:rPr>
+                <w:color w:val="auto"/>
+                <w:sz w:val="24"/>
+                <w:szCs w:val="24"/>
+                <w:lang w:eastAsia="en-US"/>
+              </w:rPr>
+              <w:t>для организации рабочего графика</w:t>
+            </w:r>
+            <w:r>
+              <w:rPr>
+                <w:color w:val="auto"/>
+                <w:sz w:val="24"/>
+                <w:szCs w:val="24"/>
+                <w:lang w:eastAsia="en-US"/>
+              </w:rPr>
+              <w:t xml:space="preserve">, </w:t>
+            </w:r>
+            <w:r>
+              <w:rPr>
+                <w:color w:val="auto"/>
+                <w:sz w:val="24"/>
+                <w:szCs w:val="24"/>
+                <w:lang w:eastAsia="en-US"/>
+              </w:rPr>
+              <w:t>позволяющий соотнести задачи со сроками их выполнения и связанны</w:t>
+            </w:r>
+            <w:r>
+              <w:rPr>
+                <w:color w:val="auto"/>
+                <w:sz w:val="24"/>
+                <w:szCs w:val="24"/>
+                <w:lang w:eastAsia="en-US"/>
+              </w:rPr>
+              <w:t>ми</w:t>
+            </w:r>
+            <w:r>
+              <w:rPr>
+                <w:color w:val="auto"/>
+                <w:sz w:val="24"/>
+                <w:szCs w:val="24"/>
+                <w:lang w:eastAsia="en-US"/>
+              </w:rPr>
+              <w:t xml:space="preserve"> материал</w:t>
+            </w:r>
+            <w:r>
+              <w:rPr>
+                <w:color w:val="auto"/>
+                <w:sz w:val="24"/>
+                <w:szCs w:val="24"/>
+                <w:lang w:eastAsia="en-US"/>
+              </w:rPr>
+              <w:t>ами</w:t>
+            </w:r>
+            <w:r>
+              <w:rPr>
+                <w:color w:val="auto"/>
+                <w:sz w:val="24"/>
+                <w:szCs w:val="24"/>
+                <w:lang w:eastAsia="en-US"/>
+              </w:rPr>
+              <w:t xml:space="preserve"> (другими заметками)</w:t>
+            </w:r>
+          </w:p>
+        </w:tc>
+        <w:tc>
+          <w:tcPr>
+            <w:tcW w:w="2693" w:type="dxa"/>
+          </w:tcPr>
+          <w:p>
+            <w:pPr>
+              <w:widowControl w:val="0"/>
+              <w:autoSpaceDE w:val="0"/>
+              <w:autoSpaceDN w:val="0"/>
+              <w:spacing w:before="120" w:after="120" w:line="276" w:lineRule="auto"/>
+              <w:ind w:left="0" w:firstLine="0"/>
+              <w:jc w:val="left"/>
+              <w:rPr>
+                <w:color w:val="auto"/>
+                <w:sz w:val="24"/>
+                <w:szCs w:val="24"/>
+                <w:lang w:eastAsia="en-US"/>
+              </w:rPr>
+            </w:pPr>
+            <w:r>
+              <w:rPr>
+                <w:color w:val="auto"/>
+                <w:sz w:val="24"/>
+                <w:szCs w:val="24"/>
+                <w:lang w:eastAsia="en-US"/>
+              </w:rPr>
+              <w:t>Список событий, список заметок</w:t>
+            </w:r>
+          </w:p>
+        </w:tc>
+      </w:tr>
+      <w:tr>
+        <w:tc>
+          <w:tcPr>
+            <w:tcW w:w="2405" w:type="dxa"/>
+          </w:tcPr>
+          <w:p>
+            <w:pPr>
+              <w:widowControl w:val="0"/>
+              <w:autoSpaceDE w:val="0"/>
+              <w:autoSpaceDN w:val="0"/>
+              <w:spacing w:before="120" w:after="120"/>
+              <w:ind w:left="0" w:firstLine="0"/>
+              <w:jc w:val="left"/>
+              <w:rPr>
                 <w:color w:val="auto"/>
                 <w:sz w:val="24"/>
                 <w:szCs w:val="24"/>
@@ -1876,7 +3001,7 @@
         </w:tc>
         <w:tc>
           <w:tcPr>
-            <w:tcW w:w="2441" w:type="dxa"/>
+            <w:tcW w:w="4253" w:type="dxa"/>
           </w:tcPr>
           <w:p>
             <w:pPr>
@@ -1885,7 +3010,7 @@
               <w:autoSpaceDN w:val="0"/>
               <w:spacing w:before="120" w:after="120" w:line="276" w:lineRule="auto"/>
               <w:ind w:left="0" w:firstLine="0"/>
-              <w:jc w:val="center"/>
+              <w:jc w:val="left"/>
               <w:rPr>
                 <w:color w:val="auto"/>
                 <w:sz w:val="24"/>
@@ -1900,13 +3025,31 @@
                 <w:szCs w:val="24"/>
                 <w:lang w:eastAsia="en-US"/>
               </w:rPr>
-              <w:t>Механизм системы, предназначенный для редактирования текстовой и мультимедиа информации заметок</w:t>
+              <w:t>И</w:t>
+            </w:r>
+            <w:r>
+              <w:rPr>
+                <w:color w:val="auto"/>
+                <w:sz w:val="24"/>
+                <w:szCs w:val="24"/>
+                <w:lang w:eastAsia="en-US"/>
+              </w:rPr>
+              <w:t>нструмент в системе</w:t>
+            </w:r>
+            <w:r>
+              <w:rPr>
+                <w:color w:val="auto"/>
+                <w:sz w:val="24"/>
+                <w:szCs w:val="24"/>
+                <w:lang w:eastAsia="en-US"/>
+              </w:rPr>
+              <w:t>, позволяющий пользователю создавать и редактировать заметки</w:t>
             </w:r>
           </w:p>
         </w:tc>
         <w:tc>
           <w:tcPr>
-            <w:tcW w:w="2365" w:type="dxa"/>
+            <w:tcW w:w="2693" w:type="dxa"/>
             <w:vAlign w:val="center"/>
           </w:tcPr>
           <w:p>
@@ -1933,67 +3076,11 @@
             </w:r>
           </w:p>
         </w:tc>
-        <w:tc>
-          <w:tcPr>
-            <w:tcW w:w="2367" w:type="dxa"/>
-          </w:tcPr>
-          <w:p>
-            <w:pPr>
-              <w:widowControl w:val="0"/>
-              <w:autoSpaceDE w:val="0"/>
-              <w:autoSpaceDN w:val="0"/>
-              <w:spacing w:before="120" w:after="120"/>
-              <w:ind w:left="0" w:firstLine="0"/>
-              <w:jc w:val="center"/>
-              <w:rPr>
-                <w:color w:val="auto"/>
-                <w:sz w:val="24"/>
-                <w:szCs w:val="24"/>
-                <w:lang w:eastAsia="en-US"/>
-              </w:rPr>
-            </w:pPr>
-            <w:r>
-              <w:rPr>
-                <w:color w:val="auto"/>
-                <w:sz w:val="24"/>
-                <w:szCs w:val="24"/>
-                <w:lang w:eastAsia="en-US"/>
-              </w:rPr>
-              <w:t>Редактирование</w:t>
-            </w:r>
-          </w:p>
-          <w:p>
-            <w:pPr>
-              <w:widowControl w:val="0"/>
-              <w:autoSpaceDE w:val="0"/>
-              <w:autoSpaceDN w:val="0"/>
-              <w:spacing w:before="120" w:after="120"/>
-              <w:ind w:left="0" w:firstLine="0"/>
-              <w:jc w:val="center"/>
-              <w:rPr>
-                <w:rFonts w:eastAsiaTheme="minorHAnsi" w:cstheme="minorBidi"/>
-                <w:color w:val="auto"/>
-                <w:sz w:val="24"/>
-                <w:szCs w:val="20"/>
-                <w:lang w:eastAsia="en-US"/>
-              </w:rPr>
-            </w:pPr>
-            <w:r>
-              <w:rPr>
-                <w:color w:val="auto"/>
-                <w:sz w:val="24"/>
-                <w:szCs w:val="24"/>
-                <w:lang w:eastAsia="en-US"/>
-              </w:rPr>
-              <w:t>заметки</w:t>
-            </w:r>
-          </w:p>
-        </w:tc>
       </w:tr>
       <w:tr>
         <w:tc>
           <w:tcPr>
-            <w:tcW w:w="2232" w:type="dxa"/>
+            <w:tcW w:w="2405" w:type="dxa"/>
           </w:tcPr>
           <w:p>
             <w:pPr>
@@ -2019,7 +3106,17 @@
                 <w:szCs w:val="20"/>
                 <w:lang w:eastAsia="en-US"/>
               </w:rPr>
-              <w:t>Файловая</w:t>
+              <w:t>М</w:t>
+            </w:r>
+            <w:r>
+              <w:rPr>
+                <w:rFonts w:eastAsiaTheme="minorHAnsi" w:cstheme="minorBidi"/>
+                <w:color w:val="auto"/>
+                <w:sz w:val="24"/>
+                <w:szCs w:val="20"/>
+                <w:lang w:eastAsia="en-US"/>
+              </w:rPr>
+              <w:t>одуль</w:t>
             </w:r>
           </w:p>
           <w:p>
@@ -2045,13 +3142,13 @@
                 <w:szCs w:val="24"/>
                 <w:lang w:eastAsia="en-US"/>
               </w:rPr>
-              <w:t>система</w:t>
+              <w:t>интерфейса</w:t>
             </w:r>
           </w:p>
         </w:tc>
         <w:tc>
           <w:tcPr>
-            <w:tcW w:w="2441" w:type="dxa"/>
+            <w:tcW w:w="4253" w:type="dxa"/>
           </w:tcPr>
           <w:p>
             <w:pPr>
@@ -2060,7 +3157,7 @@
               <w:autoSpaceDN w:val="0"/>
               <w:spacing w:before="120" w:after="120" w:line="276" w:lineRule="auto"/>
               <w:ind w:left="0" w:firstLine="0"/>
-              <w:jc w:val="center"/>
+              <w:jc w:val="left"/>
               <w:rPr>
                 <w:color w:val="auto"/>
                 <w:sz w:val="24"/>
@@ -2075,60 +3172,58 @@
                 <w:szCs w:val="24"/>
                 <w:lang w:eastAsia="en-US"/>
               </w:rPr>
-              <w:t xml:space="preserve">Механизм системы, способствующий организации хранения </w:t>
-            </w:r>
-            <w:r>
-              <w:rPr>
-                <w:color w:val="auto"/>
-                <w:sz w:val="24"/>
-                <w:szCs w:val="24"/>
-                <w:lang w:eastAsia="en-US"/>
-              </w:rPr>
-              <w:t>заметок</w:t>
-            </w:r>
-            <w:r>
-              <w:rPr>
-                <w:color w:val="auto"/>
-                <w:sz w:val="24"/>
-                <w:szCs w:val="24"/>
-                <w:lang w:eastAsia="en-US"/>
-              </w:rPr>
-              <w:t xml:space="preserve"> и их типов</w:t>
+              <w:t xml:space="preserve">Самостоятельная часть системы, </w:t>
+            </w:r>
+            <w:r>
+              <w:rPr>
+                <w:color w:val="auto"/>
+                <w:sz w:val="24"/>
+                <w:szCs w:val="24"/>
+                <w:lang w:eastAsia="en-US"/>
+              </w:rPr>
+              <w:t>котор</w:t>
+            </w:r>
+            <w:r>
+              <w:rPr>
+                <w:color w:val="auto"/>
+                <w:sz w:val="24"/>
+                <w:szCs w:val="24"/>
+                <w:lang w:eastAsia="en-US"/>
+              </w:rPr>
+              <w:t>ую</w:t>
+            </w:r>
+            <w:r>
+              <w:rPr>
+                <w:color w:val="auto"/>
+                <w:sz w:val="24"/>
+                <w:szCs w:val="24"/>
+                <w:lang w:eastAsia="en-US"/>
+              </w:rPr>
+              <w:t xml:space="preserve"> пользователь может скрыть или отобразить в настройках в зависимости от своих </w:t>
+            </w:r>
+            <w:r>
+              <w:rPr>
+                <w:color w:val="auto"/>
+                <w:sz w:val="24"/>
+                <w:szCs w:val="24"/>
+                <w:lang w:eastAsia="en-US"/>
+              </w:rPr>
+              <w:t>нужд</w:t>
+            </w:r>
+            <w:r>
+              <w:rPr>
+                <w:color w:val="auto"/>
+                <w:sz w:val="24"/>
+                <w:szCs w:val="24"/>
+                <w:lang w:eastAsia="en-US"/>
+              </w:rPr>
+              <w:t xml:space="preserve"> и предпочтений</w:t>
             </w:r>
           </w:p>
         </w:tc>
         <w:tc>
           <w:tcPr>
-            <w:tcW w:w="2365" w:type="dxa"/>
-            <w:vAlign w:val="center"/>
-          </w:tcPr>
-          <w:p>
-            <w:pPr>
-              <w:spacing w:before="120" w:after="120" w:line="360" w:lineRule="auto"/>
-              <w:ind w:left="-108" w:firstLine="0"/>
-              <w:jc w:val="center"/>
-              <w:rPr>
-                <w:color w:val="auto"/>
-                <w:sz w:val="24"/>
-                <w:szCs w:val="24"/>
-                <w:lang w:eastAsia="en-US"/>
-              </w:rPr>
-            </w:pPr>
-            <w:r>
-              <w:rPr>
-                <w:rFonts w:eastAsiaTheme="minorHAnsi" w:cstheme="minorBidi"/>
-                <w:color w:val="auto"/>
-                <w:sz w:val="24"/>
-                <w:szCs w:val="20"/>
-                <w:lang w:eastAsia="en-US"/>
-              </w:rPr>
-              <w:t>–</w:t>
-            </w:r>
-          </w:p>
-        </w:tc>
-        <w:tc>
-          <w:tcPr>
-            <w:tcW w:w="2367" w:type="dxa"/>
+            <w:tcW w:w="2693" w:type="dxa"/>
           </w:tcPr>
           <w:p>
             <w:pPr>
@@ -2137,47 +3232,25 @@
               <w:autoSpaceDN w:val="0"/>
               <w:spacing w:before="120" w:after="120" w:line="276" w:lineRule="auto"/>
               <w:ind w:left="0" w:firstLine="0"/>
-              <w:jc w:val="center"/>
-              <w:rPr>
-                <w:color w:val="auto"/>
-                <w:sz w:val="24"/>
-                <w:szCs w:val="24"/>
+              <w:jc w:val="left"/>
+              <w:rPr>
+                <w:rFonts w:eastAsiaTheme="minorHAnsi" w:cstheme="minorBidi"/>
+                <w:color w:val="auto"/>
+                <w:sz w:val="24"/>
+                <w:szCs w:val="20"/>
                 <w:lang w:eastAsia="en-US"/>
               </w:rPr>
             </w:pPr>
             <w:r>
               <w:rPr>
-                <w:color w:val="auto"/>
-                <w:sz w:val="24"/>
-                <w:szCs w:val="24"/>
-                <w:lang w:eastAsia="en-US"/>
-              </w:rPr>
-              <w:t>Просмотр всех заметок пользователя, создание заметки, удаление заметки, изменение названия заметки, перемещение заметки, создание директории, удаление директории, изменение названия директории</w:t>
-            </w:r>
-          </w:p>
-        </w:tc>
-      </w:tr>
-      <w:tr>
-        <w:tc>
-          <w:tcPr>
-            <w:tcW w:w="2232" w:type="dxa"/>
-          </w:tcPr>
-          <w:p>
-            <w:pPr>
-              <w:widowControl w:val="0"/>
-              <w:autoSpaceDE w:val="0"/>
-              <w:autoSpaceDN w:val="0"/>
-              <w:spacing w:before="120" w:after="120"/>
-              <w:ind w:left="0" w:firstLine="0"/>
-              <w:jc w:val="left"/>
-              <w:rPr>
                 <w:rFonts w:eastAsiaTheme="minorHAnsi" w:cstheme="minorBidi"/>
                 <w:color w:val="auto"/>
                 <w:sz w:val="24"/>
                 <w:szCs w:val="20"/>
                 <w:lang w:eastAsia="en-US"/>
               </w:rPr>
-            </w:pPr>
+              <w:t>Название</w:t>
+            </w:r>
             <w:r>
               <w:rPr>
                 <w:rFonts w:eastAsiaTheme="minorHAnsi" w:cstheme="minorBidi"/>
@@ -2186,17 +3259,9 @@
                 <w:szCs w:val="20"/>
                 <w:lang w:eastAsia="en-US"/>
               </w:rPr>
-              <w:t>Шаблон</w:t>
-            </w:r>
-          </w:p>
-          <w:p>
-            <w:pPr>
-              <w:widowControl w:val="0"/>
-              <w:autoSpaceDE w:val="0"/>
-              <w:autoSpaceDN w:val="0"/>
-              <w:spacing w:before="120" w:after="120"/>
-              <w:ind w:left="0" w:firstLine="0"/>
-              <w:jc w:val="left"/>
+              <w:t>, с</w:t>
+            </w:r>
+            <w:r>
               <w:rPr>
                 <w:rFonts w:eastAsiaTheme="minorHAnsi" w:cstheme="minorBidi"/>
                 <w:color w:val="auto"/>
@@ -2204,85 +3269,9 @@
                 <w:szCs w:val="20"/>
                 <w:lang w:eastAsia="en-US"/>
               </w:rPr>
-            </w:pPr>
-            <w:r>
-              <w:rPr>
-                <w:color w:val="auto"/>
-                <w:sz w:val="24"/>
-                <w:szCs w:val="24"/>
-                <w:lang w:eastAsia="en-US"/>
-              </w:rPr>
-              <w:t>заметки</w:t>
-            </w:r>
-          </w:p>
-        </w:tc>
-        <w:tc>
-          <w:tcPr>
-            <w:tcW w:w="2441" w:type="dxa"/>
-          </w:tcPr>
-          <w:p>
-            <w:pPr>
-              <w:widowControl w:val="0"/>
-              <w:autoSpaceDE w:val="0"/>
-              <w:autoSpaceDN w:val="0"/>
-              <w:spacing w:before="120" w:after="120" w:line="276" w:lineRule="auto"/>
-              <w:ind w:left="0" w:firstLine="0"/>
-              <w:jc w:val="center"/>
-              <w:rPr>
-                <w:color w:val="auto"/>
-                <w:sz w:val="24"/>
-                <w:szCs w:val="24"/>
-                <w:lang w:eastAsia="en-US"/>
-              </w:rPr>
-            </w:pPr>
-            <w:r>
-              <w:rPr>
-                <w:color w:val="auto"/>
-                <w:sz w:val="24"/>
-                <w:szCs w:val="24"/>
-                <w:lang w:eastAsia="en-US"/>
-              </w:rPr>
-              <w:t>Готовый образец</w:t>
-            </w:r>
-            <w:r>
-              <w:rPr>
-                <w:color w:val="auto"/>
-                <w:sz w:val="24"/>
-                <w:szCs w:val="24"/>
-                <w:lang w:eastAsia="en-US"/>
-              </w:rPr>
-              <w:t xml:space="preserve">, задающий начальную структуру </w:t>
-            </w:r>
-            <w:r>
-              <w:rPr>
-                <w:color w:val="auto"/>
-                <w:sz w:val="24"/>
-                <w:szCs w:val="24"/>
-                <w:lang w:eastAsia="en-US"/>
-              </w:rPr>
-              <w:t>замет</w:t>
-            </w:r>
-            <w:r>
-              <w:rPr>
-                <w:color w:val="auto"/>
-                <w:sz w:val="24"/>
-                <w:szCs w:val="24"/>
-                <w:lang w:eastAsia="en-US"/>
-              </w:rPr>
-              <w:t>ки</w:t>
-            </w:r>
-          </w:p>
-        </w:tc>
-        <w:tc>
-          <w:tcPr>
-            <w:tcW w:w="2365" w:type="dxa"/>
-            <w:vAlign w:val="center"/>
-          </w:tcPr>
-          <w:p>
-            <w:pPr>
-              <w:spacing w:before="120" w:after="120" w:line="360" w:lineRule="auto"/>
-              <w:ind w:left="-108" w:firstLine="0"/>
-              <w:jc w:val="center"/>
+              <w:t>татус</w:t>
+            </w:r>
+            <w:r>
               <w:rPr>
                 <w:rFonts w:eastAsiaTheme="minorHAnsi" w:cstheme="minorBidi"/>
                 <w:color w:val="auto"/>
@@ -2290,45 +3279,7 @@
                 <w:szCs w:val="20"/>
                 <w:lang w:eastAsia="en-US"/>
               </w:rPr>
-            </w:pPr>
-            <w:r>
-              <w:rPr>
-                <w:rFonts w:eastAsiaTheme="minorHAnsi" w:cstheme="minorBidi"/>
-                <w:color w:val="auto"/>
-                <w:sz w:val="24"/>
-                <w:szCs w:val="20"/>
-                <w:lang w:eastAsia="en-US"/>
-              </w:rPr>
-              <w:t>–</w:t>
-            </w:r>
-          </w:p>
-        </w:tc>
-        <w:tc>
-          <w:tcPr>
-            <w:tcW w:w="2367" w:type="dxa"/>
-            <w:vAlign w:val="center"/>
-          </w:tcPr>
-          <w:p>
-            <w:pPr>
-              <w:spacing w:before="120" w:after="120" w:line="360" w:lineRule="auto"/>
-              <w:ind w:left="-108" w:firstLine="0"/>
-              <w:jc w:val="center"/>
-              <w:rPr>
-                <w:color w:val="auto"/>
-                <w:sz w:val="24"/>
-                <w:szCs w:val="24"/>
-                <w:lang w:eastAsia="en-US"/>
-              </w:rPr>
-            </w:pPr>
-            <w:r>
-              <w:rPr>
-                <w:rFonts w:eastAsiaTheme="minorHAnsi" w:cstheme="minorBidi"/>
-                <w:color w:val="auto"/>
-                <w:sz w:val="24"/>
-                <w:szCs w:val="20"/>
-                <w:lang w:eastAsia="en-US"/>
-              </w:rPr>
-              <w:t>–</w:t>
+              <w:t xml:space="preserve"> («включен» или «выключен»)</w:t>
             </w:r>
           </w:p>
         </w:tc>
@@ -2340,17 +3291,11 @@
         <w:ind w:left="0" w:firstLine="0"/>
         <w:jc w:val="left"/>
         <w:rPr>
-          <w:sz w:val="24"/>
-          <w:szCs w:val="24"/>
-        </w:rPr>
-      </w:pPr>
-      <w:r>
-        <w:rPr>
-          <w:sz w:val="24"/>
-          <w:szCs w:val="24"/>
-        </w:rPr>
-        <w:br w:type="page"/>
-      </w:r>
+          <w:caps/>
+          <w:sz w:val="28"/>
+          <w:szCs w:val="28"/>
+        </w:rPr>
+      </w:pPr>
     </w:p>
     <w:p>
       <w:pPr>
@@ -2358,511 +3303,18 @@
         <w:ind w:left="0" w:firstLine="0"/>
         <w:jc w:val="left"/>
         <w:rPr>
-          <w:caps/>
-          <w:sz w:val="28"/>
-          <w:szCs w:val="28"/>
-        </w:rPr>
-      </w:pPr>
-      <w:r>
-        <w:rPr>
-          <w:sz w:val="28"/>
-          <w:szCs w:val="28"/>
-        </w:rPr>
-        <w:lastRenderedPageBreak/>
-        <w:t>Продолжение таблицы 1.</w:t>
-      </w:r>
-    </w:p>
-    <w:tbl>
-      <w:tblPr>
-        <w:tblStyle w:val="af3"/>
-        <w:tblW w:w="0" w:type="auto"/>
-        <w:tblLook w:val="04A0" w:firstRow="1" w:lastRow="0" w:firstColumn="1" w:lastColumn="0" w:noHBand="0" w:noVBand="1"/>
-      </w:tblPr>
-      <w:tblGrid>
-        <w:gridCol w:w="2232"/>
-        <w:gridCol w:w="2381"/>
-        <w:gridCol w:w="2366"/>
-        <w:gridCol w:w="2366"/>
-      </w:tblGrid>
-      <w:tr>
-        <w:tc>
-          <w:tcPr>
-            <w:tcW w:w="2232" w:type="dxa"/>
-          </w:tcPr>
-          <w:p>
-            <w:pPr>
-              <w:widowControl w:val="0"/>
-              <w:autoSpaceDE w:val="0"/>
-              <w:autoSpaceDN w:val="0"/>
-              <w:spacing w:before="120" w:after="120"/>
-              <w:ind w:left="0" w:firstLine="0"/>
-              <w:jc w:val="left"/>
-              <w:rPr>
-                <w:rFonts w:eastAsiaTheme="minorHAnsi" w:cstheme="minorBidi"/>
-                <w:color w:val="auto"/>
-                <w:sz w:val="24"/>
-                <w:szCs w:val="20"/>
-                <w:lang w:eastAsia="en-US"/>
-              </w:rPr>
-            </w:pPr>
-            <w:r>
-              <w:rPr>
-                <w:rFonts w:eastAsiaTheme="minorHAnsi" w:cstheme="minorBidi"/>
-                <w:color w:val="auto"/>
-                <w:sz w:val="24"/>
-                <w:szCs w:val="20"/>
-                <w:lang w:eastAsia="en-US"/>
-              </w:rPr>
-              <w:t>Права</w:t>
-            </w:r>
-          </w:p>
-          <w:p>
-            <w:pPr>
-              <w:widowControl w:val="0"/>
-              <w:autoSpaceDE w:val="0"/>
-              <w:autoSpaceDN w:val="0"/>
-              <w:spacing w:before="120" w:after="120"/>
-              <w:ind w:left="0" w:firstLine="0"/>
-              <w:jc w:val="left"/>
-              <w:rPr>
-                <w:rFonts w:eastAsiaTheme="minorHAnsi" w:cstheme="minorBidi"/>
-                <w:color w:val="auto"/>
-                <w:sz w:val="24"/>
-                <w:szCs w:val="20"/>
-                <w:lang w:eastAsia="en-US"/>
-              </w:rPr>
-            </w:pPr>
-            <w:r>
-              <w:rPr>
-                <w:color w:val="auto"/>
-                <w:sz w:val="24"/>
-                <w:szCs w:val="24"/>
-                <w:lang w:eastAsia="en-US"/>
-              </w:rPr>
-              <w:t>доступа</w:t>
-            </w:r>
-          </w:p>
-        </w:tc>
-        <w:tc>
-          <w:tcPr>
-            <w:tcW w:w="2381" w:type="dxa"/>
-          </w:tcPr>
-          <w:p>
-            <w:pPr>
-              <w:widowControl w:val="0"/>
-              <w:autoSpaceDE w:val="0"/>
-              <w:autoSpaceDN w:val="0"/>
-              <w:spacing w:before="120" w:after="120" w:line="276" w:lineRule="auto"/>
-              <w:ind w:left="0" w:firstLine="0"/>
-              <w:jc w:val="center"/>
-              <w:rPr>
-                <w:color w:val="auto"/>
-                <w:sz w:val="24"/>
-                <w:szCs w:val="24"/>
-                <w:lang w:eastAsia="en-US"/>
-              </w:rPr>
-            </w:pPr>
-            <w:r>
-              <w:rPr>
-                <w:color w:val="auto"/>
-                <w:sz w:val="24"/>
-                <w:szCs w:val="24"/>
-                <w:lang w:eastAsia="en-US"/>
-              </w:rPr>
-              <w:t>Механизм системы, позволяющий управлять разрешениями других пользователей на заметки и их типы для организации совместной работы</w:t>
-            </w:r>
-          </w:p>
-        </w:tc>
-        <w:tc>
-          <w:tcPr>
-            <w:tcW w:w="2366" w:type="dxa"/>
-          </w:tcPr>
-          <w:p>
-            <w:pPr>
-              <w:widowControl w:val="0"/>
-              <w:autoSpaceDE w:val="0"/>
-              <w:autoSpaceDN w:val="0"/>
-              <w:spacing w:before="120" w:after="120" w:line="276" w:lineRule="auto"/>
-              <w:ind w:left="0" w:firstLine="0"/>
-              <w:jc w:val="center"/>
-              <w:rPr>
-                <w:rFonts w:eastAsiaTheme="minorHAnsi" w:cstheme="minorBidi"/>
-                <w:color w:val="auto"/>
-                <w:sz w:val="24"/>
-                <w:szCs w:val="20"/>
-                <w:lang w:eastAsia="en-US"/>
-              </w:rPr>
-            </w:pPr>
-            <w:r>
-              <w:rPr>
-                <w:rFonts w:eastAsiaTheme="minorHAnsi" w:cstheme="minorBidi"/>
-                <w:color w:val="auto"/>
-                <w:sz w:val="24"/>
-                <w:szCs w:val="20"/>
-                <w:lang w:eastAsia="en-US"/>
-              </w:rPr>
-              <w:t>Владелец, список соавторов, разрешения, список заметок</w:t>
-            </w:r>
-          </w:p>
-        </w:tc>
-        <w:tc>
-          <w:tcPr>
-            <w:tcW w:w="2366" w:type="dxa"/>
-            <w:vAlign w:val="center"/>
-          </w:tcPr>
-          <w:p>
-            <w:pPr>
-              <w:spacing w:before="120" w:after="120" w:line="360" w:lineRule="auto"/>
-              <w:ind w:left="-108" w:firstLine="0"/>
-              <w:jc w:val="center"/>
-              <w:rPr>
-                <w:rFonts w:eastAsiaTheme="minorHAnsi" w:cstheme="minorBidi"/>
-                <w:color w:val="auto"/>
-                <w:sz w:val="24"/>
-                <w:szCs w:val="20"/>
-                <w:lang w:eastAsia="en-US"/>
-              </w:rPr>
-            </w:pPr>
-            <w:r>
-              <w:rPr>
-                <w:rFonts w:eastAsiaTheme="minorHAnsi" w:cstheme="minorBidi"/>
-                <w:color w:val="auto"/>
-                <w:sz w:val="24"/>
-                <w:szCs w:val="20"/>
-                <w:lang w:eastAsia="en-US"/>
-              </w:rPr>
-              <w:t>–</w:t>
-            </w:r>
-          </w:p>
-        </w:tc>
-      </w:tr>
-      <w:tr>
-        <w:tc>
-          <w:tcPr>
-            <w:tcW w:w="2232" w:type="dxa"/>
-          </w:tcPr>
-          <w:p>
-            <w:pPr>
-              <w:widowControl w:val="0"/>
-              <w:autoSpaceDE w:val="0"/>
-              <w:autoSpaceDN w:val="0"/>
-              <w:spacing w:before="120" w:after="120"/>
-              <w:ind w:left="0" w:firstLine="0"/>
-              <w:jc w:val="left"/>
-              <w:rPr>
-                <w:rFonts w:eastAsiaTheme="minorHAnsi" w:cstheme="minorBidi"/>
-                <w:color w:val="auto"/>
-                <w:sz w:val="24"/>
-                <w:szCs w:val="20"/>
-                <w:lang w:eastAsia="en-US"/>
-              </w:rPr>
-            </w:pPr>
-            <w:r>
-              <w:rPr>
-                <w:rFonts w:eastAsiaTheme="minorHAnsi" w:cstheme="minorBidi"/>
-                <w:color w:val="auto"/>
-                <w:sz w:val="24"/>
-                <w:szCs w:val="20"/>
-                <w:lang w:eastAsia="en-US"/>
-              </w:rPr>
-              <w:t>М</w:t>
-            </w:r>
-            <w:r>
-              <w:rPr>
-                <w:rFonts w:eastAsiaTheme="minorHAnsi" w:cstheme="minorBidi"/>
-                <w:color w:val="auto"/>
-                <w:sz w:val="24"/>
-                <w:szCs w:val="20"/>
-                <w:lang w:eastAsia="en-US"/>
-              </w:rPr>
-              <w:t>одуль</w:t>
-            </w:r>
-          </w:p>
-          <w:p>
-            <w:pPr>
-              <w:widowControl w:val="0"/>
-              <w:autoSpaceDE w:val="0"/>
-              <w:autoSpaceDN w:val="0"/>
-              <w:spacing w:before="120" w:after="120"/>
-              <w:ind w:left="0" w:firstLine="0"/>
-              <w:jc w:val="left"/>
-              <w:rPr>
-                <w:rFonts w:eastAsiaTheme="minorHAnsi" w:cstheme="minorBidi"/>
-                <w:color w:val="auto"/>
-                <w:sz w:val="24"/>
-                <w:szCs w:val="20"/>
-                <w:lang w:eastAsia="en-US"/>
-              </w:rPr>
-            </w:pPr>
-            <w:r>
-              <w:rPr>
-                <w:color w:val="auto"/>
-                <w:sz w:val="24"/>
-                <w:szCs w:val="24"/>
-                <w:lang w:eastAsia="en-US"/>
-              </w:rPr>
-              <w:t>интерфейса</w:t>
-            </w:r>
-          </w:p>
-        </w:tc>
-        <w:tc>
-          <w:tcPr>
-            <w:tcW w:w="2381" w:type="dxa"/>
-          </w:tcPr>
-          <w:p>
-            <w:pPr>
-              <w:widowControl w:val="0"/>
-              <w:autoSpaceDE w:val="0"/>
-              <w:autoSpaceDN w:val="0"/>
-              <w:spacing w:before="120" w:after="120" w:line="276" w:lineRule="auto"/>
-              <w:ind w:left="0" w:firstLine="0"/>
-              <w:jc w:val="center"/>
-              <w:rPr>
-                <w:color w:val="auto"/>
-                <w:sz w:val="24"/>
-                <w:szCs w:val="24"/>
-                <w:lang w:eastAsia="en-US"/>
-              </w:rPr>
-            </w:pPr>
-            <w:r>
-              <w:rPr>
-                <w:color w:val="auto"/>
-                <w:sz w:val="24"/>
-                <w:szCs w:val="24"/>
-                <w:lang w:eastAsia="en-US"/>
-              </w:rPr>
-              <w:t>Интерфейсный компонент, необходимый для визуализации сервиса и помогающий пользователям взаимодействовать с системой</w:t>
-            </w:r>
-          </w:p>
-        </w:tc>
-        <w:tc>
-          <w:tcPr>
-            <w:tcW w:w="2366" w:type="dxa"/>
-          </w:tcPr>
-          <w:p>
-            <w:pPr>
-              <w:widowControl w:val="0"/>
-              <w:autoSpaceDE w:val="0"/>
-              <w:autoSpaceDN w:val="0"/>
-              <w:spacing w:before="120" w:after="120" w:line="276" w:lineRule="auto"/>
-              <w:ind w:left="0" w:firstLine="0"/>
-              <w:jc w:val="center"/>
-              <w:rPr>
-                <w:rFonts w:eastAsiaTheme="minorHAnsi" w:cstheme="minorBidi"/>
-                <w:color w:val="auto"/>
-                <w:sz w:val="24"/>
-                <w:szCs w:val="20"/>
-                <w:lang w:eastAsia="en-US"/>
-              </w:rPr>
-            </w:pPr>
-            <w:r>
-              <w:rPr>
-                <w:rFonts w:eastAsiaTheme="minorHAnsi" w:cstheme="minorBidi"/>
-                <w:color w:val="auto"/>
-                <w:sz w:val="24"/>
-                <w:szCs w:val="20"/>
-                <w:lang w:eastAsia="en-US"/>
-              </w:rPr>
-              <w:t>Название</w:t>
-            </w:r>
-          </w:p>
-        </w:tc>
-        <w:tc>
-          <w:tcPr>
-            <w:tcW w:w="2366" w:type="dxa"/>
-            <w:vAlign w:val="center"/>
-          </w:tcPr>
-          <w:p>
-            <w:pPr>
-              <w:spacing w:before="120" w:after="120" w:line="360" w:lineRule="auto"/>
-              <w:ind w:left="-108" w:firstLine="0"/>
-              <w:jc w:val="center"/>
-              <w:rPr>
-                <w:rFonts w:eastAsiaTheme="minorHAnsi" w:cstheme="minorBidi"/>
-                <w:color w:val="auto"/>
-                <w:sz w:val="24"/>
-                <w:szCs w:val="20"/>
-                <w:lang w:eastAsia="en-US"/>
-              </w:rPr>
-            </w:pPr>
-            <w:r>
-              <w:rPr>
-                <w:rFonts w:eastAsiaTheme="minorHAnsi" w:cstheme="minorBidi"/>
-                <w:color w:val="auto"/>
-                <w:sz w:val="24"/>
-                <w:szCs w:val="20"/>
-                <w:lang w:eastAsia="en-US"/>
-              </w:rPr>
-              <w:t>–</w:t>
-            </w:r>
-          </w:p>
-        </w:tc>
-      </w:tr>
-      <w:tr>
-        <w:tc>
-          <w:tcPr>
-            <w:tcW w:w="2232" w:type="dxa"/>
-          </w:tcPr>
-          <w:p>
-            <w:pPr>
-              <w:widowControl w:val="0"/>
-              <w:autoSpaceDE w:val="0"/>
-              <w:autoSpaceDN w:val="0"/>
-              <w:spacing w:before="120" w:after="120"/>
-              <w:ind w:left="0" w:firstLine="0"/>
-              <w:jc w:val="left"/>
-              <w:rPr>
-                <w:rFonts w:eastAsiaTheme="minorHAnsi" w:cstheme="minorBidi"/>
-                <w:color w:val="auto"/>
-                <w:sz w:val="24"/>
-                <w:szCs w:val="20"/>
-                <w:lang w:eastAsia="en-US"/>
-              </w:rPr>
-            </w:pPr>
-            <w:r>
-              <w:rPr>
-                <w:rFonts w:eastAsiaTheme="minorHAnsi" w:cstheme="minorBidi"/>
-                <w:color w:val="auto"/>
-                <w:sz w:val="24"/>
-                <w:szCs w:val="20"/>
-                <w:lang w:eastAsia="en-US"/>
-              </w:rPr>
-              <w:t>Пользовательский</w:t>
-            </w:r>
-          </w:p>
-          <w:p>
-            <w:pPr>
-              <w:widowControl w:val="0"/>
-              <w:autoSpaceDE w:val="0"/>
-              <w:autoSpaceDN w:val="0"/>
-              <w:spacing w:before="120" w:after="120"/>
-              <w:ind w:left="0" w:firstLine="0"/>
-              <w:jc w:val="left"/>
-              <w:rPr>
-                <w:rFonts w:eastAsiaTheme="minorHAnsi" w:cstheme="minorBidi"/>
-                <w:color w:val="auto"/>
-                <w:sz w:val="24"/>
-                <w:szCs w:val="20"/>
-                <w:lang w:eastAsia="en-US"/>
-              </w:rPr>
-            </w:pPr>
-            <w:r>
-              <w:rPr>
-                <w:rFonts w:eastAsiaTheme="minorHAnsi" w:cstheme="minorBidi"/>
-                <w:color w:val="auto"/>
-                <w:sz w:val="24"/>
-                <w:szCs w:val="20"/>
-                <w:lang w:eastAsia="en-US"/>
-              </w:rPr>
-              <w:t xml:space="preserve">профиль </w:t>
-            </w:r>
-            <w:r>
-              <w:rPr>
-                <w:color w:val="auto"/>
-                <w:sz w:val="24"/>
-                <w:szCs w:val="24"/>
-                <w:lang w:eastAsia="en-US"/>
-              </w:rPr>
-              <w:t>настроек</w:t>
-            </w:r>
-          </w:p>
-        </w:tc>
-        <w:tc>
-          <w:tcPr>
-            <w:tcW w:w="2381" w:type="dxa"/>
-          </w:tcPr>
-          <w:p>
-            <w:pPr>
-              <w:widowControl w:val="0"/>
-              <w:autoSpaceDE w:val="0"/>
-              <w:autoSpaceDN w:val="0"/>
-              <w:spacing w:before="120" w:after="120" w:line="276" w:lineRule="auto"/>
-              <w:ind w:left="0" w:firstLine="0"/>
-              <w:jc w:val="center"/>
-              <w:rPr>
-                <w:color w:val="auto"/>
-                <w:sz w:val="24"/>
-                <w:szCs w:val="24"/>
-                <w:lang w:eastAsia="en-US"/>
-              </w:rPr>
-            </w:pPr>
-            <w:r>
-              <w:rPr>
-                <w:color w:val="auto"/>
-                <w:sz w:val="24"/>
-                <w:szCs w:val="24"/>
-                <w:lang w:eastAsia="en-US"/>
-              </w:rPr>
-              <w:t>Механизм, позволяющий пользователю изменить интерфейс или модуль интерфейса взаимодействия с системой под собственные цели и задачи</w:t>
-            </w:r>
-          </w:p>
-        </w:tc>
-        <w:tc>
-          <w:tcPr>
-            <w:tcW w:w="2366" w:type="dxa"/>
-          </w:tcPr>
-          <w:p>
-            <w:pPr>
-              <w:widowControl w:val="0"/>
-              <w:autoSpaceDE w:val="0"/>
-              <w:autoSpaceDN w:val="0"/>
-              <w:spacing w:before="120" w:after="120" w:line="276" w:lineRule="auto"/>
-              <w:ind w:left="0" w:firstLine="0"/>
-              <w:jc w:val="center"/>
-              <w:rPr>
-                <w:rFonts w:eastAsiaTheme="minorHAnsi" w:cstheme="minorBidi"/>
-                <w:color w:val="auto"/>
-                <w:sz w:val="24"/>
-                <w:szCs w:val="20"/>
-                <w:lang w:eastAsia="en-US"/>
-              </w:rPr>
-            </w:pPr>
-            <w:r>
-              <w:rPr>
-                <w:rFonts w:eastAsiaTheme="minorHAnsi" w:cstheme="minorBidi"/>
-                <w:color w:val="auto"/>
-                <w:sz w:val="24"/>
-                <w:szCs w:val="20"/>
-                <w:lang w:eastAsia="en-US"/>
-              </w:rPr>
-              <w:t>Список скрытых модулей, тема</w:t>
-            </w:r>
-          </w:p>
-        </w:tc>
-        <w:tc>
-          <w:tcPr>
-            <w:tcW w:w="2366" w:type="dxa"/>
-          </w:tcPr>
-          <w:p>
-            <w:pPr>
-              <w:widowControl w:val="0"/>
-              <w:autoSpaceDE w:val="0"/>
-              <w:autoSpaceDN w:val="0"/>
-              <w:spacing w:before="120" w:after="120" w:line="276" w:lineRule="auto"/>
-              <w:ind w:left="0" w:firstLine="0"/>
-              <w:jc w:val="center"/>
-              <w:rPr>
-                <w:rFonts w:eastAsiaTheme="minorHAnsi" w:cstheme="minorBidi"/>
-                <w:color w:val="auto"/>
-                <w:sz w:val="24"/>
-                <w:szCs w:val="20"/>
-                <w:lang w:eastAsia="en-US"/>
-              </w:rPr>
-            </w:pPr>
-            <w:r>
-              <w:rPr>
-                <w:rFonts w:eastAsiaTheme="minorHAnsi" w:cstheme="minorBidi"/>
-                <w:color w:val="auto"/>
-                <w:sz w:val="24"/>
-                <w:szCs w:val="20"/>
-                <w:lang w:eastAsia="en-US"/>
-              </w:rPr>
-              <w:t>Скрыть модуль, добавить модуль, изменить тему</w:t>
-            </w:r>
-          </w:p>
-        </w:tc>
-      </w:tr>
-    </w:tbl>
+          <w:sz w:val="24"/>
+          <w:szCs w:val="24"/>
+        </w:rPr>
+      </w:pPr>
+      <w:r>
+        <w:rPr>
+          <w:sz w:val="24"/>
+          <w:szCs w:val="24"/>
+        </w:rPr>
+        <w:br w:type="page"/>
+      </w:r>
+    </w:p>
     <w:p>
       <w:pPr>
         <w:spacing w:after="0" w:line="240" w:lineRule="auto"/>
@@ -2999,232 +3451,303 @@
         <w:t xml:space="preserve">Также были выделены следующие проблемы и потребности, которые необходимо удовлетворить: потребность в простоте и наглядности программного интерфейса, </w:t>
       </w:r>
       <w:r>
-        <w:t xml:space="preserve">необходимость иметь </w:t>
-      </w:r>
+        <w:t>необходимость иметь быстрый доступ</w:t>
+      </w:r>
+      <w:r>
+        <w:t xml:space="preserve"> и единое хранилище</w:t>
+      </w:r>
+      <w:r>
+        <w:t>,</w:t>
+      </w:r>
+      <w:r>
+        <w:t xml:space="preserve"> проблема</w:t>
+      </w:r>
+      <w:r>
+        <w:t xml:space="preserve"> </w:t>
+      </w:r>
+      <w:r>
+        <w:t>ограниченности</w:t>
+      </w:r>
+      <w:r>
+        <w:t xml:space="preserve"> ресурс</w:t>
+      </w:r>
+      <w:r>
+        <w:t>ов</w:t>
+      </w:r>
+      <w:r>
+        <w:t>,</w:t>
+      </w:r>
+      <w:r>
+        <w:t xml:space="preserve"> возможность планировать учебную нагрузку и вести совместную </w:t>
+      </w:r>
+      <w:r>
+        <w:t>работу</w:t>
+      </w:r>
+      <w:r>
+        <w:t xml:space="preserve"> над проектами.</w:t>
+      </w:r>
+    </w:p>
+    <w:p>
+      <w:pPr>
+        <w:pStyle w:val="a6"/>
+      </w:pPr>
+      <w:r>
+        <w:t xml:space="preserve">К вторичной категории относятся сотрудники, руководители и аналитики компаний. Основной «болью» сотрудников является информационный шум и неэффективное планирование рабочих задач, соблюдение крайних сроков их выполнения. </w:t>
+      </w:r>
+      <w:r>
+        <w:t>Для подобных пользователей были выделены следующие п</w:t>
+      </w:r>
+      <w:r>
+        <w:t>роблемы и потребности: необходимость в гибкости рабочих инструментов, оптимизация рутинных задач для повышения эффективности, возможность планировать задачи и иметь многопользовательский режим для совместной</w:t>
+      </w:r>
+      <w:r>
+        <w:t xml:space="preserve"> корпоративной</w:t>
+      </w:r>
+      <w:r>
+        <w:t xml:space="preserve"> работы.</w:t>
+      </w:r>
+      <w:r>
+        <w:t xml:space="preserve"> Основные </w:t>
+      </w:r>
+      <w:r>
+        <w:t xml:space="preserve">проблемы и </w:t>
+      </w:r>
+      <w:r>
+        <w:t xml:space="preserve">потребности руководителей и аналитиков </w:t>
+      </w:r>
+      <w:r>
+        <w:t>сводятся к получению такого функционала, как</w:t>
+      </w:r>
+      <w:r>
+        <w:t xml:space="preserve"> доступ </w:t>
+      </w:r>
+      <w:r>
+        <w:t>к</w:t>
+      </w:r>
+      <w:r>
+        <w:t xml:space="preserve"> наглядны</w:t>
+      </w:r>
+      <w:r>
+        <w:t xml:space="preserve">м </w:t>
+      </w:r>
+      <w:r>
+        <w:t>статистических данны</w:t>
+      </w:r>
+      <w:r>
+        <w:t>м</w:t>
+      </w:r>
+      <w:r>
+        <w:t xml:space="preserve">, </w:t>
+      </w:r>
+      <w:r>
+        <w:t xml:space="preserve">возможность </w:t>
+      </w:r>
+      <w:r>
+        <w:t>контрол</w:t>
+      </w:r>
+      <w:r>
+        <w:t>ировать</w:t>
+      </w:r>
+      <w:r>
+        <w:t xml:space="preserve"> и </w:t>
+      </w:r>
+      <w:r>
+        <w:t>просматривать</w:t>
+      </w:r>
+      <w:r>
+        <w:t xml:space="preserve"> рабоч</w:t>
+      </w:r>
+      <w:r>
+        <w:t>ий</w:t>
+      </w:r>
+      <w:r>
+        <w:t xml:space="preserve"> процесс</w:t>
+      </w:r>
+      <w:r>
+        <w:t xml:space="preserve"> компании</w:t>
+      </w:r>
+      <w:r>
+        <w:t>.</w:t>
+      </w:r>
+    </w:p>
+    <w:p>
+      <w:pPr>
+        <w:pStyle w:val="a6"/>
+      </w:pPr>
+      <w:r>
+        <w:t>Также в</w:t>
+      </w:r>
+      <w:r>
+        <w:t xml:space="preserve"> ходе анализа </w:t>
+      </w:r>
+      <w:r>
+        <w:t>целевой аудитории</w:t>
+      </w:r>
+      <w:r>
+        <w:t xml:space="preserve"> было выделено несколько ролей поль</w:t>
+      </w:r>
+      <w:r>
+        <w:t>зо</w:t>
+      </w:r>
+      <w:r>
+        <w:t>ва</w:t>
+      </w:r>
+      <w:r>
+        <w:t>телей</w:t>
+      </w:r>
+      <w:r>
+        <w:t xml:space="preserve"> </w:t>
+      </w:r>
+      <w:r>
+        <w:t xml:space="preserve">проектируемой </w:t>
+      </w:r>
+      <w:r>
+        <w:t>системы</w:t>
+      </w:r>
+      <w:r>
+        <w:t>:</w:t>
+      </w:r>
+    </w:p>
+    <w:p>
+      <w:pPr>
+        <w:pStyle w:val="a6"/>
+      </w:pPr>
+      <w:r>
+        <w:t xml:space="preserve">Неавторизованный пользователь </w:t>
+      </w:r>
+      <w:r>
+        <w:t xml:space="preserve">(гость) </w:t>
+      </w:r>
+      <w:r>
+        <w:t xml:space="preserve">– </w:t>
+      </w:r>
+      <w:r>
+        <w:t>человек</w:t>
+      </w:r>
+      <w:r>
+        <w:t xml:space="preserve">, </w:t>
+      </w:r>
+      <w:r>
+        <w:t>не прошедший процедуру аутентификации</w:t>
+      </w:r>
+      <w:r>
+        <w:t xml:space="preserve"> в системе и не имеющий доступ к </w:t>
+      </w:r>
+      <w:r>
+        <w:t xml:space="preserve">ее </w:t>
+      </w:r>
+      <w:r>
+        <w:t>функционалу.</w:t>
+      </w:r>
+    </w:p>
+    <w:p>
+      <w:pPr>
+        <w:pStyle w:val="a6"/>
+      </w:pPr>
       <w:r>
         <w:lastRenderedPageBreak/>
-        <w:t>быстрый доступ</w:t>
-      </w:r>
-      <w:r>
-        <w:t xml:space="preserve"> и единое хранилище</w:t>
-      </w:r>
-      <w:r>
-        <w:t>,</w:t>
-      </w:r>
-      <w:r>
-        <w:t xml:space="preserve"> проблема</w:t>
+        <w:t xml:space="preserve">Клиент – </w:t>
+      </w:r>
+      <w:r>
+        <w:t>основной пользователь системы</w:t>
+      </w:r>
+      <w:r>
+        <w:t>.</w:t>
       </w:r>
       <w:r>
         <w:t xml:space="preserve"> </w:t>
       </w:r>
       <w:r>
-        <w:t>ограниченности</w:t>
-      </w:r>
-      <w:r>
-        <w:t xml:space="preserve"> ресурс</w:t>
-      </w:r>
-      <w:r>
-        <w:t>ов</w:t>
-      </w:r>
-      <w:r>
-        <w:t>,</w:t>
-      </w:r>
-      <w:r>
-        <w:t xml:space="preserve"> возможность планировать учебную нагрузку и вести совместную </w:t>
+        <w:t>После</w:t>
+      </w:r>
+      <w:r>
+        <w:t xml:space="preserve"> </w:t>
+      </w:r>
+      <w:r>
+        <w:t xml:space="preserve">авторизации </w:t>
+      </w:r>
+      <w:r>
+        <w:t xml:space="preserve">ему </w:t>
+      </w:r>
+      <w:r>
+        <w:t>открывается полный доступ к функционалу сервиса: управление заметками</w:t>
+      </w:r>
+      <w:r>
+        <w:t xml:space="preserve"> и</w:t>
+      </w:r>
+      <w:r>
+        <w:t xml:space="preserve"> директориями заметок, </w:t>
+      </w:r>
+      <w:r>
+        <w:t xml:space="preserve">выдача прав доступа, </w:t>
+      </w:r>
+      <w:r>
+        <w:t>управление инструментами для планирования задач</w:t>
+      </w:r>
+      <w:r>
+        <w:t xml:space="preserve">, </w:t>
+      </w:r>
+      <w:r>
+        <w:t xml:space="preserve">просмотр аналитики </w:t>
+      </w:r>
+      <w:r>
+        <w:t xml:space="preserve">и </w:t>
+      </w:r>
+      <w:r>
+        <w:t>статистик</w:t>
+      </w:r>
+      <w:r>
+        <w:t>и, а также</w:t>
+      </w:r>
+      <w:r>
+        <w:t xml:space="preserve"> управление модулями интерфейса.</w:t>
+      </w:r>
+    </w:p>
+    <w:p>
+      <w:pPr>
+        <w:pStyle w:val="a6"/>
+      </w:pPr>
+      <w:r>
+        <w:t xml:space="preserve">Администратор – </w:t>
+      </w:r>
+      <w:r>
+        <w:t>пользователь системы, ответственный за е</w:t>
+      </w:r>
+      <w:r>
+        <w:t>е</w:t>
+      </w:r>
+      <w:r>
+        <w:t xml:space="preserve"> стабильную и безопасную </w:t>
       </w:r>
       <w:r>
         <w:t>работу</w:t>
       </w:r>
       <w:r>
-        <w:t xml:space="preserve"> над проектами.</w:t>
-      </w:r>
-    </w:p>
-    <w:p>
-      <w:pPr>
-        <w:pStyle w:val="a6"/>
-      </w:pPr>
-      <w:r>
-        <w:t xml:space="preserve">К вторичной категории относятся сотрудники, руководители и аналитики компаний. Основной «болью» сотрудников является информационный шум и неэффективное планирование рабочих задач, соблюдение крайних сроков их выполнения. </w:t>
-      </w:r>
-      <w:r>
-        <w:t>Для подобных пользователей были выделены следующие п</w:t>
-      </w:r>
-      <w:r>
-        <w:t>роблемы и потребности: необходимость в гибкости рабочих инструментов, оптимизация рутинных задач для повышения эффективности, возможность планировать задачи и иметь многопользовательский режим для совместной</w:t>
-      </w:r>
-      <w:r>
-        <w:t xml:space="preserve"> корпоративной</w:t>
-      </w:r>
-      <w:r>
-        <w:t xml:space="preserve"> работы.</w:t>
-      </w:r>
-      <w:r>
-        <w:t xml:space="preserve"> Основные </w:t>
-      </w:r>
-      <w:r>
-        <w:t xml:space="preserve">проблемы и </w:t>
-      </w:r>
-      <w:r>
-        <w:t xml:space="preserve">потребности руководителей и аналитиков </w:t>
-      </w:r>
-      <w:r>
-        <w:t>сводятся к получению такого функционала, как</w:t>
-      </w:r>
-      <w:r>
-        <w:t xml:space="preserve"> доступ </w:t>
-      </w:r>
-      <w:r>
-        <w:t>к</w:t>
-      </w:r>
-      <w:r>
-        <w:t xml:space="preserve"> наглядны</w:t>
-      </w:r>
-      <w:r>
-        <w:t xml:space="preserve">м </w:t>
-      </w:r>
-      <w:r>
-        <w:t>статистических данны</w:t>
-      </w:r>
-      <w:r>
-        <w:t>м</w:t>
-      </w:r>
-      <w:r>
-        <w:t xml:space="preserve">, </w:t>
-      </w:r>
-      <w:r>
-        <w:t xml:space="preserve">возможность </w:t>
-      </w:r>
-      <w:r>
-        <w:t>контрол</w:t>
-      </w:r>
-      <w:r>
-        <w:t>ировать</w:t>
-      </w:r>
-      <w:r>
-        <w:t xml:space="preserve"> и </w:t>
-      </w:r>
-      <w:r>
-        <w:t>просматривать</w:t>
-      </w:r>
-      <w:r>
-        <w:t xml:space="preserve"> рабоч</w:t>
-      </w:r>
-      <w:r>
-        <w:t>ий</w:t>
-      </w:r>
-      <w:r>
-        <w:t xml:space="preserve"> процесс</w:t>
-      </w:r>
-      <w:r>
-        <w:t xml:space="preserve"> компании</w:t>
+        <w:t>. В его задачи входит управление уч</w:t>
+      </w:r>
+      <w:r>
+        <w:t>е</w:t>
+      </w:r>
+      <w:r>
+        <w:t xml:space="preserve">тными записями </w:t>
+      </w:r>
+      <w:r>
+        <w:t xml:space="preserve">других </w:t>
+      </w:r>
+      <w:r>
+        <w:t xml:space="preserve">пользователей, контроль и коррекция прав доступа к </w:t>
+      </w:r>
+      <w:r>
+        <w:t>заметкам</w:t>
+      </w:r>
+      <w:r>
+        <w:t xml:space="preserve">, а также разрешение конфликтных ситуаций и инцидентов, возникающих в процессе </w:t>
+      </w:r>
+      <w:r>
+        <w:t>использования программной системы</w:t>
       </w:r>
       <w:r>
         <w:t>.</w:t>
-      </w:r>
-    </w:p>
-    <w:p>
-      <w:pPr>
-        <w:pStyle w:val="a6"/>
-      </w:pPr>
-      <w:r>
-        <w:t>Также в</w:t>
-      </w:r>
-      <w:r>
-        <w:t xml:space="preserve"> ходе анализа </w:t>
-      </w:r>
-      <w:r>
-        <w:t>целевой аудитории</w:t>
-      </w:r>
-      <w:r>
-        <w:t xml:space="preserve"> было выделено несколько ролей </w:t>
-      </w:r>
-      <w:proofErr w:type="spellStart"/>
-      <w:r>
-        <w:t>польва</w:t>
-      </w:r>
-      <w:r>
-        <w:t>телей</w:t>
-      </w:r>
-      <w:proofErr w:type="spellEnd"/>
-      <w:r>
-        <w:t xml:space="preserve"> </w:t>
-      </w:r>
-      <w:r>
-        <w:t xml:space="preserve">проектируемой </w:t>
-      </w:r>
-      <w:r>
-        <w:t>системы</w:t>
-      </w:r>
-      <w:r>
-        <w:t>:</w:t>
-      </w:r>
-    </w:p>
-    <w:p>
-      <w:pPr>
-        <w:pStyle w:val="a6"/>
-      </w:pPr>
-      <w:r>
-        <w:t xml:space="preserve">Неавторизованный пользователь – </w:t>
-      </w:r>
-      <w:r>
-        <w:t>пользователь, не авторизированный или не зарегистрированный в системе и не имеющий доступ к функционалу.</w:t>
-      </w:r>
-    </w:p>
-    <w:p>
-      <w:pPr>
-        <w:pStyle w:val="a6"/>
-      </w:pPr>
-      <w:r>
-        <w:t xml:space="preserve">Клиент – </w:t>
-      </w:r>
-      <w:r>
-        <w:t>зарегистрированный</w:t>
-      </w:r>
-      <w:r>
-        <w:t xml:space="preserve"> в системе пользователь.</w:t>
-      </w:r>
-      <w:r>
-        <w:t xml:space="preserve"> </w:t>
-      </w:r>
-      <w:r>
-        <w:t>После</w:t>
-      </w:r>
-      <w:r>
-        <w:t xml:space="preserve"> </w:t>
-      </w:r>
-      <w:r>
-        <w:t>авторизации открывается полный клиентский доступ к функционалу сервиса: управление заметками, управление директориями заметок, управление инструментами для планирования задач (</w:t>
-      </w:r>
-      <w:proofErr w:type="spellStart"/>
-      <w:r>
-        <w:t>канбан</w:t>
-      </w:r>
-      <w:proofErr w:type="spellEnd"/>
-      <w:r>
-        <w:t xml:space="preserve">-доски и календари), </w:t>
-      </w:r>
-      <w:r>
-        <w:t xml:space="preserve">управление правами доступа заметок для совместной работы, </w:t>
-      </w:r>
-      <w:r>
-        <w:t>просмотр аналитики и различных статистик</w:t>
-      </w:r>
-      <w:r>
-        <w:t xml:space="preserve"> и управление модулями интерфейса.</w:t>
-      </w:r>
-    </w:p>
-    <w:p>
-      <w:pPr>
-        <w:pStyle w:val="a6"/>
-      </w:pPr>
-      <w:r>
-        <w:t xml:space="preserve">Администратор – </w:t>
-      </w:r>
-      <w:r>
-        <w:t>сотрудник сервиса, основные задачи которого обеспечение безопасности и разрешение конфликтных ситуаций и инцидентов</w:t>
-      </w:r>
-      <w:r>
-        <w:t>. Имеет доступ к следующему функционалу: управление пользователями и управлением правами доступа совместного использования.</w:t>
       </w:r>
     </w:p>
     <w:p>
@@ -3248,7 +3771,6 @@
         </w:numPr>
       </w:pPr>
       <w:r>
-        <w:lastRenderedPageBreak/>
         <w:t>Описание п</w:t>
       </w:r>
       <w:r>
@@ -3329,6 +3851,7 @@
         <w:rPr>
           <w:noProof/>
         </w:rPr>
+        <w:lastRenderedPageBreak/>
         <w:drawing>
           <wp:inline distT="0" distB="0" distL="0" distR="0" wp14:anchorId="0AF26571" wp14:editId="4DAB52BB">
             <wp:extent cx="5967730" cy="3658769"/>
@@ -3476,60 +3999,60 @@
         <w:pStyle w:val="a6"/>
       </w:pPr>
       <w:r>
+        <w:t xml:space="preserve">Для моделирования структуры программной системы </w:t>
+      </w:r>
+      <w:r>
+        <w:t>на верхнем уровне</w:t>
+      </w:r>
+      <w:r>
+        <w:t xml:space="preserve"> была разработана диаграмма классов </w:t>
+      </w:r>
+      <w:r>
+        <w:t>– «</w:t>
+      </w:r>
+      <w:r>
+        <w:t xml:space="preserve">Class </w:t>
+      </w:r>
+      <w:proofErr w:type="spellStart"/>
+      <w:r>
+        <w:t>Diagram</w:t>
+      </w:r>
+      <w:proofErr w:type="spellEnd"/>
+      <w:r>
+        <w:t>» (см. рис. 2)</w:t>
+      </w:r>
+      <w:r>
+        <w:t>. Данный тип диаграмм в рамках языка UML позволяет описать логическую архитектуру системы, представляя ее в виде классов, их атрибутов, методов и взаимосвязей. На основе анализа предметной области были выделены ключевые сущности и их атрибуты</w:t>
+      </w:r>
+      <w:r>
+        <w:t>: «Заметка», «</w:t>
+      </w:r>
+      <w:proofErr w:type="spellStart"/>
+      <w:r>
+        <w:t>Канбан</w:t>
+      </w:r>
+      <w:proofErr w:type="spellEnd"/>
+      <w:r>
+        <w:t xml:space="preserve">-доска», «Календарь», «Директория», «Файловая система», «Права доступа», «Пользователь», «Администратор», «Клиент», «Неавторизированный пользователь», «Пользовательский профиль </w:t>
+      </w:r>
+      <w:proofErr w:type="spellStart"/>
+      <w:r>
+        <w:t>настроеек</w:t>
+      </w:r>
+      <w:proofErr w:type="spellEnd"/>
+      <w:r>
+        <w:t>», «Модуль интерфейса».</w:t>
+      </w:r>
+    </w:p>
+    <w:p>
+      <w:pPr>
+        <w:pStyle w:val="ab"/>
+      </w:pPr>
+      <w:r>
+        <w:rPr>
+          <w:noProof/>
+        </w:rPr>
         <w:lastRenderedPageBreak/>
-        <w:t xml:space="preserve">Для моделирования структуры программной системы </w:t>
-      </w:r>
-      <w:r>
-        <w:t>на верхнем уровне</w:t>
-      </w:r>
-      <w:r>
-        <w:t xml:space="preserve"> была разработана диаграмма классов </w:t>
-      </w:r>
-      <w:r>
-        <w:t>– «</w:t>
-      </w:r>
-      <w:r>
-        <w:t xml:space="preserve">Class </w:t>
-      </w:r>
-      <w:proofErr w:type="spellStart"/>
-      <w:r>
-        <w:t>Diagram</w:t>
-      </w:r>
-      <w:proofErr w:type="spellEnd"/>
-      <w:r>
-        <w:t>» (см. рис. 2)</w:t>
-      </w:r>
-      <w:r>
-        <w:t>. Данный тип диаграмм в рамках языка UML позволяет описать логическую архитектуру системы, представляя ее в виде классов, их атрибутов, методов и взаимосвязей. На основе анализа предметной области были выделены ключевые сущности и их атрибуты</w:t>
-      </w:r>
-      <w:r>
-        <w:t>: «Заметка», «</w:t>
-      </w:r>
-      <w:proofErr w:type="spellStart"/>
-      <w:r>
-        <w:t>Канбан</w:t>
-      </w:r>
-      <w:proofErr w:type="spellEnd"/>
-      <w:r>
-        <w:t xml:space="preserve">-доска», «Календарь», «Директория», «Файловая система», «Права доступа», «Пользователь», «Администратор», «Клиент», «Неавторизированный пользователь», «Пользовательский профиль </w:t>
-      </w:r>
-      <w:proofErr w:type="spellStart"/>
-      <w:r>
-        <w:t>настроеек</w:t>
-      </w:r>
-      <w:proofErr w:type="spellEnd"/>
-      <w:r>
-        <w:t>», «Модуль интерфейса».</w:t>
-      </w:r>
-    </w:p>
-    <w:p>
-      <w:pPr>
-        <w:pStyle w:val="ab"/>
-      </w:pPr>
-      <w:r>
-        <w:rPr>
-          <w:noProof/>
-        </w:rPr>
         <w:drawing>
           <wp:inline distT="0" distB="0" distL="0" distR="0" wp14:anchorId="48A720E0" wp14:editId="02932300">
             <wp:extent cx="5844064" cy="5619750"/>
@@ -3627,105 +4150,105 @@
         <w:pStyle w:val="a6"/>
       </w:pPr>
       <w:r>
+        <w:t>Ключевыми сущностями</w:t>
+      </w:r>
+      <w:r>
+        <w:t xml:space="preserve"> разрабатываемой системы являются взаимосвязанные объекты «Заметка» и «Права доступа». Их жизненные циклы были представлены в виде диаграмм состояний – «</w:t>
+      </w:r>
+      <w:proofErr w:type="spellStart"/>
+      <w:r>
+        <w:t>Statechart</w:t>
+      </w:r>
+      <w:proofErr w:type="spellEnd"/>
+      <w:r>
+        <w:t xml:space="preserve"> </w:t>
+      </w:r>
+      <w:proofErr w:type="spellStart"/>
+      <w:r>
+        <w:t>Diagram</w:t>
+      </w:r>
+      <w:proofErr w:type="spellEnd"/>
+      <w:r>
+        <w:t>»</w:t>
+      </w:r>
+      <w:r>
+        <w:t xml:space="preserve"> (</w:t>
+      </w:r>
+      <w:r>
+        <w:t>см. рис. 3-4</w:t>
+      </w:r>
+      <w:r>
+        <w:t>)</w:t>
+      </w:r>
+      <w:r>
+        <w:t>.</w:t>
+      </w:r>
+    </w:p>
+    <w:p>
+      <w:pPr>
+        <w:pStyle w:val="a6"/>
+      </w:pPr>
+      <w:r>
+        <w:t>Диаграмма</w:t>
+      </w:r>
+      <w:r>
+        <w:t xml:space="preserve"> состояний</w:t>
+      </w:r>
+      <w:r>
+        <w:t xml:space="preserve"> сущности «Заметка» отражает ее жизненный цикл с момента создания до удаления.</w:t>
+      </w:r>
+      <w:r>
+        <w:t xml:space="preserve"> Объект включает в себя следующие состояния: «Создано» </w:t>
+      </w:r>
+      <w:r>
+        <w:t>–</w:t>
+      </w:r>
+      <w:r>
+        <w:t xml:space="preserve"> </w:t>
+      </w:r>
+      <w:r>
+        <w:t>момент создания заметки</w:t>
+      </w:r>
+      <w:r>
+        <w:t>;</w:t>
+      </w:r>
+      <w:r>
+        <w:t xml:space="preserve"> «В редактировании» –</w:t>
+      </w:r>
+      <w:r>
+        <w:t xml:space="preserve"> автор или соавтор с необходимым доступом находится в редакторе заметок</w:t>
+      </w:r>
+      <w:r>
+        <w:t>;</w:t>
+      </w:r>
+      <w:r>
+        <w:t xml:space="preserve"> «Сохранено» </w:t>
+      </w:r>
+      <w:r>
+        <w:t>–</w:t>
+      </w:r>
+      <w:r>
+        <w:t xml:space="preserve"> пользователь сохраняет отредактированный документ</w:t>
+      </w:r>
+      <w:r>
+        <w:t xml:space="preserve">; </w:t>
+      </w:r>
+      <w:r>
+        <w:t xml:space="preserve">«Удалено» </w:t>
+      </w:r>
+      <w:r>
+        <w:t>–</w:t>
+      </w:r>
+      <w:r>
+        <w:t xml:space="preserve"> автор документа удалил объект.</w:t>
+      </w:r>
+    </w:p>
+    <w:p>
+      <w:pPr>
+        <w:pStyle w:val="a6"/>
+      </w:pPr>
+      <w:r>
         <w:lastRenderedPageBreak/>
-        <w:t>Ключевыми сущностями</w:t>
-      </w:r>
-      <w:r>
-        <w:t xml:space="preserve"> разрабатываемой системы являются взаимосвязанные объекты «Заметка» и «Права доступа». Их жизненные циклы были представлены в виде диаграмм состояний – «</w:t>
-      </w:r>
-      <w:proofErr w:type="spellStart"/>
-      <w:r>
-        <w:t>Statechart</w:t>
-      </w:r>
-      <w:proofErr w:type="spellEnd"/>
-      <w:r>
-        <w:t xml:space="preserve"> </w:t>
-      </w:r>
-      <w:proofErr w:type="spellStart"/>
-      <w:r>
-        <w:t>Diagram</w:t>
-      </w:r>
-      <w:proofErr w:type="spellEnd"/>
-      <w:r>
-        <w:t>»</w:t>
-      </w:r>
-      <w:r>
-        <w:t xml:space="preserve"> (</w:t>
-      </w:r>
-      <w:r>
-        <w:t>см. рис. 3-4</w:t>
-      </w:r>
-      <w:r>
-        <w:t>)</w:t>
-      </w:r>
-      <w:r>
-        <w:t>.</w:t>
-      </w:r>
-    </w:p>
-    <w:p>
-      <w:pPr>
-        <w:pStyle w:val="a6"/>
-      </w:pPr>
-      <w:r>
-        <w:t>Диаграмма</w:t>
-      </w:r>
-      <w:r>
-        <w:t xml:space="preserve"> состояний</w:t>
-      </w:r>
-      <w:r>
-        <w:t xml:space="preserve"> сущности «Заметка» отражает ее жизненный цикл с момента создания до удаления.</w:t>
-      </w:r>
-      <w:r>
-        <w:t xml:space="preserve"> Объект включает в себя следующие состояния: «Создано» </w:t>
-      </w:r>
-      <w:r>
-        <w:t>–</w:t>
-      </w:r>
-      <w:r>
-        <w:t xml:space="preserve"> </w:t>
-      </w:r>
-      <w:r>
-        <w:t>момент создания заметки</w:t>
-      </w:r>
-      <w:r>
-        <w:t>;</w:t>
-      </w:r>
-      <w:r>
-        <w:t xml:space="preserve"> «В редактировании» –</w:t>
-      </w:r>
-      <w:r>
-        <w:t xml:space="preserve"> автор или соавтор с необходимым доступом находится в редакторе заметок</w:t>
-      </w:r>
-      <w:r>
-        <w:t>;</w:t>
-      </w:r>
-      <w:r>
-        <w:t xml:space="preserve"> «Сохранено» </w:t>
-      </w:r>
-      <w:r>
-        <w:t>–</w:t>
-      </w:r>
-      <w:r>
-        <w:t xml:space="preserve"> пользователь сохраняет отредактированный документ</w:t>
-      </w:r>
-      <w:r>
-        <w:t xml:space="preserve">; </w:t>
-      </w:r>
-      <w:r>
-        <w:t xml:space="preserve">«Удалено» </w:t>
-      </w:r>
-      <w:r>
-        <w:t>–</w:t>
-      </w:r>
-      <w:r>
-        <w:t xml:space="preserve"> автор документа удалил объект.</w:t>
-      </w:r>
-    </w:p>
-    <w:p>
-      <w:pPr>
-        <w:pStyle w:val="a6"/>
-      </w:pPr>
-      <w:r>
         <w:t>Диаграмма «Права доступа» отражает жизненный цикл различны</w:t>
       </w:r>
       <w:r>
@@ -3978,7 +4501,6 @@
         <w:pStyle w:val="a6"/>
       </w:pPr>
       <w:r>
-        <w:lastRenderedPageBreak/>
         <w:t>Для визуализации работы системы были разработаны диаграммы в нотации BPMN, отображающие последовательность выполнения операций, распределение ролей участников и движение информационных потоков</w:t>
       </w:r>
       <w:r>
@@ -4021,7 +4543,11 @@
         <w:t>, в</w:t>
       </w:r>
       <w:r>
-        <w:t xml:space="preserve"> этом случае процесс включает рассылку приглашений соавторам, обработку их </w:t>
+        <w:t xml:space="preserve"> этом случае процесс включает рассылку приглашений соавторам, </w:t>
+      </w:r>
+      <w:r>
+        <w:lastRenderedPageBreak/>
+        <w:t xml:space="preserve">обработку их </w:t>
       </w:r>
       <w:r>
         <w:t>ответов</w:t>
@@ -4205,7 +4731,6 @@
         <w:pStyle w:val="ab"/>
       </w:pPr>
       <w:r>
-        <w:lastRenderedPageBreak/>
         <w:drawing>
           <wp:inline distT="0" distB="0" distL="0" distR="0" wp14:anchorId="0D288AEE" wp14:editId="67667A51">
             <wp:extent cx="5176546" cy="2543175"/>
@@ -4257,6 +4782,7 @@
         <w:pStyle w:val="ab"/>
       </w:pPr>
       <w:r>
+        <w:lastRenderedPageBreak/>
         <w:t xml:space="preserve">Рисунок </w:t>
       </w:r>
       <w:r>
@@ -4462,7 +4988,6 @@
         <w:ind w:left="0" w:firstLine="709"/>
       </w:pPr>
       <w:r>
-        <w:lastRenderedPageBreak/>
         <w:t>Система долж</w:t>
       </w:r>
       <w:r>
@@ -4561,6 +5086,7 @@
         <w:ind w:left="0" w:firstLine="709"/>
       </w:pPr>
       <w:r>
+        <w:lastRenderedPageBreak/>
         <w:t xml:space="preserve">Система должна обеспечивать работу базового функционала </w:t>
       </w:r>
       <w:proofErr w:type="spellStart"/>
@@ -4694,7 +5220,6 @@
         <w:pStyle w:val="a6"/>
       </w:pPr>
       <w:r>
-        <w:lastRenderedPageBreak/>
         <w:t>Для</w:t>
       </w:r>
       <w:r>
@@ -4788,6 +5313,7 @@
         <w:ind w:left="0" w:firstLine="709"/>
       </w:pPr>
       <w:r>
+        <w:lastRenderedPageBreak/>
         <w:t>Для операций, требующих обработки большого объема данн</w:t>
       </w:r>
       <w:r>
@@ -4995,7 +5521,6 @@
         <w:ind w:left="0" w:firstLine="709"/>
       </w:pPr>
       <w:r>
-        <w:lastRenderedPageBreak/>
         <w:t>Доступ к функционалу системы должен быть разрешен только после прохождения аутентификации;</w:t>
       </w:r>
     </w:p>
@@ -5099,6 +5624,7 @@
         <w:ind w:left="0" w:firstLine="709"/>
       </w:pPr>
       <w:r>
+        <w:lastRenderedPageBreak/>
         <w:t>Система должна гарантировать целостность и сохранность данных пользователя</w:t>
       </w:r>
       <w:r>

</xml_diff>

<commit_message>
feat: add docs for third step
</commit_message>
<xml_diff>
--- a/docs/РПС_КП_Анализ_предметной_области_ПРИ_123_Манайчева_Нямаа.docx
+++ b/docs/РПС_КП_Анализ_предметной_области_ПРИ_123_Манайчева_Нямаа.docx
@@ -5436,10 +5436,10 @@
         </w:rPr>
         <w:lastRenderedPageBreak/>
         <w:drawing>
-          <wp:inline distT="0" distB="0" distL="0" distR="0" wp14:anchorId="58BCEDDA" wp14:editId="17C7E852">
-            <wp:extent cx="5800725" cy="4018653"/>
-            <wp:effectExtent l="19050" t="19050" r="9525" b="20320"/>
-            <wp:docPr id="7" name="Рисунок 7"/>
+          <wp:inline distT="0" distB="0" distL="0" distR="0" wp14:anchorId="099A8695" wp14:editId="718965D5">
+            <wp:extent cx="5940425" cy="4101465"/>
+            <wp:effectExtent l="19050" t="19050" r="22225" b="13335"/>
+            <wp:docPr id="2" name="Рисунок 2"/>
             <wp:cNvGraphicFramePr>
               <a:graphicFrameLocks xmlns:a="http://schemas.openxmlformats.org/drawingml/2006/main" noChangeAspect="1"/>
             </wp:cNvGraphicFramePr>
@@ -5447,7 +5447,7 @@
               <a:graphicData uri="http://schemas.openxmlformats.org/drawingml/2006/picture">
                 <pic:pic xmlns:pic="http://schemas.openxmlformats.org/drawingml/2006/picture">
                   <pic:nvPicPr>
-                    <pic:cNvPr id="7" name="Рисунок 7"/>
+                    <pic:cNvPr id="2" name="Рисунок 2"/>
                     <pic:cNvPicPr/>
                   </pic:nvPicPr>
                   <pic:blipFill>
@@ -5465,7 +5465,7 @@
                   <pic:spPr>
                     <a:xfrm>
                       <a:off x="0" y="0"/>
-                      <a:ext cx="5801902" cy="4019468"/>
+                      <a:ext cx="5940425" cy="4101465"/>
                     </a:xfrm>
                     <a:prstGeom prst="rect">
                       <a:avLst/>

</xml_diff>